<commit_message>
Auto update CV assets: 2026-04-17 16:46:12 CDT
</commit_message>
<xml_diff>
--- a/public/cv.docx
+++ b/public/cv.docx
@@ -2068,7 +2068,7 @@
     </w:p>
     <w:p>
       <w:pPr>
-        <w:spacing w:before="240" w:after="240" w:line="276" w:lineRule="auto"/>
+        <w:spacing w:after="240" w:line="276" w:lineRule="auto"/>
         <w:jc w:val="left"/>
         <w:rPr>
           <w:rFonts w:ascii="Times New Roman" w:eastAsiaTheme="minorHAnsi" w:hAnsi="Times New Roman" w:cs="Times New Roman"/>
@@ -2153,7 +2153,7 @@
     </w:p>
     <w:p>
       <w:pPr>
-        <w:spacing w:before="240" w:after="240" w:line="276" w:lineRule="auto"/>
+        <w:spacing w:after="240" w:line="276" w:lineRule="auto"/>
         <w:jc w:val="left"/>
         <w:rPr>
           <w:rFonts w:ascii="Times New Roman" w:eastAsiaTheme="minorHAnsi" w:hAnsi="Times New Roman" w:cs="Times New Roman"/>
@@ -2392,6 +2392,7 @@
     </w:p>
     <w:p>
       <w:pPr>
+        <w:spacing w:after="240" w:line="276" w:lineRule="auto"/>
         <w:rPr>
           <w:rFonts w:ascii="Times New Roman" w:eastAsiaTheme="minorHAnsi" w:hAnsi="Times New Roman" w:cs="Times New Roman"/>
           <w:sz w:val="24"/>
@@ -2475,15 +2476,7 @@
     </w:p>
     <w:p>
       <w:pPr>
-        <w:rPr>
-          <w:rFonts w:ascii="Times New Roman" w:eastAsiaTheme="minorHAnsi" w:hAnsi="Times New Roman" w:cs="Times New Roman"/>
-          <w:sz w:val="24"/>
-          <w:szCs w:val="20"/>
-        </w:rPr>
-      </w:pPr>
-    </w:p>
-    <w:p>
-      <w:pPr>
+        <w:spacing w:after="240" w:line="276" w:lineRule="auto"/>
         <w:rPr>
           <w:rFonts w:ascii="Times New Roman" w:eastAsiaTheme="minorHAnsi" w:hAnsi="Times New Roman" w:cs="Times New Roman"/>
           <w:sz w:val="24"/>
@@ -2545,8 +2538,77 @@
     </w:p>
     <w:p>
       <w:pPr>
-        <w:rPr>
-          <w:rFonts w:ascii="Times New Roman" w:eastAsiaTheme="minorHAnsi" w:hAnsi="Times New Roman" w:cs="Times New Roman"/>
+        <w:spacing w:line="276" w:lineRule="auto"/>
+        <w:rPr>
+          <w:rFonts w:ascii="Times New Roman" w:eastAsiaTheme="minorHAnsi" w:hAnsi="Times New Roman" w:cs="Times New Roman" w:hint="eastAsia"/>
+          <w:sz w:val="24"/>
+          <w:szCs w:val="20"/>
+        </w:rPr>
+      </w:pPr>
+      <w:r>
+        <w:rPr>
+          <w:rFonts w:ascii="Times New Roman" w:eastAsiaTheme="minorHAnsi" w:hAnsi="Times New Roman" w:cs="Times New Roman"/>
+          <w:b/>
+          <w:bCs/>
+          <w:sz w:val="24"/>
+          <w:szCs w:val="20"/>
+        </w:rPr>
+        <w:t>Lee, Jina,</w:t>
+      </w:r>
+      <w:r>
+        <w:rPr>
+          <w:rFonts w:ascii="Times New Roman" w:eastAsiaTheme="minorHAnsi" w:hAnsi="Times New Roman" w:cs="Times New Roman"/>
+          <w:sz w:val="24"/>
+          <w:szCs w:val="20"/>
+        </w:rPr>
+        <w:t xml:space="preserve"> Charles Gomez, Sarah Bratt, Yea-Eun Kwon, Charles Lassiter, Erin Leahey</w:t>
+      </w:r>
+      <w:r>
+        <w:rPr>
+          <w:rFonts w:ascii="Times New Roman" w:eastAsiaTheme="minorHAnsi" w:hAnsi="Times New Roman" w:cs="Times New Roman" w:hint="eastAsia"/>
+          <w:sz w:val="24"/>
+          <w:szCs w:val="20"/>
+        </w:rPr>
+        <w:t xml:space="preserve">. </w:t>
+      </w:r>
+      <w:r>
+        <w:rPr>
+          <w:rFonts w:ascii="Times New Roman" w:eastAsiaTheme="minorHAnsi" w:hAnsi="Times New Roman" w:cs="Times New Roman"/>
+          <w:sz w:val="24"/>
+          <w:szCs w:val="20"/>
+        </w:rPr>
+        <w:t>“</w:t>
+      </w:r>
+      <w:r>
+        <w:rPr>
+          <w:rFonts w:ascii="Times New Roman" w:eastAsiaTheme="minorHAnsi" w:hAnsi="Times New Roman" w:cs="Times New Roman"/>
+          <w:sz w:val="24"/>
+          <w:szCs w:val="20"/>
+        </w:rPr>
+        <w:t>Why Is Women’s Work More Disruptive?</w:t>
+      </w:r>
+      <w:r>
+        <w:rPr>
+          <w:rFonts w:ascii="Times New Roman" w:eastAsiaTheme="minorHAnsi" w:hAnsi="Times New Roman" w:cs="Times New Roman"/>
+          <w:sz w:val="24"/>
+          <w:szCs w:val="20"/>
+        </w:rPr>
+        <w:t xml:space="preserve">” </w:t>
+      </w:r>
+      <w:r>
+        <w:rPr>
+          <w:rFonts w:ascii="Times New Roman" w:eastAsiaTheme="minorHAnsi" w:hAnsi="Times New Roman" w:cs="Times New Roman"/>
+          <w:sz w:val="24"/>
+          <w:szCs w:val="20"/>
+        </w:rPr>
+        <w:t>[In progress]</w:t>
+      </w:r>
+    </w:p>
+    <w:p>
+      <w:pPr>
+        <w:spacing w:line="276" w:lineRule="auto"/>
+        <w:rPr>
+          <w:rFonts w:ascii="Times New Roman" w:eastAsiaTheme="minorHAnsi" w:hAnsi="Times New Roman" w:cs="Times New Roman" w:hint="eastAsia"/>
           <w:sz w:val="24"/>
           <w:szCs w:val="20"/>
         </w:rPr>
@@ -3196,7 +3258,16 @@
           <w:sz w:val="24"/>
           <w:szCs w:val="20"/>
         </w:rPr>
-        <w:t>Women in Data Science Worldwide</w:t>
+        <w:t xml:space="preserve">Women in </w:t>
+      </w:r>
+      <w:r>
+        <w:rPr>
+          <w:rFonts w:ascii="Times New Roman" w:eastAsiaTheme="minorHAnsi" w:hAnsi="Times New Roman" w:cs="Times New Roman" w:hint="eastAsia"/>
+          <w:sz w:val="24"/>
+          <w:szCs w:val="20"/>
+        </w:rPr>
+        <w:lastRenderedPageBreak/>
+        <w:t>Data Science Worldwide</w:t>
       </w:r>
       <w:r>
         <w:rPr>
@@ -3341,16 +3412,7 @@
           <w:sz w:val="24"/>
           <w:szCs w:val="20"/>
         </w:rPr>
-        <w:t xml:space="preserve">Knowledge </w:t>
-      </w:r>
-      <w:r>
-        <w:rPr>
-          <w:rFonts w:ascii="Times New Roman" w:eastAsiaTheme="minorHAnsi" w:hAnsi="Times New Roman" w:cs="Times New Roman" w:hint="eastAsia"/>
-          <w:sz w:val="24"/>
-          <w:szCs w:val="20"/>
-        </w:rPr>
-        <w:lastRenderedPageBreak/>
-        <w:t>Lab at the University of Chicago.</w:t>
+        <w:t>Knowledge Lab at the University of Chicago.</w:t>
       </w:r>
       <w:r>
         <w:rPr>
@@ -4877,6 +4939,7 @@
           <w:szCs w:val="20"/>
           <w:u w:val="single"/>
         </w:rPr>
+        <w:lastRenderedPageBreak/>
         <w:t xml:space="preserve">HONORS AND GRANTS                                             </w:t>
       </w:r>
     </w:p>
@@ -4953,16 +5016,7 @@
           <w:sz w:val="24"/>
           <w:szCs w:val="24"/>
         </w:rPr>
-        <w:t xml:space="preserve">rant from Humility in Inquiry: Foundations and New </w:t>
-      </w:r>
-      <w:r>
-        <w:rPr>
-          <w:rFonts w:ascii="Times New Roman" w:eastAsiaTheme="minorHAnsi" w:hAnsi="Times New Roman" w:cs="Times New Roman"/>
-          <w:sz w:val="24"/>
-          <w:szCs w:val="24"/>
-        </w:rPr>
-        <w:lastRenderedPageBreak/>
-        <w:t xml:space="preserve">Directions project </w:t>
+        <w:t xml:space="preserve">rant from Humility in Inquiry: Foundations and New Directions project </w:t>
       </w:r>
       <w:r>
         <w:rPr>
@@ -6266,44 +6320,58 @@
           <w:u w:val="single"/>
         </w:rPr>
       </w:pPr>
-      <w:r>
-        <w:rPr>
-          <w:rFonts w:ascii="Times New Roman" w:eastAsiaTheme="minorHAnsi" w:hAnsi="Times New Roman" w:cs="Times New Roman" w:hint="eastAsia"/>
+    </w:p>
+    <w:p>
+      <w:pPr>
+        <w:spacing w:line="276" w:lineRule="auto"/>
+        <w:jc w:val="left"/>
+        <w:rPr>
+          <w:rFonts w:ascii="Times New Roman" w:eastAsiaTheme="minorHAnsi" w:hAnsi="Times New Roman" w:cs="Times New Roman"/>
           <w:b/>
           <w:sz w:val="28"/>
           <w:szCs w:val="28"/>
           <w:u w:val="single"/>
         </w:rPr>
-        <w:t xml:space="preserve">REVIEW AND EDITORIAL </w:t>
-      </w:r>
-      <w:r>
-        <w:rPr>
-          <w:rFonts w:ascii="Times New Roman" w:eastAsiaTheme="minorHAnsi" w:hAnsi="Times New Roman" w:cs="Times New Roman"/>
+      </w:pPr>
+      <w:r>
+        <w:rPr>
+          <w:rFonts w:ascii="Times New Roman" w:eastAsiaTheme="minorHAnsi" w:hAnsi="Times New Roman" w:cs="Times New Roman" w:hint="eastAsia"/>
           <w:b/>
           <w:sz w:val="28"/>
           <w:szCs w:val="28"/>
           <w:u w:val="single"/>
         </w:rPr>
-        <w:t xml:space="preserve">SERVICE </w:t>
-      </w:r>
-      <w:r>
-        <w:rPr>
-          <w:rFonts w:ascii="Times New Roman" w:eastAsiaTheme="minorHAnsi" w:hAnsi="Times New Roman" w:cs="Times New Roman" w:hint="eastAsia"/>
+        <w:lastRenderedPageBreak/>
+        <w:t xml:space="preserve">REVIEW AND EDITORIAL </w:t>
+      </w:r>
+      <w:r>
+        <w:rPr>
+          <w:rFonts w:ascii="Times New Roman" w:eastAsiaTheme="minorHAnsi" w:hAnsi="Times New Roman" w:cs="Times New Roman"/>
           <w:b/>
           <w:sz w:val="28"/>
           <w:szCs w:val="28"/>
           <w:u w:val="single"/>
         </w:rPr>
-        <w:t xml:space="preserve">   </w:t>
-      </w:r>
-      <w:r>
-        <w:rPr>
-          <w:rFonts w:ascii="Times New Roman" w:eastAsiaTheme="minorHAnsi" w:hAnsi="Times New Roman" w:cs="Times New Roman"/>
+        <w:t xml:space="preserve">SERVICE </w:t>
+      </w:r>
+      <w:r>
+        <w:rPr>
+          <w:rFonts w:ascii="Times New Roman" w:eastAsiaTheme="minorHAnsi" w:hAnsi="Times New Roman" w:cs="Times New Roman" w:hint="eastAsia"/>
           <w:b/>
           <w:sz w:val="28"/>
           <w:szCs w:val="28"/>
           <w:u w:val="single"/>
         </w:rPr>
+        <w:t xml:space="preserve">   </w:t>
+      </w:r>
+      <w:r>
+        <w:rPr>
+          <w:rFonts w:ascii="Times New Roman" w:eastAsiaTheme="minorHAnsi" w:hAnsi="Times New Roman" w:cs="Times New Roman"/>
+          <w:b/>
+          <w:sz w:val="28"/>
+          <w:szCs w:val="28"/>
+          <w:u w:val="single"/>
+        </w:rPr>
         <w:t xml:space="preserve">                             </w:t>
       </w:r>
     </w:p>
@@ -6524,7 +6592,6 @@
           <w:sz w:val="24"/>
           <w:szCs w:val="24"/>
         </w:rPr>
-        <w:lastRenderedPageBreak/>
         <w:tab/>
       </w:r>
       <w:r>
@@ -8138,7 +8205,7 @@
         <w:sz w:val="24"/>
         <w:szCs w:val="24"/>
       </w:rPr>
-      <w:t>8</w:t>
+      <w:t>17</w:t>
     </w:r>
     <w:r>
       <w:rPr>

</xml_diff>

<commit_message>
Manual CV update: 2026-04-17 16:59:28 CDT
</commit_message>
<xml_diff>
--- a/public/cv.docx
+++ b/public/cv.docx
@@ -2072,6 +2072,8 @@
         <w:jc w:val="left"/>
         <w:rPr>
           <w:rFonts w:ascii="Times New Roman" w:eastAsiaTheme="minorHAnsi" w:hAnsi="Times New Roman" w:cs="Times New Roman"/>
+          <w:i/>
+          <w:iCs/>
           <w:sz w:val="24"/>
           <w:szCs w:val="20"/>
         </w:rPr>
@@ -2393,6 +2395,7 @@
     <w:p>
       <w:pPr>
         <w:spacing w:after="240" w:line="276" w:lineRule="auto"/>
+        <w:jc w:val="left"/>
         <w:rPr>
           <w:rFonts w:ascii="Times New Roman" w:eastAsiaTheme="minorHAnsi" w:hAnsi="Times New Roman" w:cs="Times New Roman"/>
           <w:sz w:val="24"/>
@@ -2477,6 +2480,7 @@
     <w:p>
       <w:pPr>
         <w:spacing w:after="240" w:line="276" w:lineRule="auto"/>
+        <w:jc w:val="left"/>
         <w:rPr>
           <w:rFonts w:ascii="Times New Roman" w:eastAsiaTheme="minorHAnsi" w:hAnsi="Times New Roman" w:cs="Times New Roman"/>
           <w:sz w:val="24"/>
@@ -2538,14 +2542,8 @@
     </w:p>
     <w:p>
       <w:pPr>
-        <w:spacing w:line="276" w:lineRule="auto"/>
-        <w:rPr>
-          <w:rFonts w:ascii="Times New Roman" w:eastAsiaTheme="minorHAnsi" w:hAnsi="Times New Roman" w:cs="Times New Roman" w:hint="eastAsia"/>
-          <w:sz w:val="24"/>
-          <w:szCs w:val="20"/>
-        </w:rPr>
-      </w:pPr>
-      <w:r>
+        <w:spacing w:after="240" w:line="276" w:lineRule="auto"/>
+        <w:jc w:val="left"/>
         <w:rPr>
           <w:rFonts w:ascii="Times New Roman" w:eastAsiaTheme="minorHAnsi" w:hAnsi="Times New Roman" w:cs="Times New Roman"/>
           <w:b/>
@@ -2553,6 +2551,94 @@
           <w:sz w:val="24"/>
           <w:szCs w:val="20"/>
         </w:rPr>
+      </w:pPr>
+      <w:r>
+        <w:rPr>
+          <w:rFonts w:ascii="Times New Roman" w:eastAsiaTheme="minorHAnsi" w:hAnsi="Times New Roman" w:cs="Times New Roman"/>
+          <w:b/>
+          <w:bCs/>
+          <w:sz w:val="24"/>
+          <w:szCs w:val="20"/>
+        </w:rPr>
+        <w:t>Lee, Jina.</w:t>
+      </w:r>
+      <w:r>
+        <w:rPr>
+          <w:rFonts w:ascii="Times New Roman" w:eastAsiaTheme="minorHAnsi" w:hAnsi="Times New Roman" w:cs="Times New Roman"/>
+          <w:b/>
+          <w:bCs/>
+          <w:sz w:val="24"/>
+          <w:szCs w:val="20"/>
+        </w:rPr>
+        <w:t xml:space="preserve"> </w:t>
+      </w:r>
+      <w:r>
+        <w:rPr>
+          <w:rFonts w:ascii="Times New Roman" w:eastAsiaTheme="minorHAnsi" w:hAnsi="Times New Roman" w:cs="Times New Roman"/>
+          <w:sz w:val="24"/>
+          <w:szCs w:val="20"/>
+        </w:rPr>
+        <w:t>“</w:t>
+      </w:r>
+      <w:r>
+        <w:rPr>
+          <w:rFonts w:ascii="Times New Roman" w:eastAsiaTheme="minorHAnsi" w:hAnsi="Times New Roman" w:cs="Times New Roman"/>
+          <w:sz w:val="24"/>
+          <w:szCs w:val="20"/>
+        </w:rPr>
+        <w:t xml:space="preserve">When AI Holds a Mirror: </w:t>
+      </w:r>
+      <w:r>
+        <w:rPr>
+          <w:rFonts w:ascii="Times New Roman" w:eastAsiaTheme="minorHAnsi" w:hAnsi="Times New Roman" w:cs="Times New Roman"/>
+          <w:sz w:val="24"/>
+          <w:szCs w:val="20"/>
+        </w:rPr>
+        <w:t>Why Reflexivity Stayed Normative and What Changes When It Doesn’t Have To</w:t>
+      </w:r>
+      <w:r>
+        <w:rPr>
+          <w:rFonts w:ascii="Times New Roman" w:eastAsiaTheme="minorHAnsi" w:hAnsi="Times New Roman" w:cs="Times New Roman"/>
+          <w:sz w:val="24"/>
+          <w:szCs w:val="20"/>
+        </w:rPr>
+        <w:t>.”</w:t>
+      </w:r>
+      <w:r>
+        <w:rPr>
+          <w:rFonts w:ascii="Times New Roman" w:eastAsiaTheme="minorHAnsi" w:hAnsi="Times New Roman" w:cs="Times New Roman"/>
+          <w:sz w:val="24"/>
+          <w:szCs w:val="20"/>
+        </w:rPr>
+        <w:t xml:space="preserve"> </w:t>
+      </w:r>
+      <w:r>
+        <w:rPr>
+          <w:rFonts w:ascii="Times New Roman" w:eastAsiaTheme="minorHAnsi" w:hAnsi="Times New Roman" w:cs="Times New Roman"/>
+          <w:sz w:val="24"/>
+          <w:szCs w:val="20"/>
+        </w:rPr>
+        <w:t>[In progress]</w:t>
+      </w:r>
+    </w:p>
+    <w:p>
+      <w:pPr>
+        <w:spacing w:line="276" w:lineRule="auto"/>
+        <w:jc w:val="left"/>
+        <w:rPr>
+          <w:rFonts w:ascii="Times New Roman" w:eastAsiaTheme="minorHAnsi" w:hAnsi="Times New Roman" w:cs="Times New Roman"/>
+          <w:sz w:val="24"/>
+          <w:szCs w:val="20"/>
+        </w:rPr>
+      </w:pPr>
+      <w:r>
+        <w:rPr>
+          <w:rFonts w:ascii="Times New Roman" w:eastAsiaTheme="minorHAnsi" w:hAnsi="Times New Roman" w:cs="Times New Roman"/>
+          <w:b/>
+          <w:bCs/>
+          <w:sz w:val="24"/>
+          <w:szCs w:val="20"/>
+        </w:rPr>
         <w:t>Lee, Jina,</w:t>
       </w:r>
       <w:r>
@@ -2593,22 +2679,14 @@
           <w:sz w:val="24"/>
           <w:szCs w:val="20"/>
         </w:rPr>
-        <w:t xml:space="preserve">” </w:t>
-      </w:r>
-      <w:r>
-        <w:rPr>
-          <w:rFonts w:ascii="Times New Roman" w:eastAsiaTheme="minorHAnsi" w:hAnsi="Times New Roman" w:cs="Times New Roman"/>
-          <w:sz w:val="24"/>
-          <w:szCs w:val="20"/>
-        </w:rPr>
-        <w:t>[In progress]</w:t>
+        <w:t>” [In progress]</w:t>
       </w:r>
     </w:p>
     <w:p>
       <w:pPr>
         <w:spacing w:line="276" w:lineRule="auto"/>
         <w:rPr>
-          <w:rFonts w:ascii="Times New Roman" w:eastAsiaTheme="minorHAnsi" w:hAnsi="Times New Roman" w:cs="Times New Roman" w:hint="eastAsia"/>
+          <w:rFonts w:ascii="Times New Roman" w:eastAsiaTheme="minorHAnsi" w:hAnsi="Times New Roman" w:cs="Times New Roman"/>
           <w:sz w:val="24"/>
           <w:szCs w:val="20"/>
         </w:rPr>
@@ -3112,6 +3190,7 @@
           <w:sz w:val="24"/>
           <w:szCs w:val="20"/>
         </w:rPr>
+        <w:lastRenderedPageBreak/>
         <w:t>AI</w:t>
       </w:r>
       <w:r>
@@ -3258,16 +3337,7 @@
           <w:sz w:val="24"/>
           <w:szCs w:val="20"/>
         </w:rPr>
-        <w:t xml:space="preserve">Women in </w:t>
-      </w:r>
-      <w:r>
-        <w:rPr>
-          <w:rFonts w:ascii="Times New Roman" w:eastAsiaTheme="minorHAnsi" w:hAnsi="Times New Roman" w:cs="Times New Roman" w:hint="eastAsia"/>
-          <w:sz w:val="24"/>
-          <w:szCs w:val="20"/>
-        </w:rPr>
-        <w:lastRenderedPageBreak/>
-        <w:t>Data Science Worldwide</w:t>
+        <w:t>Women in Data Science Worldwide</w:t>
       </w:r>
       <w:r>
         <w:rPr>
@@ -4862,6 +4932,7 @@
           <w:sz w:val="24"/>
           <w:szCs w:val="20"/>
         </w:rPr>
+        <w:lastRenderedPageBreak/>
         <w:t>Consecration of Korean Writers, 1960–2000,” 112</w:t>
       </w:r>
       <w:r>
@@ -4939,7 +5010,6 @@
           <w:szCs w:val="20"/>
           <w:u w:val="single"/>
         </w:rPr>
-        <w:lastRenderedPageBreak/>
         <w:t xml:space="preserve">HONORS AND GRANTS                                             </w:t>
       </w:r>
     </w:p>
@@ -6268,6 +6338,7 @@
           <w:sz w:val="24"/>
           <w:szCs w:val="20"/>
         </w:rPr>
+        <w:lastRenderedPageBreak/>
         <w:t xml:space="preserve"> </w:t>
       </w:r>
       <w:r>
@@ -6320,51 +6391,352 @@
           <w:u w:val="single"/>
         </w:rPr>
       </w:pPr>
-    </w:p>
-    <w:p>
-      <w:pPr>
-        <w:spacing w:line="276" w:lineRule="auto"/>
-        <w:jc w:val="left"/>
-        <w:rPr>
-          <w:rFonts w:ascii="Times New Roman" w:eastAsiaTheme="minorHAnsi" w:hAnsi="Times New Roman" w:cs="Times New Roman"/>
+      <w:r>
+        <w:rPr>
+          <w:rFonts w:ascii="Times New Roman" w:eastAsiaTheme="minorHAnsi" w:hAnsi="Times New Roman" w:cs="Times New Roman" w:hint="eastAsia"/>
           <w:b/>
           <w:sz w:val="28"/>
           <w:szCs w:val="28"/>
           <w:u w:val="single"/>
         </w:rPr>
-      </w:pPr>
-      <w:r>
-        <w:rPr>
-          <w:rFonts w:ascii="Times New Roman" w:eastAsiaTheme="minorHAnsi" w:hAnsi="Times New Roman" w:cs="Times New Roman" w:hint="eastAsia"/>
+        <w:t xml:space="preserve">REVIEW AND EDITORIAL </w:t>
+      </w:r>
+      <w:r>
+        <w:rPr>
+          <w:rFonts w:ascii="Times New Roman" w:eastAsiaTheme="minorHAnsi" w:hAnsi="Times New Roman" w:cs="Times New Roman"/>
           <w:b/>
           <w:sz w:val="28"/>
           <w:szCs w:val="28"/>
           <w:u w:val="single"/>
         </w:rPr>
-        <w:lastRenderedPageBreak/>
-        <w:t xml:space="preserve">REVIEW AND EDITORIAL </w:t>
-      </w:r>
-      <w:r>
-        <w:rPr>
-          <w:rFonts w:ascii="Times New Roman" w:eastAsiaTheme="minorHAnsi" w:hAnsi="Times New Roman" w:cs="Times New Roman"/>
+        <w:t xml:space="preserve">SERVICE </w:t>
+      </w:r>
+      <w:r>
+        <w:rPr>
+          <w:rFonts w:ascii="Times New Roman" w:eastAsiaTheme="minorHAnsi" w:hAnsi="Times New Roman" w:cs="Times New Roman" w:hint="eastAsia"/>
           <w:b/>
           <w:sz w:val="28"/>
           <w:szCs w:val="28"/>
           <w:u w:val="single"/>
         </w:rPr>
-        <w:t xml:space="preserve">SERVICE </w:t>
-      </w:r>
-      <w:r>
-        <w:rPr>
-          <w:rFonts w:ascii="Times New Roman" w:eastAsiaTheme="minorHAnsi" w:hAnsi="Times New Roman" w:cs="Times New Roman" w:hint="eastAsia"/>
+        <w:t xml:space="preserve">   </w:t>
+      </w:r>
+      <w:r>
+        <w:rPr>
+          <w:rFonts w:ascii="Times New Roman" w:eastAsiaTheme="minorHAnsi" w:hAnsi="Times New Roman" w:cs="Times New Roman"/>
           <w:b/>
           <w:sz w:val="28"/>
           <w:szCs w:val="28"/>
           <w:u w:val="single"/>
         </w:rPr>
-        <w:t xml:space="preserve">   </w:t>
-      </w:r>
-      <w:r>
+        <w:t xml:space="preserve">                             </w:t>
+      </w:r>
+    </w:p>
+    <w:p>
+      <w:pPr>
+        <w:spacing w:line="276" w:lineRule="auto"/>
+        <w:rPr>
+          <w:rFonts w:ascii="Times New Roman" w:eastAsia="함초롬바탕" w:hAnsi="Times New Roman" w:cs="Times New Roman"/>
+          <w:sz w:val="24"/>
+          <w:szCs w:val="20"/>
+        </w:rPr>
+      </w:pPr>
+    </w:p>
+    <w:p>
+      <w:pPr>
+        <w:spacing w:line="276" w:lineRule="auto"/>
+        <w:ind w:left="1600" w:hanging="1600"/>
+        <w:jc w:val="left"/>
+        <w:rPr>
+          <w:rFonts w:ascii="Times New Roman" w:eastAsiaTheme="minorHAnsi" w:hAnsi="Times New Roman" w:cs="Times New Roman"/>
+          <w:sz w:val="24"/>
+          <w:szCs w:val="24"/>
+        </w:rPr>
+      </w:pPr>
+      <w:r>
+        <w:rPr>
+          <w:rFonts w:ascii="Times New Roman" w:eastAsiaTheme="minorHAnsi" w:hAnsi="Times New Roman" w:cs="Times New Roman" w:hint="eastAsia"/>
+          <w:sz w:val="24"/>
+          <w:szCs w:val="24"/>
+        </w:rPr>
+        <w:t>2</w:t>
+      </w:r>
+      <w:r>
+        <w:rPr>
+          <w:rFonts w:ascii="Times New Roman" w:eastAsiaTheme="minorHAnsi" w:hAnsi="Times New Roman" w:cs="Times New Roman"/>
+          <w:sz w:val="24"/>
+          <w:szCs w:val="24"/>
+        </w:rPr>
+        <w:t>02</w:t>
+      </w:r>
+      <w:r>
+        <w:rPr>
+          <w:rFonts w:ascii="Times New Roman" w:eastAsiaTheme="minorHAnsi" w:hAnsi="Times New Roman" w:cs="Times New Roman" w:hint="eastAsia"/>
+          <w:sz w:val="24"/>
+          <w:szCs w:val="24"/>
+        </w:rPr>
+        <w:t>5</w:t>
+      </w:r>
+      <w:r>
+        <w:rPr>
+          <w:rFonts w:ascii="Times New Roman" w:eastAsiaTheme="minorHAnsi" w:hAnsi="Times New Roman" w:cs="Times New Roman"/>
+          <w:sz w:val="24"/>
+          <w:szCs w:val="24"/>
+        </w:rPr>
+        <w:t xml:space="preserve"> – </w:t>
+      </w:r>
+      <w:r>
+        <w:rPr>
+          <w:rFonts w:ascii="Times New Roman" w:eastAsiaTheme="minorHAnsi" w:hAnsi="Times New Roman" w:cs="Times New Roman" w:hint="eastAsia"/>
+          <w:sz w:val="24"/>
+          <w:szCs w:val="20"/>
+        </w:rPr>
+        <w:t>Current</w:t>
+      </w:r>
+      <w:r>
+        <w:rPr>
+          <w:rFonts w:ascii="Times New Roman" w:eastAsiaTheme="minorHAnsi" w:hAnsi="Times New Roman" w:cs="Times New Roman"/>
+          <w:sz w:val="24"/>
+          <w:szCs w:val="24"/>
+        </w:rPr>
+        <w:tab/>
+      </w:r>
+      <w:r>
+        <w:rPr>
+          <w:rFonts w:ascii="Times New Roman" w:eastAsiaTheme="minorHAnsi" w:hAnsi="Times New Roman" w:cs="Times New Roman" w:hint="eastAsia"/>
+          <w:sz w:val="24"/>
+          <w:szCs w:val="24"/>
+        </w:rPr>
+        <w:t>Early Career Review Board</w:t>
+      </w:r>
+      <w:r>
+        <w:rPr>
+          <w:rFonts w:ascii="Times New Roman" w:eastAsiaTheme="minorHAnsi" w:hAnsi="Times New Roman" w:cs="Times New Roman" w:hint="eastAsia"/>
+          <w:sz w:val="24"/>
+          <w:szCs w:val="24"/>
+        </w:rPr>
+        <w:t xml:space="preserve"> Member</w:t>
+      </w:r>
+      <w:r>
+        <w:rPr>
+          <w:rFonts w:ascii="Times New Roman" w:eastAsiaTheme="minorHAnsi" w:hAnsi="Times New Roman" w:cs="Times New Roman" w:hint="eastAsia"/>
+          <w:sz w:val="24"/>
+          <w:szCs w:val="24"/>
+        </w:rPr>
+        <w:t xml:space="preserve">, </w:t>
+      </w:r>
+      <w:r>
+        <w:rPr>
+          <w:rFonts w:ascii="Times New Roman" w:eastAsiaTheme="minorHAnsi" w:hAnsi="Times New Roman" w:cs="Times New Roman" w:hint="eastAsia"/>
+          <w:i/>
+          <w:iCs/>
+          <w:sz w:val="24"/>
+          <w:szCs w:val="24"/>
+        </w:rPr>
+        <w:t>Social Science Research.</w:t>
+      </w:r>
+    </w:p>
+    <w:p>
+      <w:pPr>
+        <w:spacing w:line="276" w:lineRule="auto"/>
+        <w:ind w:left="1600" w:hanging="1600"/>
+        <w:jc w:val="left"/>
+        <w:rPr>
+          <w:rFonts w:ascii="Times New Roman" w:eastAsiaTheme="minorHAnsi" w:hAnsi="Times New Roman" w:cs="Times New Roman"/>
+          <w:sz w:val="24"/>
+          <w:szCs w:val="24"/>
+        </w:rPr>
+      </w:pPr>
+      <w:r>
+        <w:rPr>
+          <w:rFonts w:ascii="Times New Roman" w:eastAsiaTheme="minorHAnsi" w:hAnsi="Times New Roman" w:cs="Times New Roman" w:hint="eastAsia"/>
+          <w:sz w:val="24"/>
+          <w:szCs w:val="24"/>
+        </w:rPr>
+        <w:t>2</w:t>
+      </w:r>
+      <w:r>
+        <w:rPr>
+          <w:rFonts w:ascii="Times New Roman" w:eastAsiaTheme="minorHAnsi" w:hAnsi="Times New Roman" w:cs="Times New Roman"/>
+          <w:sz w:val="24"/>
+          <w:szCs w:val="24"/>
+        </w:rPr>
+        <w:t>02</w:t>
+      </w:r>
+      <w:r>
+        <w:rPr>
+          <w:rFonts w:ascii="Times New Roman" w:eastAsiaTheme="minorHAnsi" w:hAnsi="Times New Roman" w:cs="Times New Roman" w:hint="eastAsia"/>
+          <w:sz w:val="24"/>
+          <w:szCs w:val="24"/>
+        </w:rPr>
+        <w:t>3</w:t>
+      </w:r>
+      <w:r>
+        <w:rPr>
+          <w:rFonts w:ascii="Times New Roman" w:eastAsiaTheme="minorHAnsi" w:hAnsi="Times New Roman" w:cs="Times New Roman"/>
+          <w:sz w:val="24"/>
+          <w:szCs w:val="24"/>
+        </w:rPr>
+        <w:t xml:space="preserve"> – </w:t>
+      </w:r>
+      <w:r>
+        <w:rPr>
+          <w:rFonts w:ascii="Times New Roman" w:eastAsiaTheme="minorHAnsi" w:hAnsi="Times New Roman" w:cs="Times New Roman" w:hint="eastAsia"/>
+          <w:sz w:val="24"/>
+          <w:szCs w:val="20"/>
+        </w:rPr>
+        <w:t>Current</w:t>
+      </w:r>
+      <w:r>
+        <w:rPr>
+          <w:rFonts w:ascii="Times New Roman" w:eastAsiaTheme="minorHAnsi" w:hAnsi="Times New Roman" w:cs="Times New Roman"/>
+          <w:sz w:val="24"/>
+          <w:szCs w:val="24"/>
+        </w:rPr>
+        <w:tab/>
+      </w:r>
+      <w:r>
+        <w:rPr>
+          <w:rFonts w:ascii="Times New Roman" w:eastAsiaTheme="minorHAnsi" w:hAnsi="Times New Roman" w:cs="Times New Roman" w:hint="eastAsia"/>
+          <w:sz w:val="24"/>
+          <w:szCs w:val="24"/>
+        </w:rPr>
+        <w:t xml:space="preserve">Ad Hoc </w:t>
+      </w:r>
+      <w:r>
+        <w:rPr>
+          <w:rFonts w:ascii="Times New Roman" w:eastAsiaTheme="minorHAnsi" w:hAnsi="Times New Roman" w:cs="Times New Roman" w:hint="eastAsia"/>
+          <w:sz w:val="24"/>
+          <w:szCs w:val="24"/>
+        </w:rPr>
+        <w:t>Reviewer</w:t>
+      </w:r>
+      <w:r>
+        <w:rPr>
+          <w:rFonts w:ascii="Times New Roman" w:eastAsiaTheme="minorHAnsi" w:hAnsi="Times New Roman" w:cs="Times New Roman" w:hint="eastAsia"/>
+          <w:sz w:val="24"/>
+          <w:szCs w:val="24"/>
+        </w:rPr>
+        <w:t>,</w:t>
+      </w:r>
+      <w:r>
+        <w:rPr>
+          <w:rFonts w:ascii="Times New Roman" w:eastAsiaTheme="minorHAnsi" w:hAnsi="Times New Roman" w:cs="Times New Roman"/>
+          <w:sz w:val="24"/>
+          <w:szCs w:val="24"/>
+        </w:rPr>
+        <w:t xml:space="preserve"> reviewed manuscripts for the following journals:</w:t>
+      </w:r>
+    </w:p>
+    <w:p>
+      <w:pPr>
+        <w:spacing w:line="276" w:lineRule="auto"/>
+        <w:ind w:left="1600" w:hanging="1600"/>
+        <w:jc w:val="left"/>
+        <w:rPr>
+          <w:rFonts w:ascii="Times New Roman" w:eastAsiaTheme="minorHAnsi" w:hAnsi="Times New Roman" w:cs="Times New Roman"/>
+          <w:i/>
+          <w:iCs/>
+          <w:sz w:val="24"/>
+          <w:szCs w:val="24"/>
+        </w:rPr>
+      </w:pPr>
+      <w:r>
+        <w:rPr>
+          <w:rFonts w:ascii="Times New Roman" w:eastAsiaTheme="minorHAnsi" w:hAnsi="Times New Roman" w:cs="Times New Roman"/>
+          <w:i/>
+          <w:iCs/>
+          <w:sz w:val="24"/>
+          <w:szCs w:val="24"/>
+        </w:rPr>
+        <w:tab/>
+      </w:r>
+      <w:r>
+        <w:rPr>
+          <w:rFonts w:ascii="Times New Roman" w:eastAsiaTheme="minorHAnsi" w:hAnsi="Times New Roman" w:cs="Times New Roman"/>
+          <w:i/>
+          <w:iCs/>
+          <w:sz w:val="24"/>
+          <w:szCs w:val="24"/>
+        </w:rPr>
+        <w:t xml:space="preserve">American Sociological Review, </w:t>
+      </w:r>
+      <w:r>
+        <w:rPr>
+          <w:rFonts w:ascii="Times New Roman" w:eastAsiaTheme="minorHAnsi" w:hAnsi="Times New Roman" w:cs="Times New Roman"/>
+          <w:i/>
+          <w:iCs/>
+          <w:sz w:val="24"/>
+          <w:szCs w:val="24"/>
+        </w:rPr>
+        <w:t xml:space="preserve">Gender &amp; Society, </w:t>
+      </w:r>
+      <w:r>
+        <w:rPr>
+          <w:rFonts w:ascii="Times New Roman" w:eastAsiaTheme="minorHAnsi" w:hAnsi="Times New Roman" w:cs="Times New Roman"/>
+          <w:i/>
+          <w:iCs/>
+          <w:sz w:val="24"/>
+          <w:szCs w:val="24"/>
+        </w:rPr>
+        <w:t xml:space="preserve">Social Science Research, </w:t>
+      </w:r>
+      <w:r>
+        <w:rPr>
+          <w:rFonts w:ascii="Times New Roman" w:eastAsiaTheme="minorHAnsi" w:hAnsi="Times New Roman" w:cs="Times New Roman"/>
+          <w:i/>
+          <w:iCs/>
+          <w:sz w:val="24"/>
+          <w:szCs w:val="24"/>
+        </w:rPr>
+        <w:t>Proceedings of the National Academy of Sciences (PNAS)</w:t>
+      </w:r>
+      <w:r>
+        <w:rPr>
+          <w:rFonts w:ascii="Times New Roman" w:eastAsiaTheme="minorHAnsi" w:hAnsi="Times New Roman" w:cs="Times New Roman" w:hint="eastAsia"/>
+          <w:i/>
+          <w:iCs/>
+          <w:sz w:val="24"/>
+          <w:szCs w:val="24"/>
+        </w:rPr>
+        <w:t xml:space="preserve">, </w:t>
+      </w:r>
+      <w:r>
+        <w:rPr>
+          <w:rFonts w:ascii="Times New Roman" w:eastAsiaTheme="minorHAnsi" w:hAnsi="Times New Roman" w:cs="Times New Roman" w:hint="eastAsia"/>
+          <w:i/>
+          <w:iCs/>
+          <w:sz w:val="24"/>
+          <w:szCs w:val="24"/>
+        </w:rPr>
+        <w:t>Poetics, Socius</w:t>
+      </w:r>
+      <w:r>
+        <w:rPr>
+          <w:rFonts w:ascii="Times New Roman" w:eastAsiaTheme="minorHAnsi" w:hAnsi="Times New Roman" w:cs="Times New Roman"/>
+          <w:i/>
+          <w:iCs/>
+          <w:sz w:val="24"/>
+          <w:szCs w:val="24"/>
+        </w:rPr>
+        <w:t>, International Sociology</w:t>
+      </w:r>
+    </w:p>
+    <w:p>
+      <w:pPr>
+        <w:spacing w:line="276" w:lineRule="auto"/>
+        <w:jc w:val="left"/>
+        <w:rPr>
+          <w:rFonts w:ascii="Times New Roman" w:eastAsia="함초롬바탕" w:hAnsi="Times New Roman" w:cs="Times New Roman"/>
+          <w:sz w:val="24"/>
+          <w:szCs w:val="20"/>
+        </w:rPr>
+      </w:pPr>
+    </w:p>
+    <w:p>
+      <w:pPr>
+        <w:spacing w:line="276" w:lineRule="auto"/>
+        <w:jc w:val="left"/>
         <w:rPr>
           <w:rFonts w:ascii="Times New Roman" w:eastAsiaTheme="minorHAnsi" w:hAnsi="Times New Roman" w:cs="Times New Roman"/>
           <w:b/>
@@ -6372,340 +6744,25 @@
           <w:szCs w:val="28"/>
           <w:u w:val="single"/>
         </w:rPr>
-        <w:t xml:space="preserve">                             </w:t>
-      </w:r>
-    </w:p>
-    <w:p>
-      <w:pPr>
-        <w:spacing w:line="276" w:lineRule="auto"/>
-        <w:rPr>
-          <w:rFonts w:ascii="Times New Roman" w:eastAsia="함초롬바탕" w:hAnsi="Times New Roman" w:cs="Times New Roman"/>
-          <w:sz w:val="24"/>
-          <w:szCs w:val="20"/>
-        </w:rPr>
-      </w:pPr>
-    </w:p>
-    <w:p>
-      <w:pPr>
-        <w:spacing w:line="276" w:lineRule="auto"/>
-        <w:ind w:left="1600" w:hanging="1600"/>
-        <w:jc w:val="left"/>
-        <w:rPr>
-          <w:rFonts w:ascii="Times New Roman" w:eastAsiaTheme="minorHAnsi" w:hAnsi="Times New Roman" w:cs="Times New Roman"/>
-          <w:sz w:val="24"/>
-          <w:szCs w:val="24"/>
-        </w:rPr>
-      </w:pPr>
-      <w:r>
-        <w:rPr>
-          <w:rFonts w:ascii="Times New Roman" w:eastAsiaTheme="minorHAnsi" w:hAnsi="Times New Roman" w:cs="Times New Roman" w:hint="eastAsia"/>
-          <w:sz w:val="24"/>
-          <w:szCs w:val="24"/>
-        </w:rPr>
-        <w:t>2</w:t>
-      </w:r>
-      <w:r>
-        <w:rPr>
-          <w:rFonts w:ascii="Times New Roman" w:eastAsiaTheme="minorHAnsi" w:hAnsi="Times New Roman" w:cs="Times New Roman"/>
-          <w:sz w:val="24"/>
-          <w:szCs w:val="24"/>
-        </w:rPr>
-        <w:t>02</w:t>
-      </w:r>
-      <w:r>
-        <w:rPr>
-          <w:rFonts w:ascii="Times New Roman" w:eastAsiaTheme="minorHAnsi" w:hAnsi="Times New Roman" w:cs="Times New Roman" w:hint="eastAsia"/>
-          <w:sz w:val="24"/>
-          <w:szCs w:val="24"/>
-        </w:rPr>
-        <w:t>5</w:t>
-      </w:r>
-      <w:r>
-        <w:rPr>
-          <w:rFonts w:ascii="Times New Roman" w:eastAsiaTheme="minorHAnsi" w:hAnsi="Times New Roman" w:cs="Times New Roman"/>
-          <w:sz w:val="24"/>
-          <w:szCs w:val="24"/>
-        </w:rPr>
-        <w:t xml:space="preserve"> – </w:t>
-      </w:r>
-      <w:r>
-        <w:rPr>
-          <w:rFonts w:ascii="Times New Roman" w:eastAsiaTheme="minorHAnsi" w:hAnsi="Times New Roman" w:cs="Times New Roman" w:hint="eastAsia"/>
-          <w:sz w:val="24"/>
-          <w:szCs w:val="20"/>
-        </w:rPr>
-        <w:t>Current</w:t>
-      </w:r>
-      <w:r>
-        <w:rPr>
-          <w:rFonts w:ascii="Times New Roman" w:eastAsiaTheme="minorHAnsi" w:hAnsi="Times New Roman" w:cs="Times New Roman"/>
-          <w:sz w:val="24"/>
-          <w:szCs w:val="24"/>
-        </w:rPr>
-        <w:tab/>
-      </w:r>
-      <w:r>
-        <w:rPr>
-          <w:rFonts w:ascii="Times New Roman" w:eastAsiaTheme="minorHAnsi" w:hAnsi="Times New Roman" w:cs="Times New Roman" w:hint="eastAsia"/>
-          <w:sz w:val="24"/>
-          <w:szCs w:val="24"/>
-        </w:rPr>
-        <w:t>Early Career Review Board</w:t>
-      </w:r>
-      <w:r>
-        <w:rPr>
-          <w:rFonts w:ascii="Times New Roman" w:eastAsiaTheme="minorHAnsi" w:hAnsi="Times New Roman" w:cs="Times New Roman" w:hint="eastAsia"/>
-          <w:sz w:val="24"/>
-          <w:szCs w:val="24"/>
-        </w:rPr>
-        <w:t xml:space="preserve"> Member</w:t>
-      </w:r>
-      <w:r>
-        <w:rPr>
-          <w:rFonts w:ascii="Times New Roman" w:eastAsiaTheme="minorHAnsi" w:hAnsi="Times New Roman" w:cs="Times New Roman" w:hint="eastAsia"/>
-          <w:sz w:val="24"/>
-          <w:szCs w:val="24"/>
-        </w:rPr>
-        <w:t xml:space="preserve">, </w:t>
-      </w:r>
-      <w:r>
-        <w:rPr>
-          <w:rFonts w:ascii="Times New Roman" w:eastAsiaTheme="minorHAnsi" w:hAnsi="Times New Roman" w:cs="Times New Roman" w:hint="eastAsia"/>
-          <w:i/>
-          <w:iCs/>
-          <w:sz w:val="24"/>
-          <w:szCs w:val="24"/>
-        </w:rPr>
-        <w:t>Social Science Research.</w:t>
-      </w:r>
-    </w:p>
-    <w:p>
-      <w:pPr>
-        <w:spacing w:line="276" w:lineRule="auto"/>
-        <w:ind w:left="1600" w:hanging="1600"/>
-        <w:jc w:val="left"/>
-        <w:rPr>
-          <w:rFonts w:ascii="Times New Roman" w:eastAsiaTheme="minorHAnsi" w:hAnsi="Times New Roman" w:cs="Times New Roman"/>
-          <w:sz w:val="24"/>
-          <w:szCs w:val="24"/>
-        </w:rPr>
-      </w:pPr>
-      <w:r>
-        <w:rPr>
-          <w:rFonts w:ascii="Times New Roman" w:eastAsiaTheme="minorHAnsi" w:hAnsi="Times New Roman" w:cs="Times New Roman" w:hint="eastAsia"/>
-          <w:sz w:val="24"/>
-          <w:szCs w:val="24"/>
-        </w:rPr>
-        <w:t>2</w:t>
-      </w:r>
-      <w:r>
-        <w:rPr>
-          <w:rFonts w:ascii="Times New Roman" w:eastAsiaTheme="minorHAnsi" w:hAnsi="Times New Roman" w:cs="Times New Roman"/>
-          <w:sz w:val="24"/>
-          <w:szCs w:val="24"/>
-        </w:rPr>
-        <w:t>02</w:t>
-      </w:r>
-      <w:r>
-        <w:rPr>
-          <w:rFonts w:ascii="Times New Roman" w:eastAsiaTheme="minorHAnsi" w:hAnsi="Times New Roman" w:cs="Times New Roman" w:hint="eastAsia"/>
-          <w:sz w:val="24"/>
-          <w:szCs w:val="24"/>
-        </w:rPr>
-        <w:t>3</w:t>
-      </w:r>
-      <w:r>
-        <w:rPr>
-          <w:rFonts w:ascii="Times New Roman" w:eastAsiaTheme="minorHAnsi" w:hAnsi="Times New Roman" w:cs="Times New Roman"/>
-          <w:sz w:val="24"/>
-          <w:szCs w:val="24"/>
-        </w:rPr>
-        <w:t xml:space="preserve"> – </w:t>
-      </w:r>
-      <w:r>
-        <w:rPr>
-          <w:rFonts w:ascii="Times New Roman" w:eastAsiaTheme="minorHAnsi" w:hAnsi="Times New Roman" w:cs="Times New Roman" w:hint="eastAsia"/>
-          <w:sz w:val="24"/>
-          <w:szCs w:val="20"/>
-        </w:rPr>
-        <w:t>Current</w:t>
-      </w:r>
-      <w:r>
-        <w:rPr>
-          <w:rFonts w:ascii="Times New Roman" w:eastAsiaTheme="minorHAnsi" w:hAnsi="Times New Roman" w:cs="Times New Roman"/>
-          <w:sz w:val="24"/>
-          <w:szCs w:val="24"/>
-        </w:rPr>
-        <w:tab/>
-      </w:r>
-      <w:r>
-        <w:rPr>
-          <w:rFonts w:ascii="Times New Roman" w:eastAsiaTheme="minorHAnsi" w:hAnsi="Times New Roman" w:cs="Times New Roman" w:hint="eastAsia"/>
-          <w:sz w:val="24"/>
-          <w:szCs w:val="24"/>
-        </w:rPr>
-        <w:t xml:space="preserve">Ad Hoc </w:t>
-      </w:r>
-      <w:r>
-        <w:rPr>
-          <w:rFonts w:ascii="Times New Roman" w:eastAsiaTheme="minorHAnsi" w:hAnsi="Times New Roman" w:cs="Times New Roman" w:hint="eastAsia"/>
-          <w:sz w:val="24"/>
-          <w:szCs w:val="24"/>
-        </w:rPr>
-        <w:t>Reviewer</w:t>
-      </w:r>
-      <w:r>
-        <w:rPr>
-          <w:rFonts w:ascii="Times New Roman" w:eastAsiaTheme="minorHAnsi" w:hAnsi="Times New Roman" w:cs="Times New Roman" w:hint="eastAsia"/>
-          <w:sz w:val="24"/>
-          <w:szCs w:val="24"/>
-        </w:rPr>
-        <w:t>,</w:t>
-      </w:r>
-      <w:r>
-        <w:rPr>
-          <w:rFonts w:ascii="Times New Roman" w:eastAsiaTheme="minorHAnsi" w:hAnsi="Times New Roman" w:cs="Times New Roman"/>
-          <w:sz w:val="24"/>
-          <w:szCs w:val="24"/>
-        </w:rPr>
-        <w:t xml:space="preserve"> reviewed manuscripts for the following journals:</w:t>
-      </w:r>
-    </w:p>
-    <w:p>
-      <w:pPr>
-        <w:spacing w:line="276" w:lineRule="auto"/>
-        <w:ind w:left="1600" w:hanging="1600"/>
-        <w:jc w:val="left"/>
-        <w:rPr>
-          <w:rFonts w:ascii="Times New Roman" w:eastAsiaTheme="minorHAnsi" w:hAnsi="Times New Roman" w:cs="Times New Roman"/>
-          <w:i/>
-          <w:iCs/>
-          <w:sz w:val="24"/>
-          <w:szCs w:val="24"/>
-        </w:rPr>
-      </w:pPr>
-      <w:r>
-        <w:rPr>
-          <w:rFonts w:ascii="Times New Roman" w:eastAsiaTheme="minorHAnsi" w:hAnsi="Times New Roman" w:cs="Times New Roman"/>
-          <w:i/>
-          <w:iCs/>
-          <w:sz w:val="24"/>
-          <w:szCs w:val="24"/>
-        </w:rPr>
-        <w:tab/>
-      </w:r>
-      <w:r>
-        <w:rPr>
-          <w:rFonts w:ascii="Times New Roman" w:eastAsiaTheme="minorHAnsi" w:hAnsi="Times New Roman" w:cs="Times New Roman"/>
-          <w:i/>
-          <w:iCs/>
-          <w:sz w:val="24"/>
-          <w:szCs w:val="24"/>
-        </w:rPr>
-        <w:t xml:space="preserve">American Sociological Review, </w:t>
-      </w:r>
-      <w:r>
-        <w:rPr>
-          <w:rFonts w:ascii="Times New Roman" w:eastAsiaTheme="minorHAnsi" w:hAnsi="Times New Roman" w:cs="Times New Roman"/>
-          <w:i/>
-          <w:iCs/>
-          <w:sz w:val="24"/>
-          <w:szCs w:val="24"/>
-        </w:rPr>
-        <w:t xml:space="preserve">Gender &amp; Society, </w:t>
-      </w:r>
-      <w:r>
-        <w:rPr>
-          <w:rFonts w:ascii="Times New Roman" w:eastAsiaTheme="minorHAnsi" w:hAnsi="Times New Roman" w:cs="Times New Roman"/>
-          <w:i/>
-          <w:iCs/>
-          <w:sz w:val="24"/>
-          <w:szCs w:val="24"/>
-        </w:rPr>
-        <w:t xml:space="preserve">Social Science Research, </w:t>
-      </w:r>
-      <w:r>
-        <w:rPr>
-          <w:rFonts w:ascii="Times New Roman" w:eastAsiaTheme="minorHAnsi" w:hAnsi="Times New Roman" w:cs="Times New Roman"/>
-          <w:i/>
-          <w:iCs/>
-          <w:sz w:val="24"/>
-          <w:szCs w:val="24"/>
-        </w:rPr>
-        <w:t>Proceedings of the National Academy of Sciences (PNAS)</w:t>
-      </w:r>
-      <w:r>
-        <w:rPr>
-          <w:rFonts w:ascii="Times New Roman" w:eastAsiaTheme="minorHAnsi" w:hAnsi="Times New Roman" w:cs="Times New Roman" w:hint="eastAsia"/>
-          <w:i/>
-          <w:iCs/>
-          <w:sz w:val="24"/>
-          <w:szCs w:val="24"/>
-        </w:rPr>
-        <w:t xml:space="preserve">, </w:t>
-      </w:r>
-      <w:r>
-        <w:rPr>
-          <w:rFonts w:ascii="Times New Roman" w:eastAsiaTheme="minorHAnsi" w:hAnsi="Times New Roman" w:cs="Times New Roman" w:hint="eastAsia"/>
-          <w:i/>
-          <w:iCs/>
-          <w:sz w:val="24"/>
-          <w:szCs w:val="24"/>
-        </w:rPr>
-        <w:t>Poetics, Socius</w:t>
-      </w:r>
-      <w:r>
-        <w:rPr>
-          <w:rFonts w:ascii="Times New Roman" w:eastAsiaTheme="minorHAnsi" w:hAnsi="Times New Roman" w:cs="Times New Roman"/>
-          <w:i/>
-          <w:iCs/>
-          <w:sz w:val="24"/>
-          <w:szCs w:val="24"/>
-        </w:rPr>
-        <w:t>, International Sociology</w:t>
-      </w:r>
-    </w:p>
-    <w:p>
-      <w:pPr>
-        <w:spacing w:line="276" w:lineRule="auto"/>
-        <w:jc w:val="left"/>
-        <w:rPr>
-          <w:rFonts w:ascii="Times New Roman" w:eastAsia="함초롬바탕" w:hAnsi="Times New Roman" w:cs="Times New Roman"/>
-          <w:sz w:val="24"/>
-          <w:szCs w:val="20"/>
-        </w:rPr>
-      </w:pPr>
-    </w:p>
-    <w:p>
-      <w:pPr>
-        <w:spacing w:line="276" w:lineRule="auto"/>
-        <w:jc w:val="left"/>
-        <w:rPr>
-          <w:rFonts w:ascii="Times New Roman" w:eastAsiaTheme="minorHAnsi" w:hAnsi="Times New Roman" w:cs="Times New Roman"/>
+      </w:pPr>
+      <w:r>
+        <w:rPr>
+          <w:rFonts w:ascii="Times New Roman" w:eastAsiaTheme="minorHAnsi" w:hAnsi="Times New Roman" w:cs="Times New Roman" w:hint="eastAsia"/>
           <w:b/>
           <w:sz w:val="28"/>
           <w:szCs w:val="28"/>
           <w:u w:val="single"/>
         </w:rPr>
-      </w:pPr>
-      <w:r>
-        <w:rPr>
-          <w:rFonts w:ascii="Times New Roman" w:eastAsiaTheme="minorHAnsi" w:hAnsi="Times New Roman" w:cs="Times New Roman" w:hint="eastAsia"/>
+        <w:t xml:space="preserve">OTHER </w:t>
+      </w:r>
+      <w:r>
+        <w:rPr>
+          <w:rFonts w:ascii="Times New Roman" w:eastAsiaTheme="minorHAnsi" w:hAnsi="Times New Roman" w:cs="Times New Roman"/>
           <w:b/>
           <w:sz w:val="28"/>
           <w:szCs w:val="28"/>
           <w:u w:val="single"/>
         </w:rPr>
-        <w:t xml:space="preserve">OTHER </w:t>
-      </w:r>
-      <w:r>
-        <w:rPr>
-          <w:rFonts w:ascii="Times New Roman" w:eastAsiaTheme="minorHAnsi" w:hAnsi="Times New Roman" w:cs="Times New Roman"/>
-          <w:b/>
-          <w:sz w:val="28"/>
-          <w:szCs w:val="28"/>
-          <w:u w:val="single"/>
-        </w:rPr>
         <w:t xml:space="preserve">PROFESSIONAL SERVICE                                          </w:t>
       </w:r>
     </w:p>
@@ -7887,6 +7944,7 @@
           <w:sz w:val="24"/>
           <w:szCs w:val="24"/>
         </w:rPr>
+        <w:lastRenderedPageBreak/>
         <w:t>20</w:t>
       </w:r>
       <w:r>
@@ -9126,6 +9184,119 @@
     </w:lvl>
   </w:abstractNum>
   <w:abstractNum w:abstractNumId="8" w15:restartNumberingAfterBreak="0">
+    <w:nsid w:val="770A173F"/>
+    <w:multiLevelType w:val="hybridMultilevel"/>
+    <w:tmpl w:val="65B2CF6E"/>
+    <w:lvl w:ilvl="0" w:tplc="CE4A9B82">
+      <w:start w:val="3"/>
+      <w:numFmt w:val="bullet"/>
+      <w:lvlText w:val=""/>
+      <w:lvlJc w:val="left"/>
+      <w:pPr>
+        <w:ind w:left="720" w:hanging="360"/>
+      </w:pPr>
+      <w:rPr>
+        <w:rFonts w:ascii="Symbol" w:eastAsiaTheme="minorHAnsi" w:hAnsi="Symbol" w:cs="Times New Roman" w:hint="default"/>
+      </w:rPr>
+    </w:lvl>
+    <w:lvl w:ilvl="1" w:tplc="04090003" w:tentative="1">
+      <w:start w:val="1"/>
+      <w:numFmt w:val="bullet"/>
+      <w:lvlText w:val="o"/>
+      <w:lvlJc w:val="left"/>
+      <w:pPr>
+        <w:ind w:left="1440" w:hanging="360"/>
+      </w:pPr>
+      <w:rPr>
+        <w:rFonts w:ascii="Courier New" w:hAnsi="Courier New" w:hint="default"/>
+      </w:rPr>
+    </w:lvl>
+    <w:lvl w:ilvl="2" w:tplc="04090005" w:tentative="1">
+      <w:start w:val="1"/>
+      <w:numFmt w:val="bullet"/>
+      <w:lvlText w:val=""/>
+      <w:lvlJc w:val="left"/>
+      <w:pPr>
+        <w:ind w:left="2160" w:hanging="360"/>
+      </w:pPr>
+      <w:rPr>
+        <w:rFonts w:ascii="Wingdings" w:hAnsi="Wingdings" w:hint="default"/>
+      </w:rPr>
+    </w:lvl>
+    <w:lvl w:ilvl="3" w:tplc="04090001" w:tentative="1">
+      <w:start w:val="1"/>
+      <w:numFmt w:val="bullet"/>
+      <w:lvlText w:val=""/>
+      <w:lvlJc w:val="left"/>
+      <w:pPr>
+        <w:ind w:left="2880" w:hanging="360"/>
+      </w:pPr>
+      <w:rPr>
+        <w:rFonts w:ascii="Symbol" w:hAnsi="Symbol" w:hint="default"/>
+      </w:rPr>
+    </w:lvl>
+    <w:lvl w:ilvl="4" w:tplc="04090003" w:tentative="1">
+      <w:start w:val="1"/>
+      <w:numFmt w:val="bullet"/>
+      <w:lvlText w:val="o"/>
+      <w:lvlJc w:val="left"/>
+      <w:pPr>
+        <w:ind w:left="3600" w:hanging="360"/>
+      </w:pPr>
+      <w:rPr>
+        <w:rFonts w:ascii="Courier New" w:hAnsi="Courier New" w:hint="default"/>
+      </w:rPr>
+    </w:lvl>
+    <w:lvl w:ilvl="5" w:tplc="04090005" w:tentative="1">
+      <w:start w:val="1"/>
+      <w:numFmt w:val="bullet"/>
+      <w:lvlText w:val=""/>
+      <w:lvlJc w:val="left"/>
+      <w:pPr>
+        <w:ind w:left="4320" w:hanging="360"/>
+      </w:pPr>
+      <w:rPr>
+        <w:rFonts w:ascii="Wingdings" w:hAnsi="Wingdings" w:hint="default"/>
+      </w:rPr>
+    </w:lvl>
+    <w:lvl w:ilvl="6" w:tplc="04090001" w:tentative="1">
+      <w:start w:val="1"/>
+      <w:numFmt w:val="bullet"/>
+      <w:lvlText w:val=""/>
+      <w:lvlJc w:val="left"/>
+      <w:pPr>
+        <w:ind w:left="5040" w:hanging="360"/>
+      </w:pPr>
+      <w:rPr>
+        <w:rFonts w:ascii="Symbol" w:hAnsi="Symbol" w:hint="default"/>
+      </w:rPr>
+    </w:lvl>
+    <w:lvl w:ilvl="7" w:tplc="04090003" w:tentative="1">
+      <w:start w:val="1"/>
+      <w:numFmt w:val="bullet"/>
+      <w:lvlText w:val="o"/>
+      <w:lvlJc w:val="left"/>
+      <w:pPr>
+        <w:ind w:left="5760" w:hanging="360"/>
+      </w:pPr>
+      <w:rPr>
+        <w:rFonts w:ascii="Courier New" w:hAnsi="Courier New" w:hint="default"/>
+      </w:rPr>
+    </w:lvl>
+    <w:lvl w:ilvl="8" w:tplc="04090005" w:tentative="1">
+      <w:start w:val="1"/>
+      <w:numFmt w:val="bullet"/>
+      <w:lvlText w:val=""/>
+      <w:lvlJc w:val="left"/>
+      <w:pPr>
+        <w:ind w:left="6480" w:hanging="360"/>
+      </w:pPr>
+      <w:rPr>
+        <w:rFonts w:ascii="Wingdings" w:hAnsi="Wingdings" w:hint="default"/>
+      </w:rPr>
+    </w:lvl>
+  </w:abstractNum>
+  <w:abstractNum w:abstractNumId="9" w15:restartNumberingAfterBreak="0">
     <w:nsid w:val="79FD26CD"/>
     <w:multiLevelType w:val="hybridMultilevel"/>
     <w:tmpl w:val="8534A288"/>
@@ -9238,7 +9409,7 @@
       </w:rPr>
     </w:lvl>
   </w:abstractNum>
-  <w:abstractNum w:abstractNumId="9" w15:restartNumberingAfterBreak="0">
+  <w:abstractNum w:abstractNumId="10" w15:restartNumberingAfterBreak="0">
     <w:nsid w:val="7FB51548"/>
     <w:multiLevelType w:val="hybridMultilevel"/>
     <w:tmpl w:val="194828BC"/>
@@ -9337,7 +9508,7 @@
     <w:abstractNumId w:val="6"/>
   </w:num>
   <w:num w:numId="4" w16cid:durableId="1627661479">
-    <w:abstractNumId w:val="8"/>
+    <w:abstractNumId w:val="9"/>
   </w:num>
   <w:num w:numId="5" w16cid:durableId="17196109">
     <w:abstractNumId w:val="0"/>
@@ -9355,7 +9526,10 @@
     <w:abstractNumId w:val="3"/>
   </w:num>
   <w:num w:numId="10" w16cid:durableId="765157084">
-    <w:abstractNumId w:val="9"/>
+    <w:abstractNumId w:val="10"/>
+  </w:num>
+  <w:num w:numId="11" w16cid:durableId="1322276705">
+    <w:abstractNumId w:val="8"/>
   </w:num>
 </w:numbering>
 </file>

</xml_diff>

<commit_message>
Manual CV update: 2026-04-17 17:02:01 CDT
</commit_message>
<xml_diff>
--- a/public/cv.docx
+++ b/public/cv.docx
@@ -2542,87 +2542,6 @@
     </w:p>
     <w:p>
       <w:pPr>
-        <w:spacing w:after="240" w:line="276" w:lineRule="auto"/>
-        <w:jc w:val="left"/>
-        <w:rPr>
-          <w:rFonts w:ascii="Times New Roman" w:eastAsiaTheme="minorHAnsi" w:hAnsi="Times New Roman" w:cs="Times New Roman"/>
-          <w:b/>
-          <w:bCs/>
-          <w:sz w:val="24"/>
-          <w:szCs w:val="20"/>
-        </w:rPr>
-      </w:pPr>
-      <w:r>
-        <w:rPr>
-          <w:rFonts w:ascii="Times New Roman" w:eastAsiaTheme="minorHAnsi" w:hAnsi="Times New Roman" w:cs="Times New Roman"/>
-          <w:b/>
-          <w:bCs/>
-          <w:sz w:val="24"/>
-          <w:szCs w:val="20"/>
-        </w:rPr>
-        <w:t>Lee, Jina.</w:t>
-      </w:r>
-      <w:r>
-        <w:rPr>
-          <w:rFonts w:ascii="Times New Roman" w:eastAsiaTheme="minorHAnsi" w:hAnsi="Times New Roman" w:cs="Times New Roman"/>
-          <w:b/>
-          <w:bCs/>
-          <w:sz w:val="24"/>
-          <w:szCs w:val="20"/>
-        </w:rPr>
-        <w:t xml:space="preserve"> </w:t>
-      </w:r>
-      <w:r>
-        <w:rPr>
-          <w:rFonts w:ascii="Times New Roman" w:eastAsiaTheme="minorHAnsi" w:hAnsi="Times New Roman" w:cs="Times New Roman"/>
-          <w:sz w:val="24"/>
-          <w:szCs w:val="20"/>
-        </w:rPr>
-        <w:t>“</w:t>
-      </w:r>
-      <w:r>
-        <w:rPr>
-          <w:rFonts w:ascii="Times New Roman" w:eastAsiaTheme="minorHAnsi" w:hAnsi="Times New Roman" w:cs="Times New Roman"/>
-          <w:sz w:val="24"/>
-          <w:szCs w:val="20"/>
-        </w:rPr>
-        <w:t xml:space="preserve">When AI Holds a Mirror: </w:t>
-      </w:r>
-      <w:r>
-        <w:rPr>
-          <w:rFonts w:ascii="Times New Roman" w:eastAsiaTheme="minorHAnsi" w:hAnsi="Times New Roman" w:cs="Times New Roman"/>
-          <w:sz w:val="24"/>
-          <w:szCs w:val="20"/>
-        </w:rPr>
-        <w:t>Why Reflexivity Stayed Normative and What Changes When It Doesn’t Have To</w:t>
-      </w:r>
-      <w:r>
-        <w:rPr>
-          <w:rFonts w:ascii="Times New Roman" w:eastAsiaTheme="minorHAnsi" w:hAnsi="Times New Roman" w:cs="Times New Roman"/>
-          <w:sz w:val="24"/>
-          <w:szCs w:val="20"/>
-        </w:rPr>
-        <w:t>.”</w:t>
-      </w:r>
-      <w:r>
-        <w:rPr>
-          <w:rFonts w:ascii="Times New Roman" w:eastAsiaTheme="minorHAnsi" w:hAnsi="Times New Roman" w:cs="Times New Roman"/>
-          <w:sz w:val="24"/>
-          <w:szCs w:val="20"/>
-        </w:rPr>
-        <w:t xml:space="preserve"> </w:t>
-      </w:r>
-      <w:r>
-        <w:rPr>
-          <w:rFonts w:ascii="Times New Roman" w:eastAsiaTheme="minorHAnsi" w:hAnsi="Times New Roman" w:cs="Times New Roman"/>
-          <w:sz w:val="24"/>
-          <w:szCs w:val="20"/>
-        </w:rPr>
-        <w:t>[In progress]</w:t>
-      </w:r>
-    </w:p>
-    <w:p>
-      <w:pPr>
         <w:spacing w:line="276" w:lineRule="auto"/>
         <w:jc w:val="left"/>
         <w:rPr>
@@ -3190,7 +3109,6 @@
           <w:sz w:val="24"/>
           <w:szCs w:val="20"/>
         </w:rPr>
-        <w:lastRenderedPageBreak/>
         <w:t>AI</w:t>
       </w:r>
       <w:r>
@@ -3337,7 +3255,16 @@
           <w:sz w:val="24"/>
           <w:szCs w:val="20"/>
         </w:rPr>
-        <w:t>Women in Data Science Worldwide</w:t>
+        <w:t xml:space="preserve">Women in </w:t>
+      </w:r>
+      <w:r>
+        <w:rPr>
+          <w:rFonts w:ascii="Times New Roman" w:eastAsiaTheme="minorHAnsi" w:hAnsi="Times New Roman" w:cs="Times New Roman" w:hint="eastAsia"/>
+          <w:sz w:val="24"/>
+          <w:szCs w:val="20"/>
+        </w:rPr>
+        <w:lastRenderedPageBreak/>
+        <w:t>Data Science Worldwide</w:t>
       </w:r>
       <w:r>
         <w:rPr>
@@ -4932,7 +4859,6 @@
           <w:sz w:val="24"/>
           <w:szCs w:val="20"/>
         </w:rPr>
-        <w:lastRenderedPageBreak/>
         <w:t>Consecration of Korean Writers, 1960–2000,” 112</w:t>
       </w:r>
       <w:r>
@@ -5010,6 +4936,7 @@
           <w:szCs w:val="20"/>
           <w:u w:val="single"/>
         </w:rPr>
+        <w:lastRenderedPageBreak/>
         <w:t xml:space="preserve">HONORS AND GRANTS                                             </w:t>
       </w:r>
     </w:p>
@@ -6338,7 +6265,6 @@
           <w:sz w:val="24"/>
           <w:szCs w:val="20"/>
         </w:rPr>
-        <w:lastRenderedPageBreak/>
         <w:t xml:space="preserve"> </w:t>
       </w:r>
       <w:r>
@@ -7944,7 +7870,6 @@
           <w:sz w:val="24"/>
           <w:szCs w:val="24"/>
         </w:rPr>
-        <w:lastRenderedPageBreak/>
         <w:t>20</w:t>
       </w:r>
       <w:r>

</xml_diff>

<commit_message>
Manual CV update: 2026-04-27 20:13:40 CDT
</commit_message>
<xml_diff>
--- a/public/cv.docx
+++ b/public/cv.docx
@@ -2229,7 +2229,6 @@
         </w:rPr>
         <w:t xml:space="preserve">Divide and </w:t>
       </w:r>
-      <w:proofErr w:type="gramStart"/>
       <w:r>
         <w:rPr>
           <w:rFonts w:ascii="Times New Roman" w:eastAsiaTheme="minorHAnsi" w:hAnsi="Times New Roman" w:cs="Times New Roman"/>
@@ -2244,16 +2243,7 @@
           <w:sz w:val="24"/>
           <w:szCs w:val="20"/>
         </w:rPr>
-        <w:t>onquer</w:t>
-      </w:r>
-      <w:proofErr w:type="gramEnd"/>
-      <w:r>
-        <w:rPr>
-          <w:rFonts w:ascii="Times New Roman" w:eastAsiaTheme="minorHAnsi" w:hAnsi="Times New Roman" w:cs="Times New Roman"/>
-          <w:sz w:val="24"/>
-          <w:szCs w:val="20"/>
-        </w:rPr>
-        <w:t xml:space="preserve">? How </w:t>
+        <w:t xml:space="preserve">onquer? How </w:t>
       </w:r>
       <w:r>
         <w:rPr>
@@ -2503,41 +2493,100 @@
           <w:sz w:val="24"/>
           <w:szCs w:val="20"/>
         </w:rPr>
+        <w:t xml:space="preserve"> Zhuofan Li. “</w:t>
+      </w:r>
+      <w:r>
+        <w:rPr>
+          <w:rFonts w:ascii="Times New Roman" w:eastAsiaTheme="minorHAnsi" w:hAnsi="Times New Roman" w:cs="Times New Roman"/>
+          <w:sz w:val="24"/>
+          <w:szCs w:val="20"/>
+        </w:rPr>
+        <w:t>Conceptual Divergence Analysis for Reflective Auditing</w:t>
+      </w:r>
+      <w:r>
+        <w:rPr>
+          <w:rFonts w:ascii="Times New Roman" w:eastAsiaTheme="minorHAnsi" w:hAnsi="Times New Roman" w:cs="Times New Roman"/>
+          <w:sz w:val="24"/>
+          <w:szCs w:val="20"/>
+        </w:rPr>
+        <w:t>.” [In progress]</w:t>
+      </w:r>
+    </w:p>
+    <w:p>
+      <w:pPr>
+        <w:spacing w:after="240" w:line="276" w:lineRule="auto"/>
+        <w:jc w:val="left"/>
+        <w:rPr>
+          <w:rFonts w:ascii="Times New Roman" w:eastAsiaTheme="minorHAnsi" w:hAnsi="Times New Roman" w:cs="Times New Roman"/>
+          <w:sz w:val="24"/>
+          <w:szCs w:val="20"/>
+        </w:rPr>
+      </w:pPr>
+      <w:r>
+        <w:rPr>
+          <w:rFonts w:ascii="Times New Roman" w:eastAsiaTheme="minorHAnsi" w:hAnsi="Times New Roman" w:cs="Times New Roman"/>
+          <w:sz w:val="24"/>
+          <w:szCs w:val="20"/>
+        </w:rPr>
+        <w:t xml:space="preserve">Hyejin Jeon, </w:t>
+      </w:r>
+      <w:r>
+        <w:rPr>
+          <w:rFonts w:ascii="Times New Roman" w:eastAsiaTheme="minorHAnsi" w:hAnsi="Times New Roman" w:cs="Times New Roman"/>
+          <w:b/>
+          <w:bCs/>
+          <w:sz w:val="24"/>
+          <w:szCs w:val="20"/>
+        </w:rPr>
+        <w:t>Jina Lee</w:t>
+      </w:r>
+      <w:r>
+        <w:rPr>
+          <w:rFonts w:ascii="Times New Roman" w:eastAsiaTheme="minorHAnsi" w:hAnsi="Times New Roman" w:cs="Times New Roman"/>
+          <w:sz w:val="24"/>
+          <w:szCs w:val="20"/>
+        </w:rPr>
+        <w:t>.</w:t>
+      </w:r>
+      <w:r>
+        <w:rPr>
+          <w:rFonts w:ascii="Times New Roman" w:eastAsiaTheme="minorHAnsi" w:hAnsi="Times New Roman" w:cs="Times New Roman"/>
+          <w:sz w:val="24"/>
+          <w:szCs w:val="20"/>
+        </w:rPr>
+        <w:t xml:space="preserve"> “</w:t>
+      </w:r>
+      <w:r>
+        <w:rPr>
+          <w:rFonts w:ascii="Times New Roman" w:eastAsiaTheme="minorHAnsi" w:hAnsi="Times New Roman" w:cs="Times New Roman"/>
+          <w:sz w:val="24"/>
+          <w:szCs w:val="20"/>
+        </w:rPr>
+        <w:t>Convergent Volume, Divergent Framing Across Political Ideology:</w:t>
+      </w:r>
+      <w:r>
+        <w:rPr>
+          <w:rFonts w:ascii="Times New Roman" w:eastAsiaTheme="minorHAnsi" w:hAnsi="Times New Roman" w:cs="Times New Roman"/>
+          <w:sz w:val="24"/>
+          <w:szCs w:val="20"/>
+        </w:rPr>
         <w:t xml:space="preserve"> </w:t>
       </w:r>
-      <w:proofErr w:type="spellStart"/>
-      <w:r>
-        <w:rPr>
-          <w:rFonts w:ascii="Times New Roman" w:eastAsiaTheme="minorHAnsi" w:hAnsi="Times New Roman" w:cs="Times New Roman"/>
-          <w:sz w:val="24"/>
-          <w:szCs w:val="20"/>
-        </w:rPr>
-        <w:t>Zhuofan</w:t>
-      </w:r>
-      <w:proofErr w:type="spellEnd"/>
-      <w:r>
-        <w:rPr>
-          <w:rFonts w:ascii="Times New Roman" w:eastAsiaTheme="minorHAnsi" w:hAnsi="Times New Roman" w:cs="Times New Roman"/>
-          <w:sz w:val="24"/>
-          <w:szCs w:val="20"/>
-        </w:rPr>
-        <w:t xml:space="preserve"> Li. “</w:t>
-      </w:r>
-      <w:r>
-        <w:rPr>
-          <w:rFonts w:ascii="Times New Roman" w:eastAsiaTheme="minorHAnsi" w:hAnsi="Times New Roman" w:cs="Times New Roman"/>
-          <w:sz w:val="24"/>
-          <w:szCs w:val="20"/>
-        </w:rPr>
-        <w:t>Conceptual Divergence Analysis for Reflective Auditing</w:t>
-      </w:r>
-      <w:r>
-        <w:rPr>
-          <w:rFonts w:ascii="Times New Roman" w:eastAsiaTheme="minorHAnsi" w:hAnsi="Times New Roman" w:cs="Times New Roman"/>
-          <w:sz w:val="24"/>
-          <w:szCs w:val="20"/>
-        </w:rPr>
-        <w:t>.” [In progress]</w:t>
+      <w:r>
+        <w:rPr>
+          <w:rFonts w:ascii="Times New Roman" w:eastAsiaTheme="minorHAnsi" w:hAnsi="Times New Roman" w:cs="Times New Roman"/>
+          <w:sz w:val="24"/>
+          <w:szCs w:val="20"/>
+        </w:rPr>
+        <w:t>Digital Feminist Mobilization and Sexual Violence Reporting in Korean News, 2000-2025</w:t>
+      </w:r>
+      <w:r>
+        <w:rPr>
+          <w:rFonts w:ascii="Times New Roman" w:eastAsiaTheme="minorHAnsi" w:hAnsi="Times New Roman" w:cs="Times New Roman"/>
+          <w:sz w:val="24"/>
+          <w:szCs w:val="20"/>
+        </w:rPr>
+        <w:t>.”</w:t>
       </w:r>
     </w:p>
     <w:p>
@@ -3109,6 +3158,7 @@
           <w:sz w:val="24"/>
           <w:szCs w:val="20"/>
         </w:rPr>
+        <w:lastRenderedPageBreak/>
         <w:t>AI</w:t>
       </w:r>
       <w:r>
@@ -3255,16 +3305,7 @@
           <w:sz w:val="24"/>
           <w:szCs w:val="20"/>
         </w:rPr>
-        <w:t xml:space="preserve">Women in </w:t>
-      </w:r>
-      <w:r>
-        <w:rPr>
-          <w:rFonts w:ascii="Times New Roman" w:eastAsiaTheme="minorHAnsi" w:hAnsi="Times New Roman" w:cs="Times New Roman" w:hint="eastAsia"/>
-          <w:sz w:val="24"/>
-          <w:szCs w:val="20"/>
-        </w:rPr>
-        <w:lastRenderedPageBreak/>
-        <w:t>Data Science Worldwide</w:t>
+        <w:t>Women in Data Science Worldwide</w:t>
       </w:r>
       <w:r>
         <w:rPr>
@@ -3821,7 +3862,6 @@
         </w:rPr>
         <w:t xml:space="preserve">Divide and </w:t>
       </w:r>
-      <w:proofErr w:type="gramStart"/>
       <w:r>
         <w:rPr>
           <w:rFonts w:ascii="Times New Roman" w:eastAsiaTheme="minorHAnsi" w:hAnsi="Times New Roman" w:cs="Times New Roman"/>
@@ -3836,16 +3876,7 @@
           <w:sz w:val="24"/>
           <w:szCs w:val="20"/>
         </w:rPr>
-        <w:t>onquer</w:t>
-      </w:r>
-      <w:proofErr w:type="gramEnd"/>
-      <w:r>
-        <w:rPr>
-          <w:rFonts w:ascii="Times New Roman" w:eastAsiaTheme="minorHAnsi" w:hAnsi="Times New Roman" w:cs="Times New Roman"/>
-          <w:sz w:val="24"/>
-          <w:szCs w:val="20"/>
-        </w:rPr>
-        <w:t xml:space="preserve">? How </w:t>
+        <w:t xml:space="preserve">onquer? How </w:t>
       </w:r>
       <w:r>
         <w:rPr>
@@ -4079,25 +4110,7 @@
           <w:sz w:val="24"/>
           <w:szCs w:val="20"/>
         </w:rPr>
-        <w:t>” American Sociological Association Methodology Section Mid-</w:t>
-      </w:r>
-      <w:proofErr w:type="gramStart"/>
-      <w:r>
-        <w:rPr>
-          <w:rFonts w:ascii="Times New Roman" w:eastAsiaTheme="minorHAnsi" w:hAnsi="Times New Roman" w:cs="Times New Roman"/>
-          <w:sz w:val="24"/>
-          <w:szCs w:val="20"/>
-        </w:rPr>
-        <w:t>year</w:t>
-      </w:r>
-      <w:proofErr w:type="gramEnd"/>
-      <w:r>
-        <w:rPr>
-          <w:rFonts w:ascii="Times New Roman" w:eastAsiaTheme="minorHAnsi" w:hAnsi="Times New Roman" w:cs="Times New Roman"/>
-          <w:sz w:val="24"/>
-          <w:szCs w:val="20"/>
-        </w:rPr>
-        <w:t xml:space="preserve"> Meeting, Philadelphia, PA.</w:t>
+        <w:t>” American Sociological Association Methodology Section Mid-year Meeting, Philadelphia, PA.</w:t>
       </w:r>
     </w:p>
     <w:p>
@@ -4463,18 +4476,8 @@
           <w:sz w:val="24"/>
           <w:szCs w:val="20"/>
         </w:rPr>
-        <w:t xml:space="preserve">International Society for </w:t>
-      </w:r>
-      <w:proofErr w:type="spellStart"/>
-      <w:r>
-        <w:rPr>
-          <w:rFonts w:ascii="Times New Roman" w:eastAsiaTheme="minorHAnsi" w:hAnsi="Times New Roman" w:cs="Times New Roman"/>
-          <w:sz w:val="24"/>
-          <w:szCs w:val="20"/>
-        </w:rPr>
-        <w:t>Scientometrics</w:t>
-      </w:r>
-      <w:proofErr w:type="spellEnd"/>
+        <w:t>International Society for Scientometrics</w:t>
+      </w:r>
       <w:r>
         <w:rPr>
           <w:rFonts w:ascii="Times New Roman" w:eastAsiaTheme="minorHAnsi" w:hAnsi="Times New Roman" w:cs="Times New Roman"/>
@@ -4489,18 +4492,8 @@
           <w:sz w:val="24"/>
           <w:szCs w:val="20"/>
         </w:rPr>
-        <w:t xml:space="preserve">and </w:t>
-      </w:r>
-      <w:proofErr w:type="spellStart"/>
-      <w:r>
-        <w:rPr>
-          <w:rFonts w:ascii="Times New Roman" w:eastAsiaTheme="minorHAnsi" w:hAnsi="Times New Roman" w:cs="Times New Roman"/>
-          <w:sz w:val="24"/>
-          <w:szCs w:val="20"/>
-        </w:rPr>
-        <w:t>Informetrics</w:t>
-      </w:r>
-      <w:proofErr w:type="spellEnd"/>
+        <w:t>and Informetrics</w:t>
+      </w:r>
       <w:r>
         <w:rPr>
           <w:rFonts w:ascii="Times New Roman" w:eastAsiaTheme="minorHAnsi" w:hAnsi="Times New Roman" w:cs="Times New Roman"/>
@@ -4859,6 +4852,7 @@
           <w:sz w:val="24"/>
           <w:szCs w:val="20"/>
         </w:rPr>
+        <w:lastRenderedPageBreak/>
         <w:t>Consecration of Korean Writers, 1960–2000,” 112</w:t>
       </w:r>
       <w:r>
@@ -4936,7 +4930,6 @@
           <w:szCs w:val="20"/>
           <w:u w:val="single"/>
         </w:rPr>
-        <w:lastRenderedPageBreak/>
         <w:t xml:space="preserve">HONORS AND GRANTS                                             </w:t>
       </w:r>
     </w:p>
@@ -5942,25 +5935,7 @@
           <w:sz w:val="24"/>
           <w:szCs w:val="20"/>
         </w:rPr>
-        <w:t xml:space="preserve">Introduction to Social Statistics (In-Person, </w:t>
-      </w:r>
-      <w:proofErr w:type="gramStart"/>
-      <w:r>
-        <w:rPr>
-          <w:rFonts w:ascii="Times New Roman" w:eastAsia="함초롬바탕" w:hAnsi="Times New Roman" w:cs="Times New Roman"/>
-          <w:sz w:val="24"/>
-          <w:szCs w:val="20"/>
-        </w:rPr>
-        <w:t>Fall</w:t>
-      </w:r>
-      <w:proofErr w:type="gramEnd"/>
-      <w:r>
-        <w:rPr>
-          <w:rFonts w:ascii="Times New Roman" w:eastAsia="함초롬바탕" w:hAnsi="Times New Roman" w:cs="Times New Roman"/>
-          <w:sz w:val="24"/>
-          <w:szCs w:val="20"/>
-        </w:rPr>
-        <w:t xml:space="preserve"> 2024</w:t>
+        <w:t>Introduction to Social Statistics (In-Person, Fall 2024</w:t>
       </w:r>
       <w:r>
         <w:rPr>
@@ -6193,7 +6168,6 @@
         </w:rPr>
         <w:t xml:space="preserve">2026 </w:t>
       </w:r>
-      <w:proofErr w:type="gramStart"/>
       <w:r>
         <w:rPr>
           <w:rFonts w:ascii="Times New Roman" w:eastAsia="함초롬바탕" w:hAnsi="Times New Roman" w:cs="Times New Roman" w:hint="eastAsia"/>
@@ -6218,7 +6192,6 @@
         </w:rPr>
         <w:t>“</w:t>
       </w:r>
-      <w:proofErr w:type="gramEnd"/>
       <w:r>
         <w:rPr>
           <w:rFonts w:ascii="Times New Roman" w:eastAsia="함초롬바탕" w:hAnsi="Times New Roman" w:cs="Times New Roman"/>
@@ -6265,6 +6238,7 @@
           <w:sz w:val="24"/>
           <w:szCs w:val="20"/>
         </w:rPr>
+        <w:lastRenderedPageBreak/>
         <w:t xml:space="preserve"> </w:t>
       </w:r>
       <w:r>
@@ -6736,16 +6710,6 @@
         </w:rPr>
         <w:t>n</w:t>
       </w:r>
-      <w:r>
-        <w:rPr>
-          <w:rFonts w:ascii="Times New Roman" w:eastAsiaTheme="minorHAnsi" w:hAnsi="Times New Roman" w:cs="Times New Roman"/>
-          <w:b/>
-          <w:bCs/>
-          <w:sz w:val="24"/>
-          <w:szCs w:val="24"/>
-        </w:rPr>
-        <w:br/>
-      </w:r>
     </w:p>
     <w:p>
       <w:pPr>
@@ -7266,22 +7230,6 @@
         <w:jc w:val="left"/>
         <w:rPr>
           <w:rFonts w:ascii="Times New Roman" w:hAnsi="Times New Roman" w:cs="Times New Roman"/>
-          <w:b/>
-          <w:bCs/>
-          <w:color w:val="000000"/>
-          <w:sz w:val="24"/>
-          <w:szCs w:val="24"/>
-          <w:shd w:val="clear" w:color="auto" w:fill="FFFFFF"/>
-        </w:rPr>
-      </w:pPr>
-    </w:p>
-    <w:p>
-      <w:pPr>
-        <w:spacing w:line="276" w:lineRule="auto"/>
-        <w:ind w:left="1600" w:hanging="1600"/>
-        <w:jc w:val="left"/>
-        <w:rPr>
-          <w:rFonts w:ascii="Times New Roman" w:hAnsi="Times New Roman" w:cs="Times New Roman"/>
           <w:color w:val="000000"/>
           <w:sz w:val="24"/>
           <w:szCs w:val="24"/>
@@ -7624,22 +7572,6 @@
         </w:rPr>
         <w:t>Service to the University of Arizona</w:t>
       </w:r>
-    </w:p>
-    <w:p>
-      <w:pPr>
-        <w:spacing w:line="276" w:lineRule="auto"/>
-        <w:ind w:left="1600" w:hanging="1600"/>
-        <w:jc w:val="left"/>
-        <w:rPr>
-          <w:rFonts w:ascii="Times New Roman" w:hAnsi="Times New Roman" w:cs="Times New Roman"/>
-          <w:b/>
-          <w:bCs/>
-          <w:color w:val="000000"/>
-          <w:sz w:val="24"/>
-          <w:szCs w:val="24"/>
-          <w:shd w:val="clear" w:color="auto" w:fill="FFFFFF"/>
-        </w:rPr>
-      </w:pPr>
     </w:p>
     <w:p>
       <w:pPr>
@@ -8188,7 +8120,15 @@
         <w:sz w:val="24"/>
         <w:szCs w:val="24"/>
       </w:rPr>
-      <w:t>17</w:t>
+      <w:t>2</w:t>
+    </w:r>
+    <w:r>
+      <w:rPr>
+        <w:rFonts w:ascii="Times New Roman" w:eastAsiaTheme="minorHAnsi" w:hAnsi="Times New Roman" w:cs="Times New Roman"/>
+        <w:sz w:val="24"/>
+        <w:szCs w:val="24"/>
+      </w:rPr>
+      <w:t>7</w:t>
     </w:r>
     <w:r>
       <w:rPr>

</xml_diff>

<commit_message>
Manual CV update: 2026-04-27 20:16:36 CDT
</commit_message>
<xml_diff>
--- a/public/cv.docx
+++ b/public/cv.docx
@@ -2229,6 +2229,7 @@
         </w:rPr>
         <w:t xml:space="preserve">Divide and </w:t>
       </w:r>
+      <w:proofErr w:type="gramStart"/>
       <w:r>
         <w:rPr>
           <w:rFonts w:ascii="Times New Roman" w:eastAsiaTheme="minorHAnsi" w:hAnsi="Times New Roman" w:cs="Times New Roman"/>
@@ -2243,7 +2244,16 @@
           <w:sz w:val="24"/>
           <w:szCs w:val="20"/>
         </w:rPr>
-        <w:t xml:space="preserve">onquer? How </w:t>
+        <w:t>onquer</w:t>
+      </w:r>
+      <w:proofErr w:type="gramEnd"/>
+      <w:r>
+        <w:rPr>
+          <w:rFonts w:ascii="Times New Roman" w:eastAsiaTheme="minorHAnsi" w:hAnsi="Times New Roman" w:cs="Times New Roman"/>
+          <w:sz w:val="24"/>
+          <w:szCs w:val="20"/>
+        </w:rPr>
+        <w:t xml:space="preserve">? How </w:t>
       </w:r>
       <w:r>
         <w:rPr>
@@ -2493,7 +2503,25 @@
           <w:sz w:val="24"/>
           <w:szCs w:val="20"/>
         </w:rPr>
-        <w:t xml:space="preserve"> Zhuofan Li. “</w:t>
+        <w:t xml:space="preserve"> </w:t>
+      </w:r>
+      <w:proofErr w:type="spellStart"/>
+      <w:r>
+        <w:rPr>
+          <w:rFonts w:ascii="Times New Roman" w:eastAsiaTheme="minorHAnsi" w:hAnsi="Times New Roman" w:cs="Times New Roman"/>
+          <w:sz w:val="24"/>
+          <w:szCs w:val="20"/>
+        </w:rPr>
+        <w:t>Zhuofan</w:t>
+      </w:r>
+      <w:proofErr w:type="spellEnd"/>
+      <w:r>
+        <w:rPr>
+          <w:rFonts w:ascii="Times New Roman" w:eastAsiaTheme="minorHAnsi" w:hAnsi="Times New Roman" w:cs="Times New Roman"/>
+          <w:sz w:val="24"/>
+          <w:szCs w:val="20"/>
+        </w:rPr>
+        <w:t xml:space="preserve"> Li. “</w:t>
       </w:r>
       <w:r>
         <w:rPr>
@@ -2588,10 +2616,26 @@
         </w:rPr>
         <w:t>.”</w:t>
       </w:r>
-    </w:p>
-    <w:p>
-      <w:pPr>
-        <w:spacing w:line="276" w:lineRule="auto"/>
+      <w:r>
+        <w:rPr>
+          <w:rFonts w:ascii="Times New Roman" w:eastAsiaTheme="minorHAnsi" w:hAnsi="Times New Roman" w:cs="Times New Roman"/>
+          <w:sz w:val="24"/>
+          <w:szCs w:val="20"/>
+        </w:rPr>
+        <w:t xml:space="preserve"> </w:t>
+      </w:r>
+      <w:r>
+        <w:rPr>
+          <w:rFonts w:ascii="Times New Roman" w:eastAsiaTheme="minorHAnsi" w:hAnsi="Times New Roman" w:cs="Times New Roman"/>
+          <w:sz w:val="24"/>
+          <w:szCs w:val="20"/>
+        </w:rPr>
+        <w:t>[In progress]</w:t>
+      </w:r>
+    </w:p>
+    <w:p>
+      <w:pPr>
+        <w:spacing w:after="240" w:line="276" w:lineRule="auto"/>
         <w:jc w:val="left"/>
         <w:rPr>
           <w:rFonts w:ascii="Times New Roman" w:eastAsiaTheme="minorHAnsi" w:hAnsi="Times New Roman" w:cs="Times New Roman"/>
@@ -3158,7 +3202,6 @@
           <w:sz w:val="24"/>
           <w:szCs w:val="20"/>
         </w:rPr>
-        <w:lastRenderedPageBreak/>
         <w:t>AI</w:t>
       </w:r>
       <w:r>
@@ -3862,6 +3905,7 @@
         </w:rPr>
         <w:t xml:space="preserve">Divide and </w:t>
       </w:r>
+      <w:proofErr w:type="gramStart"/>
       <w:r>
         <w:rPr>
           <w:rFonts w:ascii="Times New Roman" w:eastAsiaTheme="minorHAnsi" w:hAnsi="Times New Roman" w:cs="Times New Roman"/>
@@ -3876,7 +3920,16 @@
           <w:sz w:val="24"/>
           <w:szCs w:val="20"/>
         </w:rPr>
-        <w:t xml:space="preserve">onquer? How </w:t>
+        <w:t>onquer</w:t>
+      </w:r>
+      <w:proofErr w:type="gramEnd"/>
+      <w:r>
+        <w:rPr>
+          <w:rFonts w:ascii="Times New Roman" w:eastAsiaTheme="minorHAnsi" w:hAnsi="Times New Roman" w:cs="Times New Roman"/>
+          <w:sz w:val="24"/>
+          <w:szCs w:val="20"/>
+        </w:rPr>
+        <w:t xml:space="preserve">? How </w:t>
       </w:r>
       <w:r>
         <w:rPr>
@@ -4110,7 +4163,25 @@
           <w:sz w:val="24"/>
           <w:szCs w:val="20"/>
         </w:rPr>
-        <w:t>” American Sociological Association Methodology Section Mid-year Meeting, Philadelphia, PA.</w:t>
+        <w:t>” American Sociological Association Methodology Section Mid-</w:t>
+      </w:r>
+      <w:proofErr w:type="gramStart"/>
+      <w:r>
+        <w:rPr>
+          <w:rFonts w:ascii="Times New Roman" w:eastAsiaTheme="minorHAnsi" w:hAnsi="Times New Roman" w:cs="Times New Roman"/>
+          <w:sz w:val="24"/>
+          <w:szCs w:val="20"/>
+        </w:rPr>
+        <w:t>year</w:t>
+      </w:r>
+      <w:proofErr w:type="gramEnd"/>
+      <w:r>
+        <w:rPr>
+          <w:rFonts w:ascii="Times New Roman" w:eastAsiaTheme="minorHAnsi" w:hAnsi="Times New Roman" w:cs="Times New Roman"/>
+          <w:sz w:val="24"/>
+          <w:szCs w:val="20"/>
+        </w:rPr>
+        <w:t xml:space="preserve"> Meeting, Philadelphia, PA.</w:t>
       </w:r>
     </w:p>
     <w:p>
@@ -4476,8 +4547,18 @@
           <w:sz w:val="24"/>
           <w:szCs w:val="20"/>
         </w:rPr>
-        <w:t>International Society for Scientometrics</w:t>
-      </w:r>
+        <w:t xml:space="preserve">International Society for </w:t>
+      </w:r>
+      <w:proofErr w:type="spellStart"/>
+      <w:r>
+        <w:rPr>
+          <w:rFonts w:ascii="Times New Roman" w:eastAsiaTheme="minorHAnsi" w:hAnsi="Times New Roman" w:cs="Times New Roman"/>
+          <w:sz w:val="24"/>
+          <w:szCs w:val="20"/>
+        </w:rPr>
+        <w:t>Scientometrics</w:t>
+      </w:r>
+      <w:proofErr w:type="spellEnd"/>
       <w:r>
         <w:rPr>
           <w:rFonts w:ascii="Times New Roman" w:eastAsiaTheme="minorHAnsi" w:hAnsi="Times New Roman" w:cs="Times New Roman"/>
@@ -4492,8 +4573,18 @@
           <w:sz w:val="24"/>
           <w:szCs w:val="20"/>
         </w:rPr>
-        <w:t>and Informetrics</w:t>
-      </w:r>
+        <w:t xml:space="preserve">and </w:t>
+      </w:r>
+      <w:proofErr w:type="spellStart"/>
+      <w:r>
+        <w:rPr>
+          <w:rFonts w:ascii="Times New Roman" w:eastAsiaTheme="minorHAnsi" w:hAnsi="Times New Roman" w:cs="Times New Roman"/>
+          <w:sz w:val="24"/>
+          <w:szCs w:val="20"/>
+        </w:rPr>
+        <w:t>Informetrics</w:t>
+      </w:r>
+      <w:proofErr w:type="spellEnd"/>
       <w:r>
         <w:rPr>
           <w:rFonts w:ascii="Times New Roman" w:eastAsiaTheme="minorHAnsi" w:hAnsi="Times New Roman" w:cs="Times New Roman"/>
@@ -4852,7 +4943,6 @@
           <w:sz w:val="24"/>
           <w:szCs w:val="20"/>
         </w:rPr>
-        <w:lastRenderedPageBreak/>
         <w:t>Consecration of Korean Writers, 1960–2000,” 112</w:t>
       </w:r>
       <w:r>
@@ -5935,7 +6025,25 @@
           <w:sz w:val="24"/>
           <w:szCs w:val="20"/>
         </w:rPr>
-        <w:t>Introduction to Social Statistics (In-Person, Fall 2024</w:t>
+        <w:t xml:space="preserve">Introduction to Social Statistics (In-Person, </w:t>
+      </w:r>
+      <w:proofErr w:type="gramStart"/>
+      <w:r>
+        <w:rPr>
+          <w:rFonts w:ascii="Times New Roman" w:eastAsia="함초롬바탕" w:hAnsi="Times New Roman" w:cs="Times New Roman"/>
+          <w:sz w:val="24"/>
+          <w:szCs w:val="20"/>
+        </w:rPr>
+        <w:t>Fall</w:t>
+      </w:r>
+      <w:proofErr w:type="gramEnd"/>
+      <w:r>
+        <w:rPr>
+          <w:rFonts w:ascii="Times New Roman" w:eastAsia="함초롬바탕" w:hAnsi="Times New Roman" w:cs="Times New Roman"/>
+          <w:sz w:val="24"/>
+          <w:szCs w:val="20"/>
+        </w:rPr>
+        <w:t xml:space="preserve"> 2024</w:t>
       </w:r>
       <w:r>
         <w:rPr>
@@ -6147,6 +6255,7 @@
           <w:sz w:val="24"/>
           <w:szCs w:val="20"/>
         </w:rPr>
+        <w:lastRenderedPageBreak/>
         <w:t>Workshops &amp; Guest Lectures</w:t>
       </w:r>
     </w:p>
@@ -6168,6 +6277,7 @@
         </w:rPr>
         <w:t xml:space="preserve">2026 </w:t>
       </w:r>
+      <w:proofErr w:type="gramStart"/>
       <w:r>
         <w:rPr>
           <w:rFonts w:ascii="Times New Roman" w:eastAsia="함초롬바탕" w:hAnsi="Times New Roman" w:cs="Times New Roman" w:hint="eastAsia"/>
@@ -6192,6 +6302,7 @@
         </w:rPr>
         <w:t>“</w:t>
       </w:r>
+      <w:proofErr w:type="gramEnd"/>
       <w:r>
         <w:rPr>
           <w:rFonts w:ascii="Times New Roman" w:eastAsia="함초롬바탕" w:hAnsi="Times New Roman" w:cs="Times New Roman"/>
@@ -6238,7 +6349,6 @@
           <w:sz w:val="24"/>
           <w:szCs w:val="20"/>
         </w:rPr>
-        <w:lastRenderedPageBreak/>
         <w:t xml:space="preserve"> </w:t>
       </w:r>
       <w:r>
@@ -7883,7 +7993,16 @@
           <w:sz w:val="24"/>
           <w:szCs w:val="24"/>
         </w:rPr>
-        <w:t>Committee in the School of Sociology</w:t>
+        <w:t xml:space="preserve">Committee in the School of </w:t>
+      </w:r>
+      <w:r>
+        <w:rPr>
+          <w:rFonts w:ascii="Times New Roman" w:eastAsiaTheme="minorHAnsi" w:hAnsi="Times New Roman" w:cs="Times New Roman"/>
+          <w:sz w:val="24"/>
+          <w:szCs w:val="24"/>
+        </w:rPr>
+        <w:lastRenderedPageBreak/>
+        <w:t>Sociology</w:t>
       </w:r>
       <w:r>
         <w:rPr>

</xml_diff>

<commit_message>
Manual CV update: 2026-04-28 17:05:47 CDT
</commit_message>
<xml_diff>
--- a/public/cv.docx
+++ b/public/cv.docx
@@ -2622,15 +2622,7 @@
           <w:sz w:val="24"/>
           <w:szCs w:val="20"/>
         </w:rPr>
-        <w:t xml:space="preserve"> </w:t>
-      </w:r>
-      <w:r>
-        <w:rPr>
-          <w:rFonts w:ascii="Times New Roman" w:eastAsiaTheme="minorHAnsi" w:hAnsi="Times New Roman" w:cs="Times New Roman"/>
-          <w:sz w:val="24"/>
-          <w:szCs w:val="20"/>
-        </w:rPr>
-        <w:t>[In progress]</w:t>
+        <w:t xml:space="preserve"> [In progress]</w:t>
       </w:r>
     </w:p>
     <w:p>
@@ -5072,7 +5064,7 @@
           <w:sz w:val="24"/>
           <w:szCs w:val="24"/>
         </w:rPr>
-        <w:t>Key Personnel</w:t>
+        <w:t>Consultant</w:t>
       </w:r>
       <w:r>
         <w:rPr>

</xml_diff>

<commit_message>
Manual CV update: 2026-04-28 17:08:06 CDT
</commit_message>
<xml_diff>
--- a/public/cv.docx
+++ b/public/cv.docx
@@ -1105,6 +1105,14 @@
           <w:szCs w:val="20"/>
         </w:rPr>
         <w:t>Novelty Claims and Gender Gaps in Scientific Impact Across Disciplines</w:t>
+      </w:r>
+      <w:r>
+        <w:rPr>
+          <w:rFonts w:ascii="Times New Roman" w:eastAsiaTheme="minorHAnsi" w:hAnsi="Times New Roman" w:cs="Times New Roman"/>
+          <w:sz w:val="24"/>
+          <w:szCs w:val="20"/>
+        </w:rPr>
+        <w:t>.</w:t>
       </w:r>
       <w:r>
         <w:rPr>

</xml_diff>

<commit_message>
Manual CV update: 2026-04-28 19:03:52 CDT
</commit_message>
<xml_diff>
--- a/public/cv.docx
+++ b/public/cv.docx
@@ -1030,6 +1030,29 @@
     <w:p>
       <w:pPr>
         <w:spacing w:before="240" w:after="240" w:line="276" w:lineRule="auto"/>
+        <w:jc w:val="left"/>
+        <w:rPr>
+          <w:rFonts w:ascii="Times New Roman" w:eastAsiaTheme="minorHAnsi" w:hAnsi="Times New Roman" w:cs="Times New Roman"/>
+          <w:i/>
+          <w:iCs/>
+          <w:sz w:val="24"/>
+          <w:szCs w:val="20"/>
+        </w:rPr>
+      </w:pPr>
+      <w:r>
+        <w:rPr>
+          <w:rFonts w:ascii="Times New Roman" w:eastAsiaTheme="minorHAnsi" w:hAnsi="Times New Roman" w:cs="Times New Roman"/>
+          <w:i/>
+          <w:iCs/>
+          <w:sz w:val="24"/>
+          <w:szCs w:val="20"/>
+        </w:rPr>
+        <w:t>Journal Articles</w:t>
+      </w:r>
+    </w:p>
+    <w:p>
+      <w:pPr>
+        <w:spacing w:before="240" w:after="240" w:line="276" w:lineRule="auto"/>
         <w:ind w:left="1600" w:hanging="1600"/>
         <w:jc w:val="left"/>
         <w:rPr>
@@ -1614,6 +1637,7 @@
           <w:sz w:val="24"/>
           <w:szCs w:val="20"/>
         </w:rPr>
+        <w:lastRenderedPageBreak/>
         <w:t>2022</w:t>
       </w:r>
       <w:r>
@@ -1722,7 +1746,6 @@
           <w:sz w:val="24"/>
           <w:szCs w:val="20"/>
         </w:rPr>
-        <w:lastRenderedPageBreak/>
         <w:t xml:space="preserve">Naming Potential Beneficiaries Influences </w:t>
       </w:r>
       <w:r>
@@ -2033,6 +2056,173 @@
     </w:p>
     <w:p>
       <w:pPr>
+        <w:spacing w:before="240" w:after="240" w:line="276" w:lineRule="auto"/>
+        <w:jc w:val="left"/>
+        <w:rPr>
+          <w:rFonts w:ascii="Times New Roman" w:eastAsiaTheme="minorHAnsi" w:hAnsi="Times New Roman" w:cs="Times New Roman"/>
+          <w:i/>
+          <w:iCs/>
+          <w:sz w:val="24"/>
+          <w:szCs w:val="20"/>
+        </w:rPr>
+      </w:pPr>
+      <w:r>
+        <w:rPr>
+          <w:rFonts w:ascii="Times New Roman" w:eastAsiaTheme="minorHAnsi" w:hAnsi="Times New Roman" w:cs="Times New Roman"/>
+          <w:i/>
+          <w:iCs/>
+          <w:sz w:val="24"/>
+          <w:szCs w:val="20"/>
+        </w:rPr>
+        <w:t>Book Chapters</w:t>
+      </w:r>
+    </w:p>
+    <w:p>
+      <w:pPr>
+        <w:spacing w:after="240" w:line="276" w:lineRule="auto"/>
+        <w:ind w:left="1600" w:hanging="1600"/>
+        <w:jc w:val="left"/>
+        <w:rPr>
+          <w:rFonts w:ascii="Times New Roman" w:eastAsiaTheme="minorHAnsi" w:hAnsi="Times New Roman" w:cs="Times New Roman"/>
+          <w:sz w:val="24"/>
+          <w:szCs w:val="20"/>
+        </w:rPr>
+      </w:pPr>
+      <w:r>
+        <w:rPr>
+          <w:rFonts w:ascii="Times New Roman" w:eastAsiaTheme="minorHAnsi" w:hAnsi="Times New Roman" w:cs="Times New Roman"/>
+          <w:sz w:val="24"/>
+          <w:szCs w:val="20"/>
+        </w:rPr>
+        <w:t>Forthcoming</w:t>
+      </w:r>
+      <w:r>
+        <w:rPr>
+          <w:rFonts w:ascii="Times New Roman" w:eastAsiaTheme="minorHAnsi" w:hAnsi="Times New Roman" w:cs="Times New Roman"/>
+          <w:sz w:val="24"/>
+          <w:szCs w:val="20"/>
+        </w:rPr>
+        <w:tab/>
+      </w:r>
+      <w:r>
+        <w:rPr>
+          <w:rFonts w:ascii="Times New Roman" w:eastAsiaTheme="minorHAnsi" w:hAnsi="Times New Roman" w:cs="Times New Roman"/>
+          <w:sz w:val="24"/>
+          <w:szCs w:val="20"/>
+        </w:rPr>
+        <w:t xml:space="preserve">Lassiter, Charles, Sarah Bratt, Erin Leahey, Charlie Gomez, </w:t>
+      </w:r>
+      <w:r>
+        <w:rPr>
+          <w:rFonts w:ascii="Times New Roman" w:eastAsiaTheme="minorHAnsi" w:hAnsi="Times New Roman" w:cs="Times New Roman"/>
+          <w:b/>
+          <w:bCs/>
+          <w:sz w:val="24"/>
+          <w:szCs w:val="20"/>
+        </w:rPr>
+        <w:t>Jina Lee</w:t>
+      </w:r>
+      <w:r>
+        <w:rPr>
+          <w:rFonts w:ascii="Times New Roman" w:eastAsiaTheme="minorHAnsi" w:hAnsi="Times New Roman" w:cs="Times New Roman"/>
+          <w:sz w:val="24"/>
+          <w:szCs w:val="20"/>
+        </w:rPr>
+        <w:t xml:space="preserve">, and Yeaeun Kwon. </w:t>
+      </w:r>
+      <w:r>
+        <w:rPr>
+          <w:rFonts w:ascii="Times New Roman" w:eastAsiaTheme="minorHAnsi" w:hAnsi="Times New Roman" w:cs="Times New Roman"/>
+          <w:sz w:val="24"/>
+          <w:szCs w:val="20"/>
+        </w:rPr>
+        <w:t>“</w:t>
+      </w:r>
+      <w:r>
+        <w:rPr>
+          <w:rFonts w:ascii="Times New Roman" w:eastAsiaTheme="minorHAnsi" w:hAnsi="Times New Roman" w:cs="Times New Roman"/>
+          <w:sz w:val="24"/>
+          <w:szCs w:val="20"/>
+        </w:rPr>
+        <w:t>Humble Reflections on the Intellectual Process of Developing a Text-based Measure of Humility in Inquiry.</w:t>
+      </w:r>
+      <w:r>
+        <w:rPr>
+          <w:rFonts w:ascii="Times New Roman" w:eastAsiaTheme="minorHAnsi" w:hAnsi="Times New Roman" w:cs="Times New Roman"/>
+          <w:sz w:val="24"/>
+          <w:szCs w:val="20"/>
+        </w:rPr>
+        <w:t>”</w:t>
+      </w:r>
+      <w:r>
+        <w:rPr>
+          <w:rFonts w:ascii="Times New Roman" w:eastAsiaTheme="minorHAnsi" w:hAnsi="Times New Roman" w:cs="Times New Roman"/>
+          <w:sz w:val="24"/>
+          <w:szCs w:val="20"/>
+        </w:rPr>
+        <w:t xml:space="preserve"> in </w:t>
+      </w:r>
+      <w:r>
+        <w:rPr>
+          <w:rFonts w:ascii="Times New Roman" w:eastAsiaTheme="minorHAnsi" w:hAnsi="Times New Roman" w:cs="Times New Roman"/>
+          <w:i/>
+          <w:iCs/>
+          <w:sz w:val="24"/>
+          <w:szCs w:val="20"/>
+        </w:rPr>
+        <w:t>Humble Inquiry: New Perspectives on Intellectual Humility</w:t>
+      </w:r>
+      <w:r>
+        <w:rPr>
+          <w:rFonts w:ascii="Times New Roman" w:eastAsiaTheme="minorHAnsi" w:hAnsi="Times New Roman" w:cs="Times New Roman"/>
+          <w:sz w:val="24"/>
+          <w:szCs w:val="20"/>
+        </w:rPr>
+        <w:t xml:space="preserve"> </w:t>
+      </w:r>
+      <w:r>
+        <w:rPr>
+          <w:rFonts w:ascii="Times New Roman" w:eastAsiaTheme="minorHAnsi" w:hAnsi="Times New Roman" w:cs="Times New Roman"/>
+          <w:sz w:val="24"/>
+          <w:szCs w:val="20"/>
+        </w:rPr>
+        <w:t xml:space="preserve">edited by Nathan Ballantyne, Jared Celniker, and Norbert Schwartz. </w:t>
+      </w:r>
+      <w:r>
+        <w:rPr>
+          <w:rFonts w:ascii="Times New Roman" w:eastAsiaTheme="minorHAnsi" w:hAnsi="Times New Roman" w:cs="Times New Roman"/>
+          <w:sz w:val="24"/>
+          <w:szCs w:val="20"/>
+        </w:rPr>
+        <w:t>Cambridge U</w:t>
+      </w:r>
+      <w:r>
+        <w:rPr>
+          <w:rFonts w:ascii="Times New Roman" w:eastAsiaTheme="minorHAnsi" w:hAnsi="Times New Roman" w:cs="Times New Roman"/>
+          <w:sz w:val="24"/>
+          <w:szCs w:val="20"/>
+        </w:rPr>
+        <w:t xml:space="preserve">niversity </w:t>
+      </w:r>
+      <w:r>
+        <w:rPr>
+          <w:rFonts w:ascii="Times New Roman" w:eastAsiaTheme="minorHAnsi" w:hAnsi="Times New Roman" w:cs="Times New Roman"/>
+          <w:sz w:val="24"/>
+          <w:szCs w:val="20"/>
+        </w:rPr>
+        <w:t>P</w:t>
+      </w:r>
+      <w:r>
+        <w:rPr>
+          <w:rFonts w:ascii="Times New Roman" w:eastAsiaTheme="minorHAnsi" w:hAnsi="Times New Roman" w:cs="Times New Roman"/>
+          <w:sz w:val="24"/>
+          <w:szCs w:val="20"/>
+        </w:rPr>
+        <w:t>ress.</w:t>
+      </w:r>
+    </w:p>
+    <w:p>
+      <w:pPr>
         <w:spacing w:after="240" w:line="276" w:lineRule="auto"/>
         <w:jc w:val="left"/>
         <w:rPr>
@@ -2237,7 +2427,6 @@
         </w:rPr>
         <w:t xml:space="preserve">Divide and </w:t>
       </w:r>
-      <w:proofErr w:type="gramStart"/>
       <w:r>
         <w:rPr>
           <w:rFonts w:ascii="Times New Roman" w:eastAsiaTheme="minorHAnsi" w:hAnsi="Times New Roman" w:cs="Times New Roman"/>
@@ -2252,16 +2441,7 @@
           <w:sz w:val="24"/>
           <w:szCs w:val="20"/>
         </w:rPr>
-        <w:t>onquer</w:t>
-      </w:r>
-      <w:proofErr w:type="gramEnd"/>
-      <w:r>
-        <w:rPr>
-          <w:rFonts w:ascii="Times New Roman" w:eastAsiaTheme="minorHAnsi" w:hAnsi="Times New Roman" w:cs="Times New Roman"/>
-          <w:sz w:val="24"/>
-          <w:szCs w:val="20"/>
-        </w:rPr>
-        <w:t xml:space="preserve">? How </w:t>
+        <w:t xml:space="preserve">onquer? How </w:t>
       </w:r>
       <w:r>
         <w:rPr>
@@ -2511,25 +2691,7 @@
           <w:sz w:val="24"/>
           <w:szCs w:val="20"/>
         </w:rPr>
-        <w:t xml:space="preserve"> </w:t>
-      </w:r>
-      <w:proofErr w:type="spellStart"/>
-      <w:r>
-        <w:rPr>
-          <w:rFonts w:ascii="Times New Roman" w:eastAsiaTheme="minorHAnsi" w:hAnsi="Times New Roman" w:cs="Times New Roman"/>
-          <w:sz w:val="24"/>
-          <w:szCs w:val="20"/>
-        </w:rPr>
-        <w:t>Zhuofan</w:t>
-      </w:r>
-      <w:proofErr w:type="spellEnd"/>
-      <w:r>
-        <w:rPr>
-          <w:rFonts w:ascii="Times New Roman" w:eastAsiaTheme="minorHAnsi" w:hAnsi="Times New Roman" w:cs="Times New Roman"/>
-          <w:sz w:val="24"/>
-          <w:szCs w:val="20"/>
-        </w:rPr>
-        <w:t xml:space="preserve"> Li. “</w:t>
+        <w:t xml:space="preserve"> Zhuofan Li. “</w:t>
       </w:r>
       <w:r>
         <w:rPr>
@@ -2891,7 +3053,16 @@
           <w:sz w:val="24"/>
           <w:szCs w:val="20"/>
         </w:rPr>
-        <w:t>Association for Korean Sociologists in America, University of Illinois at Chicago, Chicago, IL.</w:t>
+        <w:t xml:space="preserve">Association for Korean Sociologists in America, </w:t>
+      </w:r>
+      <w:r>
+        <w:rPr>
+          <w:rFonts w:ascii="Times New Roman" w:eastAsiaTheme="minorHAnsi" w:hAnsi="Times New Roman" w:cs="Times New Roman"/>
+          <w:sz w:val="24"/>
+          <w:szCs w:val="20"/>
+        </w:rPr>
+        <w:lastRenderedPageBreak/>
+        <w:t>University of Illinois at Chicago, Chicago, IL.</w:t>
       </w:r>
     </w:p>
     <w:p>
@@ -3905,7 +4076,6 @@
         </w:rPr>
         <w:t xml:space="preserve">Divide and </w:t>
       </w:r>
-      <w:proofErr w:type="gramStart"/>
       <w:r>
         <w:rPr>
           <w:rFonts w:ascii="Times New Roman" w:eastAsiaTheme="minorHAnsi" w:hAnsi="Times New Roman" w:cs="Times New Roman"/>
@@ -3920,16 +4090,7 @@
           <w:sz w:val="24"/>
           <w:szCs w:val="20"/>
         </w:rPr>
-        <w:t>onquer</w:t>
-      </w:r>
-      <w:proofErr w:type="gramEnd"/>
-      <w:r>
-        <w:rPr>
-          <w:rFonts w:ascii="Times New Roman" w:eastAsiaTheme="minorHAnsi" w:hAnsi="Times New Roman" w:cs="Times New Roman"/>
-          <w:sz w:val="24"/>
-          <w:szCs w:val="20"/>
-        </w:rPr>
-        <w:t xml:space="preserve">? How </w:t>
+        <w:t xml:space="preserve">onquer? How </w:t>
       </w:r>
       <w:r>
         <w:rPr>
@@ -4163,25 +4324,7 @@
           <w:sz w:val="24"/>
           <w:szCs w:val="20"/>
         </w:rPr>
-        <w:t>” American Sociological Association Methodology Section Mid-</w:t>
-      </w:r>
-      <w:proofErr w:type="gramStart"/>
-      <w:r>
-        <w:rPr>
-          <w:rFonts w:ascii="Times New Roman" w:eastAsiaTheme="minorHAnsi" w:hAnsi="Times New Roman" w:cs="Times New Roman"/>
-          <w:sz w:val="24"/>
-          <w:szCs w:val="20"/>
-        </w:rPr>
-        <w:t>year</w:t>
-      </w:r>
-      <w:proofErr w:type="gramEnd"/>
-      <w:r>
-        <w:rPr>
-          <w:rFonts w:ascii="Times New Roman" w:eastAsiaTheme="minorHAnsi" w:hAnsi="Times New Roman" w:cs="Times New Roman"/>
-          <w:sz w:val="24"/>
-          <w:szCs w:val="20"/>
-        </w:rPr>
-        <w:t xml:space="preserve"> Meeting, Philadelphia, PA.</w:t>
+        <w:t>” American Sociological Association Methodology Section Mid-year Meeting, Philadelphia, PA.</w:t>
       </w:r>
     </w:p>
     <w:p>
@@ -4318,6 +4461,7 @@
           <w:sz w:val="24"/>
           <w:szCs w:val="20"/>
         </w:rPr>
+        <w:lastRenderedPageBreak/>
         <w:t>2023</w:t>
       </w:r>
       <w:r>
@@ -4547,18 +4691,8 @@
           <w:sz w:val="24"/>
           <w:szCs w:val="20"/>
         </w:rPr>
-        <w:t xml:space="preserve">International Society for </w:t>
-      </w:r>
-      <w:proofErr w:type="spellStart"/>
-      <w:r>
-        <w:rPr>
-          <w:rFonts w:ascii="Times New Roman" w:eastAsiaTheme="minorHAnsi" w:hAnsi="Times New Roman" w:cs="Times New Roman"/>
-          <w:sz w:val="24"/>
-          <w:szCs w:val="20"/>
-        </w:rPr>
-        <w:t>Scientometrics</w:t>
-      </w:r>
-      <w:proofErr w:type="spellEnd"/>
+        <w:t>International Society for Scientometrics</w:t>
+      </w:r>
       <w:r>
         <w:rPr>
           <w:rFonts w:ascii="Times New Roman" w:eastAsiaTheme="minorHAnsi" w:hAnsi="Times New Roman" w:cs="Times New Roman"/>
@@ -4573,18 +4707,8 @@
           <w:sz w:val="24"/>
           <w:szCs w:val="20"/>
         </w:rPr>
-        <w:t xml:space="preserve">and </w:t>
-      </w:r>
-      <w:proofErr w:type="spellStart"/>
-      <w:r>
-        <w:rPr>
-          <w:rFonts w:ascii="Times New Roman" w:eastAsiaTheme="minorHAnsi" w:hAnsi="Times New Roman" w:cs="Times New Roman"/>
-          <w:sz w:val="24"/>
-          <w:szCs w:val="20"/>
-        </w:rPr>
-        <w:t>Informetrics</w:t>
-      </w:r>
-      <w:proofErr w:type="spellEnd"/>
+        <w:t>and Informetrics</w:t>
+      </w:r>
       <w:r>
         <w:rPr>
           <w:rFonts w:ascii="Times New Roman" w:eastAsiaTheme="minorHAnsi" w:hAnsi="Times New Roman" w:cs="Times New Roman"/>
@@ -6025,25 +6149,8 @@
           <w:sz w:val="24"/>
           <w:szCs w:val="20"/>
         </w:rPr>
-        <w:t xml:space="preserve">Introduction to Social Statistics (In-Person, </w:t>
-      </w:r>
-      <w:proofErr w:type="gramStart"/>
-      <w:r>
-        <w:rPr>
-          <w:rFonts w:ascii="Times New Roman" w:eastAsia="함초롬바탕" w:hAnsi="Times New Roman" w:cs="Times New Roman"/>
-          <w:sz w:val="24"/>
-          <w:szCs w:val="20"/>
-        </w:rPr>
-        <w:t>Fall</w:t>
-      </w:r>
-      <w:proofErr w:type="gramEnd"/>
-      <w:r>
-        <w:rPr>
-          <w:rFonts w:ascii="Times New Roman" w:eastAsia="함초롬바탕" w:hAnsi="Times New Roman" w:cs="Times New Roman"/>
-          <w:sz w:val="24"/>
-          <w:szCs w:val="20"/>
-        </w:rPr>
-        <w:t xml:space="preserve"> 2024</w:t>
+        <w:lastRenderedPageBreak/>
+        <w:t>Introduction to Social Statistics (In-Person, Fall 2024</w:t>
       </w:r>
       <w:r>
         <w:rPr>
@@ -6255,7 +6362,6 @@
           <w:sz w:val="24"/>
           <w:szCs w:val="20"/>
         </w:rPr>
-        <w:lastRenderedPageBreak/>
         <w:t>Workshops &amp; Guest Lectures</w:t>
       </w:r>
     </w:p>
@@ -6277,7 +6383,6 @@
         </w:rPr>
         <w:t xml:space="preserve">2026 </w:t>
       </w:r>
-      <w:proofErr w:type="gramStart"/>
       <w:r>
         <w:rPr>
           <w:rFonts w:ascii="Times New Roman" w:eastAsia="함초롬바탕" w:hAnsi="Times New Roman" w:cs="Times New Roman" w:hint="eastAsia"/>
@@ -6302,7 +6407,6 @@
         </w:rPr>
         <w:t>“</w:t>
       </w:r>
-      <w:proofErr w:type="gramEnd"/>
       <w:r>
         <w:rPr>
           <w:rFonts w:ascii="Times New Roman" w:eastAsia="함초롬바탕" w:hAnsi="Times New Roman" w:cs="Times New Roman"/>
@@ -6834,6 +6938,20 @@
           <w:szCs w:val="24"/>
         </w:rPr>
       </w:pPr>
+    </w:p>
+    <w:p>
+      <w:pPr>
+        <w:spacing w:line="276" w:lineRule="auto"/>
+        <w:ind w:left="1600" w:hanging="1600"/>
+        <w:jc w:val="left"/>
+        <w:rPr>
+          <w:rFonts w:ascii="Times New Roman" w:eastAsiaTheme="minorHAnsi" w:hAnsi="Times New Roman" w:cs="Times New Roman"/>
+          <w:b/>
+          <w:bCs/>
+          <w:sz w:val="24"/>
+          <w:szCs w:val="24"/>
+        </w:rPr>
+      </w:pPr>
       <w:r>
         <w:rPr>
           <w:rFonts w:ascii="Times New Roman" w:eastAsiaTheme="minorHAnsi" w:hAnsi="Times New Roman" w:cs="Times New Roman" w:hint="eastAsia"/>
@@ -7340,13 +7458,20 @@
         <w:jc w:val="left"/>
         <w:rPr>
           <w:rFonts w:ascii="Times New Roman" w:hAnsi="Times New Roman" w:cs="Times New Roman"/>
+          <w:b/>
+          <w:bCs/>
           <w:color w:val="000000"/>
           <w:sz w:val="24"/>
           <w:szCs w:val="24"/>
           <w:shd w:val="clear" w:color="auto" w:fill="FFFFFF"/>
         </w:rPr>
       </w:pPr>
-      <w:r>
+    </w:p>
+    <w:p>
+      <w:pPr>
+        <w:spacing w:line="276" w:lineRule="auto"/>
+        <w:ind w:left="1600" w:hanging="1600"/>
+        <w:jc w:val="left"/>
         <w:rPr>
           <w:rFonts w:ascii="Times New Roman" w:hAnsi="Times New Roman" w:cs="Times New Roman"/>
           <w:color w:val="000000"/>
@@ -7354,16 +7479,7 @@
           <w:szCs w:val="24"/>
           <w:shd w:val="clear" w:color="auto" w:fill="FFFFFF"/>
         </w:rPr>
-        <w:t xml:space="preserve">2025 </w:t>
-      </w:r>
-      <w:r>
-        <w:rPr>
-          <w:rFonts w:ascii="Times New Roman" w:eastAsiaTheme="minorHAnsi" w:hAnsi="Times New Roman" w:cs="Times New Roman"/>
-          <w:sz w:val="24"/>
-          <w:szCs w:val="24"/>
-        </w:rPr>
-        <w:t>–</w:t>
-      </w:r>
+      </w:pPr>
       <w:r>
         <w:rPr>
           <w:rFonts w:ascii="Times New Roman" w:hAnsi="Times New Roman" w:cs="Times New Roman"/>
@@ -7372,7 +7488,15 @@
           <w:szCs w:val="24"/>
           <w:shd w:val="clear" w:color="auto" w:fill="FFFFFF"/>
         </w:rPr>
-        <w:t xml:space="preserve"> 2026</w:t>
+        <w:t xml:space="preserve">2025 </w:t>
+      </w:r>
+      <w:r>
+        <w:rPr>
+          <w:rFonts w:ascii="Times New Roman" w:eastAsiaTheme="minorHAnsi" w:hAnsi="Times New Roman" w:cs="Times New Roman"/>
+          <w:sz w:val="24"/>
+          <w:szCs w:val="24"/>
+        </w:rPr>
+        <w:t>–</w:t>
       </w:r>
       <w:r>
         <w:rPr>
@@ -7382,6 +7506,16 @@
           <w:szCs w:val="24"/>
           <w:shd w:val="clear" w:color="auto" w:fill="FFFFFF"/>
         </w:rPr>
+        <w:t xml:space="preserve"> 2026</w:t>
+      </w:r>
+      <w:r>
+        <w:rPr>
+          <w:rFonts w:ascii="Times New Roman" w:hAnsi="Times New Roman" w:cs="Times New Roman"/>
+          <w:color w:val="000000"/>
+          <w:sz w:val="24"/>
+          <w:szCs w:val="24"/>
+          <w:shd w:val="clear" w:color="auto" w:fill="FFFFFF"/>
+        </w:rPr>
         <w:tab/>
       </w:r>
       <w:r>
@@ -7518,7 +7652,16 @@
           <w:sz w:val="24"/>
           <w:szCs w:val="24"/>
         </w:rPr>
-        <w:t xml:space="preserve"> of Sociology at the University of Illinois at Urbana-Champaign</w:t>
+        <w:t xml:space="preserve"> of Sociology at the University of </w:t>
+      </w:r>
+      <w:r>
+        <w:rPr>
+          <w:rFonts w:ascii="Times New Roman" w:eastAsiaTheme="minorHAnsi" w:hAnsi="Times New Roman" w:cs="Times New Roman" w:hint="eastAsia"/>
+          <w:sz w:val="24"/>
+          <w:szCs w:val="24"/>
+        </w:rPr>
+        <w:lastRenderedPageBreak/>
+        <w:t>Illinois at Urbana-Champaign</w:t>
       </w:r>
       <w:r>
         <w:rPr>
@@ -7690,13 +7833,20 @@
         <w:jc w:val="left"/>
         <w:rPr>
           <w:rFonts w:ascii="Times New Roman" w:hAnsi="Times New Roman" w:cs="Times New Roman"/>
+          <w:b/>
+          <w:bCs/>
           <w:color w:val="000000"/>
           <w:sz w:val="24"/>
           <w:szCs w:val="24"/>
           <w:shd w:val="clear" w:color="auto" w:fill="FFFFFF"/>
         </w:rPr>
       </w:pPr>
-      <w:r>
+    </w:p>
+    <w:p>
+      <w:pPr>
+        <w:spacing w:line="276" w:lineRule="auto"/>
+        <w:ind w:left="1600" w:hanging="1600"/>
+        <w:jc w:val="left"/>
         <w:rPr>
           <w:rFonts w:ascii="Times New Roman" w:hAnsi="Times New Roman" w:cs="Times New Roman"/>
           <w:color w:val="000000"/>
@@ -7704,8 +7854,7 @@
           <w:szCs w:val="24"/>
           <w:shd w:val="clear" w:color="auto" w:fill="FFFFFF"/>
         </w:rPr>
-        <w:t>2022</w:t>
-      </w:r>
+      </w:pPr>
       <w:r>
         <w:rPr>
           <w:rFonts w:ascii="Times New Roman" w:hAnsi="Times New Roman" w:cs="Times New Roman"/>
@@ -7714,15 +7863,7 @@
           <w:szCs w:val="24"/>
           <w:shd w:val="clear" w:color="auto" w:fill="FFFFFF"/>
         </w:rPr>
-        <w:t xml:space="preserve"> </w:t>
-      </w:r>
-      <w:r>
-        <w:rPr>
-          <w:rFonts w:ascii="Times New Roman" w:eastAsiaTheme="minorHAnsi" w:hAnsi="Times New Roman" w:cs="Times New Roman"/>
-          <w:sz w:val="24"/>
-          <w:szCs w:val="24"/>
-        </w:rPr>
-        <w:t>–</w:t>
+        <w:t>2022</w:t>
       </w:r>
       <w:r>
         <w:rPr>
@@ -7732,7 +7873,15 @@
           <w:szCs w:val="24"/>
           <w:shd w:val="clear" w:color="auto" w:fill="FFFFFF"/>
         </w:rPr>
-        <w:t xml:space="preserve"> 2023</w:t>
+        <w:t xml:space="preserve"> </w:t>
+      </w:r>
+      <w:r>
+        <w:rPr>
+          <w:rFonts w:ascii="Times New Roman" w:eastAsiaTheme="minorHAnsi" w:hAnsi="Times New Roman" w:cs="Times New Roman"/>
+          <w:sz w:val="24"/>
+          <w:szCs w:val="24"/>
+        </w:rPr>
+        <w:t>–</w:t>
       </w:r>
       <w:r>
         <w:rPr>
@@ -7742,6 +7891,16 @@
           <w:szCs w:val="24"/>
           <w:shd w:val="clear" w:color="auto" w:fill="FFFFFF"/>
         </w:rPr>
+        <w:t xml:space="preserve"> 2023</w:t>
+      </w:r>
+      <w:r>
+        <w:rPr>
+          <w:rFonts w:ascii="Times New Roman" w:hAnsi="Times New Roman" w:cs="Times New Roman"/>
+          <w:color w:val="000000"/>
+          <w:sz w:val="24"/>
+          <w:szCs w:val="24"/>
+          <w:shd w:val="clear" w:color="auto" w:fill="FFFFFF"/>
+        </w:rPr>
         <w:tab/>
       </w:r>
       <w:r>
@@ -7993,16 +8152,7 @@
           <w:sz w:val="24"/>
           <w:szCs w:val="24"/>
         </w:rPr>
-        <w:t xml:space="preserve">Committee in the School of </w:t>
-      </w:r>
-      <w:r>
-        <w:rPr>
-          <w:rFonts w:ascii="Times New Roman" w:eastAsiaTheme="minorHAnsi" w:hAnsi="Times New Roman" w:cs="Times New Roman"/>
-          <w:sz w:val="24"/>
-          <w:szCs w:val="24"/>
-        </w:rPr>
-        <w:lastRenderedPageBreak/>
-        <w:t>Sociology</w:t>
+        <w:t>Committee in the School of Sociology</w:t>
       </w:r>
       <w:r>
         <w:rPr>

</xml_diff>

<commit_message>
Manual CV update: 2026-04-28 20:22:00 CDT
</commit_message>
<xml_diff>
--- a/public/cv.docx
+++ b/public/cv.docx
@@ -2128,7 +2128,25 @@
           <w:sz w:val="24"/>
           <w:szCs w:val="20"/>
         </w:rPr>
-        <w:t xml:space="preserve">, and Yeaeun Kwon. </w:t>
+        <w:t xml:space="preserve">, and </w:t>
+      </w:r>
+      <w:proofErr w:type="spellStart"/>
+      <w:r>
+        <w:rPr>
+          <w:rFonts w:ascii="Times New Roman" w:eastAsiaTheme="minorHAnsi" w:hAnsi="Times New Roman" w:cs="Times New Roman"/>
+          <w:sz w:val="24"/>
+          <w:szCs w:val="20"/>
+        </w:rPr>
+        <w:t>Yeaeun</w:t>
+      </w:r>
+      <w:proofErr w:type="spellEnd"/>
+      <w:r>
+        <w:rPr>
+          <w:rFonts w:ascii="Times New Roman" w:eastAsiaTheme="minorHAnsi" w:hAnsi="Times New Roman" w:cs="Times New Roman"/>
+          <w:sz w:val="24"/>
+          <w:szCs w:val="20"/>
+        </w:rPr>
+        <w:t xml:space="preserve"> Kwon. </w:t>
       </w:r>
       <w:r>
         <w:rPr>
@@ -2160,7 +2178,23 @@
           <w:sz w:val="24"/>
           <w:szCs w:val="20"/>
         </w:rPr>
-        <w:t xml:space="preserve"> in </w:t>
+        <w:t xml:space="preserve"> </w:t>
+      </w:r>
+      <w:r>
+        <w:rPr>
+          <w:rFonts w:ascii="Times New Roman" w:eastAsiaTheme="minorHAnsi" w:hAnsi="Times New Roman" w:cs="Times New Roman"/>
+          <w:sz w:val="24"/>
+          <w:szCs w:val="20"/>
+        </w:rPr>
+        <w:t>I</w:t>
+      </w:r>
+      <w:r>
+        <w:rPr>
+          <w:rFonts w:ascii="Times New Roman" w:eastAsiaTheme="minorHAnsi" w:hAnsi="Times New Roman" w:cs="Times New Roman"/>
+          <w:sz w:val="24"/>
+          <w:szCs w:val="20"/>
+        </w:rPr>
+        <w:t xml:space="preserve">n </w:t>
       </w:r>
       <w:r>
         <w:rPr>
@@ -2427,6 +2461,7 @@
         </w:rPr>
         <w:t xml:space="preserve">Divide and </w:t>
       </w:r>
+      <w:proofErr w:type="gramStart"/>
       <w:r>
         <w:rPr>
           <w:rFonts w:ascii="Times New Roman" w:eastAsiaTheme="minorHAnsi" w:hAnsi="Times New Roman" w:cs="Times New Roman"/>
@@ -2441,7 +2476,16 @@
           <w:sz w:val="24"/>
           <w:szCs w:val="20"/>
         </w:rPr>
-        <w:t xml:space="preserve">onquer? How </w:t>
+        <w:t>onquer</w:t>
+      </w:r>
+      <w:proofErr w:type="gramEnd"/>
+      <w:r>
+        <w:rPr>
+          <w:rFonts w:ascii="Times New Roman" w:eastAsiaTheme="minorHAnsi" w:hAnsi="Times New Roman" w:cs="Times New Roman"/>
+          <w:sz w:val="24"/>
+          <w:szCs w:val="20"/>
+        </w:rPr>
+        <w:t xml:space="preserve">? How </w:t>
       </w:r>
       <w:r>
         <w:rPr>
@@ -2598,39 +2642,7 @@
           <w:sz w:val="24"/>
           <w:szCs w:val="20"/>
         </w:rPr>
-        <w:t xml:space="preserve">Lee, Jina. </w:t>
-      </w:r>
-      <w:r>
-        <w:rPr>
-          <w:rFonts w:ascii="Times New Roman" w:eastAsiaTheme="minorHAnsi" w:hAnsi="Times New Roman" w:cs="Times New Roman"/>
-          <w:sz w:val="24"/>
-          <w:szCs w:val="20"/>
-        </w:rPr>
-        <w:t>“</w:t>
-      </w:r>
-      <w:r>
-        <w:rPr>
-          <w:rFonts w:ascii="Times New Roman" w:eastAsiaTheme="minorHAnsi" w:hAnsi="Times New Roman" w:cs="Times New Roman"/>
-          <w:sz w:val="24"/>
-          <w:szCs w:val="20"/>
-        </w:rPr>
-        <w:t xml:space="preserve">Who Faces More Doubt in Crisis? Gendered Patterns of Uncertainty in Reception of </w:t>
-      </w:r>
-      <w:r>
-        <w:rPr>
-          <w:rFonts w:ascii="Times New Roman" w:eastAsiaTheme="minorHAnsi" w:hAnsi="Times New Roman" w:cs="Times New Roman" w:hint="eastAsia"/>
-          <w:sz w:val="24"/>
-          <w:szCs w:val="20"/>
-        </w:rPr>
-        <w:t>High-Stake</w:t>
-      </w:r>
-      <w:r>
-        <w:rPr>
-          <w:rFonts w:ascii="Times New Roman" w:eastAsiaTheme="minorHAnsi" w:hAnsi="Times New Roman" w:cs="Times New Roman" w:hint="eastAsia"/>
-          <w:sz w:val="24"/>
-          <w:szCs w:val="20"/>
-        </w:rPr>
-        <w:t>s</w:t>
+        <w:t>Lee, Jina,</w:t>
       </w:r>
       <w:r>
         <w:rPr>
@@ -2640,29 +2652,55 @@
         </w:rPr>
         <w:t xml:space="preserve"> </w:t>
       </w:r>
-      <w:r>
-        <w:rPr>
-          <w:rFonts w:ascii="Times New Roman" w:eastAsiaTheme="minorHAnsi" w:hAnsi="Times New Roman" w:cs="Times New Roman" w:hint="eastAsia"/>
-          <w:sz w:val="24"/>
-          <w:szCs w:val="20"/>
-        </w:rPr>
-        <w:t>Science</w:t>
-      </w:r>
-      <w:r>
-        <w:rPr>
-          <w:rFonts w:ascii="Times New Roman" w:eastAsiaTheme="minorHAnsi" w:hAnsi="Times New Roman" w:cs="Times New Roman" w:hint="eastAsia"/>
-          <w:sz w:val="24"/>
-          <w:szCs w:val="20"/>
-        </w:rPr>
-        <w:t>.</w:t>
-      </w:r>
-      <w:r>
-        <w:rPr>
-          <w:rFonts w:ascii="Times New Roman" w:eastAsiaTheme="minorHAnsi" w:hAnsi="Times New Roman" w:cs="Times New Roman"/>
-          <w:sz w:val="24"/>
-          <w:szCs w:val="20"/>
-        </w:rPr>
-        <w:t>” [In progress]</w:t>
+      <w:proofErr w:type="spellStart"/>
+      <w:r>
+        <w:rPr>
+          <w:rFonts w:ascii="Times New Roman" w:eastAsiaTheme="minorHAnsi" w:hAnsi="Times New Roman" w:cs="Times New Roman"/>
+          <w:sz w:val="24"/>
+          <w:szCs w:val="20"/>
+        </w:rPr>
+        <w:t>Zhuofan</w:t>
+      </w:r>
+      <w:proofErr w:type="spellEnd"/>
+      <w:r>
+        <w:rPr>
+          <w:rFonts w:ascii="Times New Roman" w:eastAsiaTheme="minorHAnsi" w:hAnsi="Times New Roman" w:cs="Times New Roman"/>
+          <w:sz w:val="24"/>
+          <w:szCs w:val="20"/>
+        </w:rPr>
+        <w:t xml:space="preserve"> Li. “</w:t>
+      </w:r>
+      <w:r>
+        <w:rPr>
+          <w:rFonts w:ascii="Times New Roman" w:eastAsiaTheme="minorHAnsi" w:hAnsi="Times New Roman" w:cs="Times New Roman"/>
+          <w:sz w:val="24"/>
+          <w:szCs w:val="20"/>
+        </w:rPr>
+        <w:t>Conceptual Divergence Analysis for Reflective Auditing</w:t>
+      </w:r>
+      <w:r>
+        <w:rPr>
+          <w:rFonts w:ascii="Times New Roman" w:eastAsiaTheme="minorHAnsi" w:hAnsi="Times New Roman" w:cs="Times New Roman"/>
+          <w:sz w:val="24"/>
+          <w:szCs w:val="20"/>
+        </w:rPr>
+        <w:t>.” [</w:t>
+      </w:r>
+      <w:r>
+        <w:rPr>
+          <w:rFonts w:ascii="Times New Roman" w:eastAsiaTheme="minorHAnsi" w:hAnsi="Times New Roman" w:cs="Times New Roman"/>
+          <w:sz w:val="24"/>
+          <w:szCs w:val="20"/>
+        </w:rPr>
+        <w:t>Manuscript available</w:t>
+      </w:r>
+      <w:r>
+        <w:rPr>
+          <w:rFonts w:ascii="Times New Roman" w:eastAsiaTheme="minorHAnsi" w:hAnsi="Times New Roman" w:cs="Times New Roman"/>
+          <w:sz w:val="24"/>
+          <w:szCs w:val="20"/>
+        </w:rPr>
+        <w:t>]</w:t>
       </w:r>
     </w:p>
     <w:p>
@@ -2683,31 +2721,71 @@
           <w:sz w:val="24"/>
           <w:szCs w:val="20"/>
         </w:rPr>
-        <w:t>Lee, Jina,</w:t>
-      </w:r>
-      <w:r>
-        <w:rPr>
-          <w:rFonts w:ascii="Times New Roman" w:eastAsiaTheme="minorHAnsi" w:hAnsi="Times New Roman" w:cs="Times New Roman"/>
-          <w:sz w:val="24"/>
-          <w:szCs w:val="20"/>
-        </w:rPr>
-        <w:t xml:space="preserve"> Zhuofan Li. “</w:t>
-      </w:r>
-      <w:r>
-        <w:rPr>
-          <w:rFonts w:ascii="Times New Roman" w:eastAsiaTheme="minorHAnsi" w:hAnsi="Times New Roman" w:cs="Times New Roman"/>
-          <w:sz w:val="24"/>
-          <w:szCs w:val="20"/>
-        </w:rPr>
-        <w:t>Conceptual Divergence Analysis for Reflective Auditing</w:t>
-      </w:r>
-      <w:r>
-        <w:rPr>
-          <w:rFonts w:ascii="Times New Roman" w:eastAsiaTheme="minorHAnsi" w:hAnsi="Times New Roman" w:cs="Times New Roman"/>
-          <w:sz w:val="24"/>
-          <w:szCs w:val="20"/>
-        </w:rPr>
-        <w:t>.” [In progress]</w:t>
+        <w:t xml:space="preserve">Lee, Jina. </w:t>
+      </w:r>
+      <w:r>
+        <w:rPr>
+          <w:rFonts w:ascii="Times New Roman" w:eastAsiaTheme="minorHAnsi" w:hAnsi="Times New Roman" w:cs="Times New Roman"/>
+          <w:sz w:val="24"/>
+          <w:szCs w:val="20"/>
+        </w:rPr>
+        <w:t>“</w:t>
+      </w:r>
+      <w:r>
+        <w:rPr>
+          <w:rFonts w:ascii="Times New Roman" w:eastAsiaTheme="minorHAnsi" w:hAnsi="Times New Roman" w:cs="Times New Roman"/>
+          <w:sz w:val="24"/>
+          <w:szCs w:val="20"/>
+        </w:rPr>
+        <w:t xml:space="preserve">Who Faces More Doubt in Crisis? Gendered Patterns of Uncertainty in Reception of </w:t>
+      </w:r>
+      <w:r>
+        <w:rPr>
+          <w:rFonts w:ascii="Times New Roman" w:eastAsiaTheme="minorHAnsi" w:hAnsi="Times New Roman" w:cs="Times New Roman" w:hint="eastAsia"/>
+          <w:sz w:val="24"/>
+          <w:szCs w:val="20"/>
+        </w:rPr>
+        <w:t>High-Stake</w:t>
+      </w:r>
+      <w:r>
+        <w:rPr>
+          <w:rFonts w:ascii="Times New Roman" w:eastAsiaTheme="minorHAnsi" w:hAnsi="Times New Roman" w:cs="Times New Roman" w:hint="eastAsia"/>
+          <w:sz w:val="24"/>
+          <w:szCs w:val="20"/>
+        </w:rPr>
+        <w:t>s</w:t>
+      </w:r>
+      <w:r>
+        <w:rPr>
+          <w:rFonts w:ascii="Times New Roman" w:eastAsiaTheme="minorHAnsi" w:hAnsi="Times New Roman" w:cs="Times New Roman"/>
+          <w:sz w:val="24"/>
+          <w:szCs w:val="20"/>
+        </w:rPr>
+        <w:t xml:space="preserve"> </w:t>
+      </w:r>
+      <w:r>
+        <w:rPr>
+          <w:rFonts w:ascii="Times New Roman" w:eastAsiaTheme="minorHAnsi" w:hAnsi="Times New Roman" w:cs="Times New Roman" w:hint="eastAsia"/>
+          <w:sz w:val="24"/>
+          <w:szCs w:val="20"/>
+        </w:rPr>
+        <w:t>Science</w:t>
+      </w:r>
+      <w:r>
+        <w:rPr>
+          <w:rFonts w:ascii="Times New Roman" w:eastAsiaTheme="minorHAnsi" w:hAnsi="Times New Roman" w:cs="Times New Roman" w:hint="eastAsia"/>
+          <w:sz w:val="24"/>
+          <w:szCs w:val="20"/>
+        </w:rPr>
+        <w:t>.</w:t>
+      </w:r>
+      <w:r>
+        <w:rPr>
+          <w:rFonts w:ascii="Times New Roman" w:eastAsiaTheme="minorHAnsi" w:hAnsi="Times New Roman" w:cs="Times New Roman"/>
+          <w:sz w:val="24"/>
+          <w:szCs w:val="20"/>
+        </w:rPr>
+        <w:t>” [In progress]</w:t>
       </w:r>
     </w:p>
     <w:p>
@@ -2794,77 +2872,6 @@
         </w:rPr>
         <w:t xml:space="preserve"> [In progress]</w:t>
       </w:r>
-    </w:p>
-    <w:p>
-      <w:pPr>
-        <w:spacing w:after="240" w:line="276" w:lineRule="auto"/>
-        <w:jc w:val="left"/>
-        <w:rPr>
-          <w:rFonts w:ascii="Times New Roman" w:eastAsiaTheme="minorHAnsi" w:hAnsi="Times New Roman" w:cs="Times New Roman"/>
-          <w:sz w:val="24"/>
-          <w:szCs w:val="20"/>
-        </w:rPr>
-      </w:pPr>
-      <w:r>
-        <w:rPr>
-          <w:rFonts w:ascii="Times New Roman" w:eastAsiaTheme="minorHAnsi" w:hAnsi="Times New Roman" w:cs="Times New Roman"/>
-          <w:b/>
-          <w:bCs/>
-          <w:sz w:val="24"/>
-          <w:szCs w:val="20"/>
-        </w:rPr>
-        <w:t>Lee, Jina,</w:t>
-      </w:r>
-      <w:r>
-        <w:rPr>
-          <w:rFonts w:ascii="Times New Roman" w:eastAsiaTheme="minorHAnsi" w:hAnsi="Times New Roman" w:cs="Times New Roman"/>
-          <w:sz w:val="24"/>
-          <w:szCs w:val="20"/>
-        </w:rPr>
-        <w:t xml:space="preserve"> Charles Gomez, Sarah Bratt, Yea-Eun Kwon, Charles Lassiter, Erin Leahey</w:t>
-      </w:r>
-      <w:r>
-        <w:rPr>
-          <w:rFonts w:ascii="Times New Roman" w:eastAsiaTheme="minorHAnsi" w:hAnsi="Times New Roman" w:cs="Times New Roman" w:hint="eastAsia"/>
-          <w:sz w:val="24"/>
-          <w:szCs w:val="20"/>
-        </w:rPr>
-        <w:t xml:space="preserve">. </w:t>
-      </w:r>
-      <w:r>
-        <w:rPr>
-          <w:rFonts w:ascii="Times New Roman" w:eastAsiaTheme="minorHAnsi" w:hAnsi="Times New Roman" w:cs="Times New Roman"/>
-          <w:sz w:val="24"/>
-          <w:szCs w:val="20"/>
-        </w:rPr>
-        <w:t>“</w:t>
-      </w:r>
-      <w:r>
-        <w:rPr>
-          <w:rFonts w:ascii="Times New Roman" w:eastAsiaTheme="minorHAnsi" w:hAnsi="Times New Roman" w:cs="Times New Roman"/>
-          <w:sz w:val="24"/>
-          <w:szCs w:val="20"/>
-        </w:rPr>
-        <w:t>Why Is Women’s Work More Disruptive?</w:t>
-      </w:r>
-      <w:r>
-        <w:rPr>
-          <w:rFonts w:ascii="Times New Roman" w:eastAsiaTheme="minorHAnsi" w:hAnsi="Times New Roman" w:cs="Times New Roman"/>
-          <w:sz w:val="24"/>
-          <w:szCs w:val="20"/>
-        </w:rPr>
-        <w:t>” [In progress]</w:t>
-      </w:r>
-    </w:p>
-    <w:p>
-      <w:pPr>
-        <w:spacing w:line="276" w:lineRule="auto"/>
-        <w:rPr>
-          <w:rFonts w:ascii="Times New Roman" w:eastAsiaTheme="minorHAnsi" w:hAnsi="Times New Roman" w:cs="Times New Roman"/>
-          <w:sz w:val="24"/>
-          <w:szCs w:val="20"/>
-        </w:rPr>
-      </w:pPr>
     </w:p>
     <w:p>
       <w:pPr>
@@ -3053,16 +3060,7 @@
           <w:sz w:val="24"/>
           <w:szCs w:val="20"/>
         </w:rPr>
-        <w:t xml:space="preserve">Association for Korean Sociologists in America, </w:t>
-      </w:r>
-      <w:r>
-        <w:rPr>
-          <w:rFonts w:ascii="Times New Roman" w:eastAsiaTheme="minorHAnsi" w:hAnsi="Times New Roman" w:cs="Times New Roman"/>
-          <w:sz w:val="24"/>
-          <w:szCs w:val="20"/>
-        </w:rPr>
-        <w:lastRenderedPageBreak/>
-        <w:t>University of Illinois at Chicago, Chicago, IL.</w:t>
+        <w:t>Association for Korean Sociologists in America, University of Illinois at Chicago, Chicago, IL.</w:t>
       </w:r>
     </w:p>
     <w:p>
@@ -3136,7 +3134,16 @@
           <w:sz w:val="24"/>
           <w:szCs w:val="20"/>
         </w:rPr>
-        <w:t>Selective Recognition: Gendered Recognition of Different Types of Scientific Novelty</w:t>
+        <w:t xml:space="preserve">Selective Recognition: Gendered Recognition of Different Types of </w:t>
+      </w:r>
+      <w:r>
+        <w:rPr>
+          <w:rFonts w:ascii="Times New Roman" w:eastAsiaTheme="minorHAnsi" w:hAnsi="Times New Roman" w:cs="Times New Roman"/>
+          <w:sz w:val="24"/>
+          <w:szCs w:val="20"/>
+        </w:rPr>
+        <w:lastRenderedPageBreak/>
+        <w:t>Scientific Novelty</w:t>
       </w:r>
       <w:r>
         <w:rPr>
@@ -4076,6 +4083,7 @@
         </w:rPr>
         <w:t xml:space="preserve">Divide and </w:t>
       </w:r>
+      <w:proofErr w:type="gramStart"/>
       <w:r>
         <w:rPr>
           <w:rFonts w:ascii="Times New Roman" w:eastAsiaTheme="minorHAnsi" w:hAnsi="Times New Roman" w:cs="Times New Roman"/>
@@ -4090,7 +4098,16 @@
           <w:sz w:val="24"/>
           <w:szCs w:val="20"/>
         </w:rPr>
-        <w:t xml:space="preserve">onquer? How </w:t>
+        <w:t>onquer</w:t>
+      </w:r>
+      <w:proofErr w:type="gramEnd"/>
+      <w:r>
+        <w:rPr>
+          <w:rFonts w:ascii="Times New Roman" w:eastAsiaTheme="minorHAnsi" w:hAnsi="Times New Roman" w:cs="Times New Roman"/>
+          <w:sz w:val="24"/>
+          <w:szCs w:val="20"/>
+        </w:rPr>
+        <w:t xml:space="preserve">? How </w:t>
       </w:r>
       <w:r>
         <w:rPr>
@@ -4324,7 +4341,25 @@
           <w:sz w:val="24"/>
           <w:szCs w:val="20"/>
         </w:rPr>
-        <w:t>” American Sociological Association Methodology Section Mid-year Meeting, Philadelphia, PA.</w:t>
+        <w:t>” American Sociological Association Methodology Section Mid-</w:t>
+      </w:r>
+      <w:proofErr w:type="gramStart"/>
+      <w:r>
+        <w:rPr>
+          <w:rFonts w:ascii="Times New Roman" w:eastAsiaTheme="minorHAnsi" w:hAnsi="Times New Roman" w:cs="Times New Roman"/>
+          <w:sz w:val="24"/>
+          <w:szCs w:val="20"/>
+        </w:rPr>
+        <w:t>year</w:t>
+      </w:r>
+      <w:proofErr w:type="gramEnd"/>
+      <w:r>
+        <w:rPr>
+          <w:rFonts w:ascii="Times New Roman" w:eastAsiaTheme="minorHAnsi" w:hAnsi="Times New Roman" w:cs="Times New Roman"/>
+          <w:sz w:val="24"/>
+          <w:szCs w:val="20"/>
+        </w:rPr>
+        <w:t xml:space="preserve"> Meeting, Philadelphia, PA.</w:t>
       </w:r>
     </w:p>
     <w:p>
@@ -4461,6 +4496,169 @@
           <w:sz w:val="24"/>
           <w:szCs w:val="20"/>
         </w:rPr>
+        <w:t>2023</w:t>
+      </w:r>
+      <w:r>
+        <w:rPr>
+          <w:rFonts w:ascii="Times New Roman" w:eastAsiaTheme="minorHAnsi" w:hAnsi="Times New Roman" w:cs="Times New Roman"/>
+          <w:sz w:val="24"/>
+          <w:szCs w:val="20"/>
+        </w:rPr>
+        <w:tab/>
+      </w:r>
+      <w:r>
+        <w:rPr>
+          <w:rFonts w:ascii="Times New Roman" w:eastAsiaTheme="minorHAnsi" w:hAnsi="Times New Roman" w:cs="Times New Roman"/>
+          <w:b/>
+          <w:bCs/>
+          <w:sz w:val="24"/>
+          <w:szCs w:val="20"/>
+        </w:rPr>
+        <w:t>Lee, Jina.</w:t>
+      </w:r>
+      <w:r>
+        <w:rPr>
+          <w:rFonts w:ascii="Times New Roman" w:eastAsiaTheme="minorHAnsi" w:hAnsi="Times New Roman" w:cs="Times New Roman"/>
+          <w:sz w:val="24"/>
+          <w:szCs w:val="20"/>
+        </w:rPr>
+        <w:t xml:space="preserve"> “</w:t>
+      </w:r>
+      <w:r>
+        <w:rPr>
+          <w:rFonts w:ascii="Times New Roman" w:eastAsiaTheme="minorHAnsi" w:hAnsi="Times New Roman" w:cs="Times New Roman" w:hint="eastAsia"/>
+          <w:sz w:val="24"/>
+          <w:szCs w:val="20"/>
+        </w:rPr>
+        <w:t>Are</w:t>
+      </w:r>
+      <w:r>
+        <w:rPr>
+          <w:rFonts w:ascii="Times New Roman" w:eastAsiaTheme="minorHAnsi" w:hAnsi="Times New Roman" w:cs="Times New Roman"/>
+          <w:sz w:val="24"/>
+          <w:szCs w:val="20"/>
+        </w:rPr>
+        <w:t xml:space="preserve"> </w:t>
+      </w:r>
+      <w:r>
+        <w:rPr>
+          <w:rFonts w:ascii="Times New Roman" w:eastAsiaTheme="minorHAnsi" w:hAnsi="Times New Roman" w:cs="Times New Roman"/>
+          <w:sz w:val="24"/>
+          <w:szCs w:val="20"/>
+        </w:rPr>
+        <w:t xml:space="preserve">Women’s Work and Claims Received as More Uncertain?” </w:t>
+      </w:r>
+      <w:r>
+        <w:rPr>
+          <w:rFonts w:ascii="Times New Roman" w:eastAsiaTheme="minorHAnsi" w:hAnsi="Times New Roman" w:cs="Times New Roman"/>
+          <w:sz w:val="24"/>
+          <w:szCs w:val="20"/>
+        </w:rPr>
+        <w:t>118</w:t>
+      </w:r>
+      <w:r>
+        <w:rPr>
+          <w:rFonts w:ascii="Times New Roman" w:eastAsiaTheme="minorHAnsi" w:hAnsi="Times New Roman" w:cs="Times New Roman" w:hint="eastAsia"/>
+          <w:sz w:val="24"/>
+          <w:szCs w:val="20"/>
+          <w:vertAlign w:val="superscript"/>
+        </w:rPr>
+        <w:t>t</w:t>
+      </w:r>
+      <w:r>
+        <w:rPr>
+          <w:rFonts w:ascii="Times New Roman" w:eastAsiaTheme="minorHAnsi" w:hAnsi="Times New Roman" w:cs="Times New Roman"/>
+          <w:sz w:val="24"/>
+          <w:szCs w:val="20"/>
+          <w:vertAlign w:val="superscript"/>
+        </w:rPr>
+        <w:t>h</w:t>
+      </w:r>
+      <w:r>
+        <w:rPr>
+          <w:rFonts w:ascii="Times New Roman" w:eastAsiaTheme="minorHAnsi" w:hAnsi="Times New Roman" w:cs="Times New Roman"/>
+          <w:sz w:val="24"/>
+          <w:szCs w:val="20"/>
+        </w:rPr>
+        <w:t xml:space="preserve"> </w:t>
+      </w:r>
+      <w:r>
+        <w:rPr>
+          <w:rFonts w:ascii="Times New Roman" w:eastAsiaTheme="minorHAnsi" w:hAnsi="Times New Roman" w:cs="Times New Roman"/>
+          <w:sz w:val="24"/>
+          <w:szCs w:val="20"/>
+        </w:rPr>
+        <w:t>A</w:t>
+      </w:r>
+      <w:r>
+        <w:rPr>
+          <w:rFonts w:ascii="Times New Roman" w:eastAsiaTheme="minorHAnsi" w:hAnsi="Times New Roman" w:cs="Times New Roman"/>
+          <w:sz w:val="24"/>
+          <w:szCs w:val="20"/>
+        </w:rPr>
+        <w:t>merican Sociological Association A</w:t>
+      </w:r>
+      <w:r>
+        <w:rPr>
+          <w:rFonts w:ascii="Times New Roman" w:eastAsiaTheme="minorHAnsi" w:hAnsi="Times New Roman" w:cs="Times New Roman"/>
+          <w:sz w:val="24"/>
+          <w:szCs w:val="20"/>
+        </w:rPr>
+        <w:t>nnual</w:t>
+      </w:r>
+      <w:r>
+        <w:rPr>
+          <w:rFonts w:ascii="Times New Roman" w:eastAsiaTheme="minorHAnsi" w:hAnsi="Times New Roman" w:cs="Times New Roman"/>
+          <w:sz w:val="24"/>
+          <w:szCs w:val="20"/>
+        </w:rPr>
+        <w:t xml:space="preserve"> </w:t>
+      </w:r>
+      <w:r>
+        <w:rPr>
+          <w:rFonts w:ascii="Times New Roman" w:eastAsiaTheme="minorHAnsi" w:hAnsi="Times New Roman" w:cs="Times New Roman"/>
+          <w:sz w:val="24"/>
+          <w:szCs w:val="20"/>
+        </w:rPr>
+        <w:t>Meeting</w:t>
+      </w:r>
+      <w:r>
+        <w:rPr>
+          <w:rFonts w:ascii="Times New Roman" w:eastAsiaTheme="minorHAnsi" w:hAnsi="Times New Roman" w:cs="Times New Roman"/>
+          <w:sz w:val="24"/>
+          <w:szCs w:val="20"/>
+        </w:rPr>
+        <w:t>, Philadelphia, PA.</w:t>
+      </w:r>
+    </w:p>
+    <w:p>
+      <w:pPr>
+        <w:spacing w:line="276" w:lineRule="auto"/>
+        <w:jc w:val="left"/>
+        <w:rPr>
+          <w:rFonts w:ascii="Times New Roman" w:eastAsiaTheme="minorHAnsi" w:hAnsi="Times New Roman" w:cs="Times New Roman"/>
+          <w:sz w:val="24"/>
+          <w:szCs w:val="20"/>
+        </w:rPr>
+      </w:pPr>
+    </w:p>
+    <w:p>
+      <w:pPr>
+        <w:spacing w:line="276" w:lineRule="auto"/>
+        <w:ind w:left="800" w:hanging="800"/>
+        <w:jc w:val="left"/>
+        <w:rPr>
+          <w:rFonts w:ascii="Times New Roman" w:eastAsiaTheme="minorHAnsi" w:hAnsi="Times New Roman" w:cs="Times New Roman"/>
+          <w:sz w:val="24"/>
+          <w:szCs w:val="20"/>
+        </w:rPr>
+      </w:pPr>
+      <w:r>
+        <w:rPr>
+          <w:rFonts w:ascii="Times New Roman" w:eastAsiaTheme="minorHAnsi" w:hAnsi="Times New Roman" w:cs="Times New Roman"/>
+          <w:sz w:val="24"/>
+          <w:szCs w:val="20"/>
+        </w:rPr>
         <w:lastRenderedPageBreak/>
         <w:t>2023</w:t>
       </w:r>
@@ -4520,26 +4718,26 @@
           <w:sz w:val="24"/>
           <w:szCs w:val="20"/>
         </w:rPr>
-        <w:t>118</w:t>
-      </w:r>
-      <w:r>
-        <w:rPr>
-          <w:rFonts w:ascii="Times New Roman" w:eastAsiaTheme="minorHAnsi" w:hAnsi="Times New Roman" w:cs="Times New Roman" w:hint="eastAsia"/>
-          <w:sz w:val="24"/>
-          <w:szCs w:val="20"/>
-          <w:vertAlign w:val="superscript"/>
-        </w:rPr>
-        <w:t>t</w:t>
-      </w:r>
-      <w:r>
-        <w:rPr>
-          <w:rFonts w:ascii="Times New Roman" w:eastAsiaTheme="minorHAnsi" w:hAnsi="Times New Roman" w:cs="Times New Roman"/>
-          <w:sz w:val="24"/>
-          <w:szCs w:val="20"/>
-          <w:vertAlign w:val="superscript"/>
-        </w:rPr>
-        <w:t>h</w:t>
-      </w:r>
+        <w:t xml:space="preserve">Doctoral Consortium, </w:t>
+      </w:r>
+      <w:r>
+        <w:rPr>
+          <w:rFonts w:ascii="Times New Roman" w:eastAsiaTheme="minorHAnsi" w:hAnsi="Times New Roman" w:cs="Times New Roman"/>
+          <w:sz w:val="24"/>
+          <w:szCs w:val="20"/>
+        </w:rPr>
+        <w:t xml:space="preserve">International Society for </w:t>
+      </w:r>
+      <w:proofErr w:type="spellStart"/>
+      <w:r>
+        <w:rPr>
+          <w:rFonts w:ascii="Times New Roman" w:eastAsiaTheme="minorHAnsi" w:hAnsi="Times New Roman" w:cs="Times New Roman"/>
+          <w:sz w:val="24"/>
+          <w:szCs w:val="20"/>
+        </w:rPr>
+        <w:t>Scientometrics</w:t>
+      </w:r>
+      <w:proofErr w:type="spellEnd"/>
       <w:r>
         <w:rPr>
           <w:rFonts w:ascii="Times New Roman" w:eastAsiaTheme="minorHAnsi" w:hAnsi="Times New Roman" w:cs="Times New Roman"/>
@@ -4554,161 +4752,18 @@
           <w:sz w:val="24"/>
           <w:szCs w:val="20"/>
         </w:rPr>
-        <w:t>A</w:t>
-      </w:r>
-      <w:r>
-        <w:rPr>
-          <w:rFonts w:ascii="Times New Roman" w:eastAsiaTheme="minorHAnsi" w:hAnsi="Times New Roman" w:cs="Times New Roman"/>
-          <w:sz w:val="24"/>
-          <w:szCs w:val="20"/>
-        </w:rPr>
-        <w:t>merican Sociological Association A</w:t>
-      </w:r>
-      <w:r>
-        <w:rPr>
-          <w:rFonts w:ascii="Times New Roman" w:eastAsiaTheme="minorHAnsi" w:hAnsi="Times New Roman" w:cs="Times New Roman"/>
-          <w:sz w:val="24"/>
-          <w:szCs w:val="20"/>
-        </w:rPr>
-        <w:t>nnual</w:t>
-      </w:r>
-      <w:r>
-        <w:rPr>
-          <w:rFonts w:ascii="Times New Roman" w:eastAsiaTheme="minorHAnsi" w:hAnsi="Times New Roman" w:cs="Times New Roman"/>
-          <w:sz w:val="24"/>
-          <w:szCs w:val="20"/>
-        </w:rPr>
-        <w:t xml:space="preserve"> </w:t>
-      </w:r>
-      <w:r>
-        <w:rPr>
-          <w:rFonts w:ascii="Times New Roman" w:eastAsiaTheme="minorHAnsi" w:hAnsi="Times New Roman" w:cs="Times New Roman"/>
-          <w:sz w:val="24"/>
-          <w:szCs w:val="20"/>
-        </w:rPr>
-        <w:t>Meeting</w:t>
-      </w:r>
-      <w:r>
-        <w:rPr>
-          <w:rFonts w:ascii="Times New Roman" w:eastAsiaTheme="minorHAnsi" w:hAnsi="Times New Roman" w:cs="Times New Roman"/>
-          <w:sz w:val="24"/>
-          <w:szCs w:val="20"/>
-        </w:rPr>
-        <w:t>, Philadelphia, PA.</w:t>
-      </w:r>
-    </w:p>
-    <w:p>
-      <w:pPr>
-        <w:spacing w:line="276" w:lineRule="auto"/>
-        <w:jc w:val="left"/>
-        <w:rPr>
-          <w:rFonts w:ascii="Times New Roman" w:eastAsiaTheme="minorHAnsi" w:hAnsi="Times New Roman" w:cs="Times New Roman"/>
-          <w:sz w:val="24"/>
-          <w:szCs w:val="20"/>
-        </w:rPr>
-      </w:pPr>
-    </w:p>
-    <w:p>
-      <w:pPr>
-        <w:spacing w:line="276" w:lineRule="auto"/>
-        <w:ind w:left="800" w:hanging="800"/>
-        <w:jc w:val="left"/>
-        <w:rPr>
-          <w:rFonts w:ascii="Times New Roman" w:eastAsiaTheme="minorHAnsi" w:hAnsi="Times New Roman" w:cs="Times New Roman"/>
-          <w:sz w:val="24"/>
-          <w:szCs w:val="20"/>
-        </w:rPr>
-      </w:pPr>
-      <w:r>
-        <w:rPr>
-          <w:rFonts w:ascii="Times New Roman" w:eastAsiaTheme="minorHAnsi" w:hAnsi="Times New Roman" w:cs="Times New Roman"/>
-          <w:sz w:val="24"/>
-          <w:szCs w:val="20"/>
-        </w:rPr>
-        <w:t>2023</w:t>
-      </w:r>
-      <w:r>
-        <w:rPr>
-          <w:rFonts w:ascii="Times New Roman" w:eastAsiaTheme="minorHAnsi" w:hAnsi="Times New Roman" w:cs="Times New Roman"/>
-          <w:sz w:val="24"/>
-          <w:szCs w:val="20"/>
-        </w:rPr>
-        <w:tab/>
-      </w:r>
-      <w:r>
-        <w:rPr>
-          <w:rFonts w:ascii="Times New Roman" w:eastAsiaTheme="minorHAnsi" w:hAnsi="Times New Roman" w:cs="Times New Roman"/>
-          <w:b/>
-          <w:bCs/>
-          <w:sz w:val="24"/>
-          <w:szCs w:val="20"/>
-        </w:rPr>
-        <w:t>Lee, Jina.</w:t>
-      </w:r>
-      <w:r>
-        <w:rPr>
-          <w:rFonts w:ascii="Times New Roman" w:eastAsiaTheme="minorHAnsi" w:hAnsi="Times New Roman" w:cs="Times New Roman"/>
-          <w:sz w:val="24"/>
-          <w:szCs w:val="20"/>
-        </w:rPr>
-        <w:t xml:space="preserve"> “</w:t>
-      </w:r>
-      <w:r>
-        <w:rPr>
-          <w:rFonts w:ascii="Times New Roman" w:eastAsiaTheme="minorHAnsi" w:hAnsi="Times New Roman" w:cs="Times New Roman" w:hint="eastAsia"/>
-          <w:sz w:val="24"/>
-          <w:szCs w:val="20"/>
-        </w:rPr>
-        <w:t>Are</w:t>
-      </w:r>
-      <w:r>
-        <w:rPr>
-          <w:rFonts w:ascii="Times New Roman" w:eastAsiaTheme="minorHAnsi" w:hAnsi="Times New Roman" w:cs="Times New Roman"/>
-          <w:sz w:val="24"/>
-          <w:szCs w:val="20"/>
-        </w:rPr>
-        <w:t xml:space="preserve"> </w:t>
-      </w:r>
-      <w:r>
-        <w:rPr>
-          <w:rFonts w:ascii="Times New Roman" w:eastAsiaTheme="minorHAnsi" w:hAnsi="Times New Roman" w:cs="Times New Roman"/>
-          <w:sz w:val="24"/>
-          <w:szCs w:val="20"/>
-        </w:rPr>
-        <w:t xml:space="preserve">Women’s Work and Claims Received as More Uncertain?” </w:t>
-      </w:r>
-      <w:r>
-        <w:rPr>
-          <w:rFonts w:ascii="Times New Roman" w:eastAsiaTheme="minorHAnsi" w:hAnsi="Times New Roman" w:cs="Times New Roman"/>
-          <w:sz w:val="24"/>
-          <w:szCs w:val="20"/>
-        </w:rPr>
-        <w:t xml:space="preserve">Doctoral Consortium, </w:t>
-      </w:r>
-      <w:r>
-        <w:rPr>
-          <w:rFonts w:ascii="Times New Roman" w:eastAsiaTheme="minorHAnsi" w:hAnsi="Times New Roman" w:cs="Times New Roman"/>
-          <w:sz w:val="24"/>
-          <w:szCs w:val="20"/>
-        </w:rPr>
-        <w:t>International Society for Scientometrics</w:t>
-      </w:r>
-      <w:r>
-        <w:rPr>
-          <w:rFonts w:ascii="Times New Roman" w:eastAsiaTheme="minorHAnsi" w:hAnsi="Times New Roman" w:cs="Times New Roman"/>
-          <w:sz w:val="24"/>
-          <w:szCs w:val="20"/>
-        </w:rPr>
-        <w:t xml:space="preserve"> </w:t>
-      </w:r>
-      <w:r>
-        <w:rPr>
-          <w:rFonts w:ascii="Times New Roman" w:eastAsiaTheme="minorHAnsi" w:hAnsi="Times New Roman" w:cs="Times New Roman"/>
-          <w:sz w:val="24"/>
-          <w:szCs w:val="20"/>
-        </w:rPr>
-        <w:t>and Informetrics</w:t>
-      </w:r>
+        <w:t xml:space="preserve">and </w:t>
+      </w:r>
+      <w:proofErr w:type="spellStart"/>
+      <w:r>
+        <w:rPr>
+          <w:rFonts w:ascii="Times New Roman" w:eastAsiaTheme="minorHAnsi" w:hAnsi="Times New Roman" w:cs="Times New Roman"/>
+          <w:sz w:val="24"/>
+          <w:szCs w:val="20"/>
+        </w:rPr>
+        <w:t>Informetrics</w:t>
+      </w:r>
+      <w:proofErr w:type="spellEnd"/>
       <w:r>
         <w:rPr>
           <w:rFonts w:ascii="Times New Roman" w:eastAsiaTheme="minorHAnsi" w:hAnsi="Times New Roman" w:cs="Times New Roman"/>
@@ -6149,8 +6204,25 @@
           <w:sz w:val="24"/>
           <w:szCs w:val="20"/>
         </w:rPr>
-        <w:lastRenderedPageBreak/>
-        <w:t>Introduction to Social Statistics (In-Person, Fall 2024</w:t>
+        <w:t xml:space="preserve">Introduction to Social Statistics (In-Person, </w:t>
+      </w:r>
+      <w:proofErr w:type="gramStart"/>
+      <w:r>
+        <w:rPr>
+          <w:rFonts w:ascii="Times New Roman" w:eastAsia="함초롬바탕" w:hAnsi="Times New Roman" w:cs="Times New Roman"/>
+          <w:sz w:val="24"/>
+          <w:szCs w:val="20"/>
+        </w:rPr>
+        <w:t>Fall</w:t>
+      </w:r>
+      <w:proofErr w:type="gramEnd"/>
+      <w:r>
+        <w:rPr>
+          <w:rFonts w:ascii="Times New Roman" w:eastAsia="함초롬바탕" w:hAnsi="Times New Roman" w:cs="Times New Roman"/>
+          <w:sz w:val="24"/>
+          <w:szCs w:val="20"/>
+        </w:rPr>
+        <w:t xml:space="preserve"> 2024</w:t>
       </w:r>
       <w:r>
         <w:rPr>
@@ -6243,6 +6315,7 @@
           <w:sz w:val="24"/>
           <w:szCs w:val="20"/>
         </w:rPr>
+        <w:lastRenderedPageBreak/>
         <w:t xml:space="preserve">At </w:t>
       </w:r>
       <w:r>
@@ -6383,6 +6456,7 @@
         </w:rPr>
         <w:t xml:space="preserve">2026 </w:t>
       </w:r>
+      <w:proofErr w:type="gramStart"/>
       <w:r>
         <w:rPr>
           <w:rFonts w:ascii="Times New Roman" w:eastAsia="함초롬바탕" w:hAnsi="Times New Roman" w:cs="Times New Roman" w:hint="eastAsia"/>
@@ -6407,6 +6481,7 @@
         </w:rPr>
         <w:t>“</w:t>
       </w:r>
+      <w:proofErr w:type="gramEnd"/>
       <w:r>
         <w:rPr>
           <w:rFonts w:ascii="Times New Roman" w:eastAsia="함초롬바탕" w:hAnsi="Times New Roman" w:cs="Times New Roman"/>
@@ -7652,16 +7727,7 @@
           <w:sz w:val="24"/>
           <w:szCs w:val="24"/>
         </w:rPr>
-        <w:t xml:space="preserve"> of Sociology at the University of </w:t>
-      </w:r>
-      <w:r>
-        <w:rPr>
-          <w:rFonts w:ascii="Times New Roman" w:eastAsiaTheme="minorHAnsi" w:hAnsi="Times New Roman" w:cs="Times New Roman" w:hint="eastAsia"/>
-          <w:sz w:val="24"/>
-          <w:szCs w:val="24"/>
-        </w:rPr>
-        <w:lastRenderedPageBreak/>
-        <w:t>Illinois at Urbana-Champaign</w:t>
+        <w:t xml:space="preserve"> of Sociology at the University of Illinois at Urbana-Champaign</w:t>
       </w:r>
       <w:r>
         <w:rPr>
@@ -7787,21 +7853,6 @@
     <w:p>
       <w:pPr>
         <w:spacing w:line="276" w:lineRule="auto"/>
-        <w:ind w:left="1600" w:hanging="1600"/>
-        <w:jc w:val="left"/>
-        <w:rPr>
-          <w:rFonts w:ascii="Times New Roman" w:hAnsi="Times New Roman" w:cs="Times New Roman"/>
-          <w:color w:val="000000"/>
-          <w:sz w:val="24"/>
-          <w:szCs w:val="24"/>
-          <w:shd w:val="clear" w:color="auto" w:fill="FFFFFF"/>
-        </w:rPr>
-      </w:pPr>
-    </w:p>
-    <w:p>
-      <w:pPr>
-        <w:spacing w:line="276" w:lineRule="auto"/>
-        <w:ind w:left="1600" w:hanging="1600"/>
         <w:jc w:val="left"/>
         <w:rPr>
           <w:rFonts w:ascii="Times New Roman" w:hAnsi="Times New Roman" w:cs="Times New Roman"/>
@@ -7823,13 +7874,13 @@
           <w:szCs w:val="24"/>
           <w:shd w:val="clear" w:color="auto" w:fill="FFFFFF"/>
         </w:rPr>
+        <w:lastRenderedPageBreak/>
         <w:t>Service to the University of Arizona</w:t>
       </w:r>
     </w:p>
     <w:p>
       <w:pPr>
         <w:spacing w:line="276" w:lineRule="auto"/>
-        <w:ind w:left="1600" w:hanging="1600"/>
         <w:jc w:val="left"/>
         <w:rPr>
           <w:rFonts w:ascii="Times New Roman" w:hAnsi="Times New Roman" w:cs="Times New Roman"/>

</xml_diff>

<commit_message>
Manual CV update: 2026-05-01 16:30:02 CDT
</commit_message>
<xml_diff>
--- a/public/cv.docx
+++ b/public/cv.docx
@@ -2304,8 +2304,6 @@
         <w:jc w:val="left"/>
         <w:rPr>
           <w:rFonts w:ascii="Times New Roman" w:eastAsiaTheme="minorHAnsi" w:hAnsi="Times New Roman" w:cs="Times New Roman"/>
-          <w:i/>
-          <w:iCs/>
           <w:sz w:val="24"/>
           <w:szCs w:val="20"/>
         </w:rPr>
@@ -2398,36 +2396,105 @@
       <w:r>
         <w:rPr>
           <w:rFonts w:ascii="Times New Roman" w:eastAsiaTheme="minorHAnsi" w:hAnsi="Times New Roman" w:cs="Times New Roman"/>
-          <w:sz w:val="24"/>
-          <w:szCs w:val="20"/>
-        </w:rPr>
-        <w:t>Paik, Eugene T.</w:t>
-      </w:r>
-      <w:r>
-        <w:rPr>
-          <w:rFonts w:ascii="Times New Roman" w:eastAsiaTheme="minorHAnsi" w:hAnsi="Times New Roman" w:cs="Times New Roman"/>
-          <w:sz w:val="24"/>
-          <w:szCs w:val="20"/>
-        </w:rPr>
-        <w:t xml:space="preserve">, </w:t>
-      </w:r>
-      <w:r>
-        <w:rPr>
-          <w:rFonts w:ascii="Times New Roman" w:eastAsiaTheme="minorHAnsi" w:hAnsi="Times New Roman" w:cs="Times New Roman"/>
           <w:b/>
           <w:bCs/>
           <w:sz w:val="24"/>
           <w:szCs w:val="20"/>
         </w:rPr>
-        <w:t>Jina Lee</w:t>
-      </w:r>
-      <w:r>
-        <w:rPr>
-          <w:rFonts w:ascii="Times New Roman" w:eastAsiaTheme="minorHAnsi" w:hAnsi="Times New Roman" w:cs="Times New Roman"/>
-          <w:sz w:val="24"/>
-          <w:szCs w:val="20"/>
-        </w:rPr>
-        <w:t>, Russell Funk</w:t>
+        <w:t>Lee, Jina,</w:t>
+      </w:r>
+      <w:r>
+        <w:rPr>
+          <w:rFonts w:ascii="Times New Roman" w:eastAsiaTheme="minorHAnsi" w:hAnsi="Times New Roman" w:cs="Times New Roman"/>
+          <w:sz w:val="24"/>
+          <w:szCs w:val="20"/>
+        </w:rPr>
+        <w:t xml:space="preserve"> </w:t>
+      </w:r>
+      <w:proofErr w:type="spellStart"/>
+      <w:r>
+        <w:rPr>
+          <w:rFonts w:ascii="Times New Roman" w:eastAsiaTheme="minorHAnsi" w:hAnsi="Times New Roman" w:cs="Times New Roman"/>
+          <w:sz w:val="24"/>
+          <w:szCs w:val="20"/>
+        </w:rPr>
+        <w:t>Zhuofan</w:t>
+      </w:r>
+      <w:proofErr w:type="spellEnd"/>
+      <w:r>
+        <w:rPr>
+          <w:rFonts w:ascii="Times New Roman" w:eastAsiaTheme="minorHAnsi" w:hAnsi="Times New Roman" w:cs="Times New Roman"/>
+          <w:sz w:val="24"/>
+          <w:szCs w:val="20"/>
+        </w:rPr>
+        <w:t xml:space="preserve"> Li. “</w:t>
+      </w:r>
+      <w:r>
+        <w:rPr>
+          <w:rFonts w:ascii="Times New Roman" w:eastAsiaTheme="minorHAnsi" w:hAnsi="Times New Roman" w:cs="Times New Roman"/>
+          <w:sz w:val="24"/>
+          <w:szCs w:val="20"/>
+        </w:rPr>
+        <w:t>Toward a Personalization Turn in AI-Assisted Research Infrastructure:</w:t>
+      </w:r>
+      <w:r>
+        <w:rPr>
+          <w:rFonts w:ascii="Times New Roman" w:eastAsiaTheme="minorHAnsi" w:hAnsi="Times New Roman" w:cs="Times New Roman"/>
+          <w:sz w:val="24"/>
+          <w:szCs w:val="20"/>
+        </w:rPr>
+        <w:t xml:space="preserve"> </w:t>
+      </w:r>
+      <w:r>
+        <w:rPr>
+          <w:rFonts w:ascii="Times New Roman" w:eastAsiaTheme="minorHAnsi" w:hAnsi="Times New Roman" w:cs="Times New Roman"/>
+          <w:sz w:val="24"/>
+          <w:szCs w:val="20"/>
+        </w:rPr>
+        <w:t>Conceptual Divergence Analysis for Reflective Auditing</w:t>
+      </w:r>
+      <w:r>
+        <w:rPr>
+          <w:rFonts w:ascii="Times New Roman" w:eastAsiaTheme="minorHAnsi" w:hAnsi="Times New Roman" w:cs="Times New Roman"/>
+          <w:sz w:val="24"/>
+          <w:szCs w:val="20"/>
+        </w:rPr>
+        <w:t>.” [</w:t>
+      </w:r>
+      <w:r>
+        <w:rPr>
+          <w:rFonts w:ascii="Times New Roman" w:eastAsiaTheme="minorHAnsi" w:hAnsi="Times New Roman" w:cs="Times New Roman"/>
+          <w:sz w:val="24"/>
+          <w:szCs w:val="20"/>
+        </w:rPr>
+        <w:t>Under review</w:t>
+      </w:r>
+      <w:r>
+        <w:rPr>
+          <w:rFonts w:ascii="Times New Roman" w:eastAsiaTheme="minorHAnsi" w:hAnsi="Times New Roman" w:cs="Times New Roman"/>
+          <w:sz w:val="24"/>
+          <w:szCs w:val="20"/>
+        </w:rPr>
+        <w:t>]</w:t>
+      </w:r>
+    </w:p>
+    <w:p>
+      <w:pPr>
+        <w:spacing w:after="240" w:line="276" w:lineRule="auto"/>
+        <w:jc w:val="left"/>
+        <w:rPr>
+          <w:rFonts w:ascii="Times New Roman" w:eastAsiaTheme="minorHAnsi" w:hAnsi="Times New Roman" w:cs="Times New Roman"/>
+          <w:sz w:val="24"/>
+          <w:szCs w:val="20"/>
+        </w:rPr>
+      </w:pPr>
+      <w:r>
+        <w:rPr>
+          <w:rFonts w:ascii="Times New Roman" w:eastAsiaTheme="minorHAnsi" w:hAnsi="Times New Roman" w:cs="Times New Roman"/>
+          <w:sz w:val="24"/>
+          <w:szCs w:val="20"/>
+        </w:rPr>
+        <w:t>Paik, Eugene T.</w:t>
       </w:r>
       <w:r>
         <w:rPr>
@@ -2437,203 +2504,6 @@
         </w:rPr>
         <w:t xml:space="preserve">, </w:t>
       </w:r>
-      <w:r>
-        <w:rPr>
-          <w:rFonts w:ascii="Times New Roman" w:eastAsiaTheme="minorHAnsi" w:hAnsi="Times New Roman" w:cs="Times New Roman"/>
-          <w:sz w:val="24"/>
-          <w:szCs w:val="20"/>
-        </w:rPr>
-        <w:t>Erin Leahey</w:t>
-      </w:r>
-      <w:r>
-        <w:rPr>
-          <w:rFonts w:ascii="Times New Roman" w:eastAsiaTheme="minorHAnsi" w:hAnsi="Times New Roman" w:cs="Times New Roman"/>
-          <w:sz w:val="24"/>
-          <w:szCs w:val="20"/>
-        </w:rPr>
-        <w:t>. “</w:t>
-      </w:r>
-      <w:r>
-        <w:rPr>
-          <w:rFonts w:ascii="Times New Roman" w:eastAsiaTheme="minorHAnsi" w:hAnsi="Times New Roman" w:cs="Times New Roman"/>
-          <w:sz w:val="24"/>
-          <w:szCs w:val="20"/>
-        </w:rPr>
-        <w:t xml:space="preserve">Divide and </w:t>
-      </w:r>
-      <w:proofErr w:type="gramStart"/>
-      <w:r>
-        <w:rPr>
-          <w:rFonts w:ascii="Times New Roman" w:eastAsiaTheme="minorHAnsi" w:hAnsi="Times New Roman" w:cs="Times New Roman"/>
-          <w:sz w:val="24"/>
-          <w:szCs w:val="20"/>
-        </w:rPr>
-        <w:t>C</w:t>
-      </w:r>
-      <w:r>
-        <w:rPr>
-          <w:rFonts w:ascii="Times New Roman" w:eastAsiaTheme="minorHAnsi" w:hAnsi="Times New Roman" w:cs="Times New Roman"/>
-          <w:sz w:val="24"/>
-          <w:szCs w:val="20"/>
-        </w:rPr>
-        <w:t>onquer</w:t>
-      </w:r>
-      <w:proofErr w:type="gramEnd"/>
-      <w:r>
-        <w:rPr>
-          <w:rFonts w:ascii="Times New Roman" w:eastAsiaTheme="minorHAnsi" w:hAnsi="Times New Roman" w:cs="Times New Roman"/>
-          <w:sz w:val="24"/>
-          <w:szCs w:val="20"/>
-        </w:rPr>
-        <w:t xml:space="preserve">? How </w:t>
-      </w:r>
-      <w:r>
-        <w:rPr>
-          <w:rFonts w:ascii="Times New Roman" w:eastAsiaTheme="minorHAnsi" w:hAnsi="Times New Roman" w:cs="Times New Roman"/>
-          <w:sz w:val="24"/>
-          <w:szCs w:val="20"/>
-        </w:rPr>
-        <w:t>P</w:t>
-      </w:r>
-      <w:r>
-        <w:rPr>
-          <w:rFonts w:ascii="Times New Roman" w:eastAsiaTheme="minorHAnsi" w:hAnsi="Times New Roman" w:cs="Times New Roman"/>
-          <w:sz w:val="24"/>
-          <w:szCs w:val="20"/>
-        </w:rPr>
-        <w:t xml:space="preserve">artitioned </w:t>
-      </w:r>
-      <w:r>
-        <w:rPr>
-          <w:rFonts w:ascii="Times New Roman" w:eastAsiaTheme="minorHAnsi" w:hAnsi="Times New Roman" w:cs="Times New Roman"/>
-          <w:sz w:val="24"/>
-          <w:szCs w:val="20"/>
-        </w:rPr>
-        <w:t>A</w:t>
-      </w:r>
-      <w:r>
-        <w:rPr>
-          <w:rFonts w:ascii="Times New Roman" w:eastAsiaTheme="minorHAnsi" w:hAnsi="Times New Roman" w:cs="Times New Roman"/>
-          <w:sz w:val="24"/>
-          <w:szCs w:val="20"/>
-        </w:rPr>
-        <w:t xml:space="preserve">udiences </w:t>
-      </w:r>
-      <w:r>
-        <w:rPr>
-          <w:rFonts w:ascii="Times New Roman" w:eastAsiaTheme="minorHAnsi" w:hAnsi="Times New Roman" w:cs="Times New Roman"/>
-          <w:sz w:val="24"/>
-          <w:szCs w:val="20"/>
-        </w:rPr>
-        <w:t>S</w:t>
-      </w:r>
-      <w:r>
-        <w:rPr>
-          <w:rFonts w:ascii="Times New Roman" w:eastAsiaTheme="minorHAnsi" w:hAnsi="Times New Roman" w:cs="Times New Roman"/>
-          <w:sz w:val="24"/>
-          <w:szCs w:val="20"/>
-        </w:rPr>
-        <w:t xml:space="preserve">hape the </w:t>
-      </w:r>
-      <w:r>
-        <w:rPr>
-          <w:rFonts w:ascii="Times New Roman" w:eastAsiaTheme="minorHAnsi" w:hAnsi="Times New Roman" w:cs="Times New Roman"/>
-          <w:sz w:val="24"/>
-          <w:szCs w:val="20"/>
-        </w:rPr>
-        <w:t>I</w:t>
-      </w:r>
-      <w:r>
-        <w:rPr>
-          <w:rFonts w:ascii="Times New Roman" w:eastAsiaTheme="minorHAnsi" w:hAnsi="Times New Roman" w:cs="Times New Roman"/>
-          <w:sz w:val="24"/>
-          <w:szCs w:val="20"/>
-        </w:rPr>
-        <w:t xml:space="preserve">mpact of </w:t>
-      </w:r>
-      <w:r>
-        <w:rPr>
-          <w:rFonts w:ascii="Times New Roman" w:eastAsiaTheme="minorHAnsi" w:hAnsi="Times New Roman" w:cs="Times New Roman"/>
-          <w:sz w:val="24"/>
-          <w:szCs w:val="20"/>
-        </w:rPr>
-        <w:t>D</w:t>
-      </w:r>
-      <w:r>
-        <w:rPr>
-          <w:rFonts w:ascii="Times New Roman" w:eastAsiaTheme="minorHAnsi" w:hAnsi="Times New Roman" w:cs="Times New Roman"/>
-          <w:sz w:val="24"/>
-          <w:szCs w:val="20"/>
-        </w:rPr>
-        <w:t>omain-</w:t>
-      </w:r>
-      <w:r>
-        <w:rPr>
-          <w:rFonts w:ascii="Times New Roman" w:eastAsiaTheme="minorHAnsi" w:hAnsi="Times New Roman" w:cs="Times New Roman"/>
-          <w:sz w:val="24"/>
-          <w:szCs w:val="20"/>
-        </w:rPr>
-        <w:t>S</w:t>
-      </w:r>
-      <w:r>
-        <w:rPr>
-          <w:rFonts w:ascii="Times New Roman" w:eastAsiaTheme="minorHAnsi" w:hAnsi="Times New Roman" w:cs="Times New Roman"/>
-          <w:sz w:val="24"/>
-          <w:szCs w:val="20"/>
-        </w:rPr>
-        <w:t xml:space="preserve">panning </w:t>
-      </w:r>
-      <w:r>
-        <w:rPr>
-          <w:rFonts w:ascii="Times New Roman" w:eastAsiaTheme="minorHAnsi" w:hAnsi="Times New Roman" w:cs="Times New Roman"/>
-          <w:sz w:val="24"/>
-          <w:szCs w:val="20"/>
-        </w:rPr>
-        <w:t>I</w:t>
-      </w:r>
-      <w:r>
-        <w:rPr>
-          <w:rFonts w:ascii="Times New Roman" w:eastAsiaTheme="minorHAnsi" w:hAnsi="Times New Roman" w:cs="Times New Roman"/>
-          <w:sz w:val="24"/>
-          <w:szCs w:val="20"/>
-        </w:rPr>
-        <w:t>nnovation</w:t>
-      </w:r>
-      <w:r>
-        <w:rPr>
-          <w:rFonts w:ascii="Times New Roman" w:eastAsiaTheme="minorHAnsi" w:hAnsi="Times New Roman" w:cs="Times New Roman"/>
-          <w:sz w:val="24"/>
-          <w:szCs w:val="20"/>
-        </w:rPr>
-        <w:t>.” [</w:t>
-      </w:r>
-      <w:r>
-        <w:rPr>
-          <w:rFonts w:ascii="Times New Roman" w:eastAsiaTheme="minorHAnsi" w:hAnsi="Times New Roman" w:cs="Times New Roman"/>
-          <w:sz w:val="24"/>
-          <w:szCs w:val="20"/>
-        </w:rPr>
-        <w:t>Manuscript available</w:t>
-      </w:r>
-      <w:r>
-        <w:rPr>
-          <w:rFonts w:ascii="Times New Roman" w:eastAsiaTheme="minorHAnsi" w:hAnsi="Times New Roman" w:cs="Times New Roman"/>
-          <w:sz w:val="24"/>
-          <w:szCs w:val="20"/>
-        </w:rPr>
-        <w:t>]</w:t>
-      </w:r>
-    </w:p>
-    <w:p>
-      <w:pPr>
-        <w:spacing w:after="240" w:line="276" w:lineRule="auto"/>
-        <w:jc w:val="left"/>
-        <w:rPr>
-          <w:rFonts w:ascii="Times New Roman" w:eastAsiaTheme="minorHAnsi" w:hAnsi="Times New Roman" w:cs="Times New Roman"/>
-          <w:sz w:val="24"/>
-          <w:szCs w:val="20"/>
-        </w:rPr>
-      </w:pPr>
       <w:r>
         <w:rPr>
           <w:rFonts w:ascii="Times New Roman" w:eastAsiaTheme="minorHAnsi" w:hAnsi="Times New Roman" w:cs="Times New Roman"/>
@@ -2642,41 +2512,185 @@
           <w:sz w:val="24"/>
           <w:szCs w:val="20"/>
         </w:rPr>
-        <w:t>Lee, Jina,</w:t>
-      </w:r>
-      <w:r>
-        <w:rPr>
-          <w:rFonts w:ascii="Times New Roman" w:eastAsiaTheme="minorHAnsi" w:hAnsi="Times New Roman" w:cs="Times New Roman"/>
-          <w:sz w:val="24"/>
-          <w:szCs w:val="20"/>
-        </w:rPr>
-        <w:t xml:space="preserve"> </w:t>
-      </w:r>
-      <w:proofErr w:type="spellStart"/>
-      <w:r>
-        <w:rPr>
-          <w:rFonts w:ascii="Times New Roman" w:eastAsiaTheme="minorHAnsi" w:hAnsi="Times New Roman" w:cs="Times New Roman"/>
-          <w:sz w:val="24"/>
-          <w:szCs w:val="20"/>
-        </w:rPr>
-        <w:t>Zhuofan</w:t>
-      </w:r>
-      <w:proofErr w:type="spellEnd"/>
-      <w:r>
-        <w:rPr>
-          <w:rFonts w:ascii="Times New Roman" w:eastAsiaTheme="minorHAnsi" w:hAnsi="Times New Roman" w:cs="Times New Roman"/>
-          <w:sz w:val="24"/>
-          <w:szCs w:val="20"/>
-        </w:rPr>
-        <w:t xml:space="preserve"> Li. “</w:t>
-      </w:r>
-      <w:r>
-        <w:rPr>
-          <w:rFonts w:ascii="Times New Roman" w:eastAsiaTheme="minorHAnsi" w:hAnsi="Times New Roman" w:cs="Times New Roman"/>
-          <w:sz w:val="24"/>
-          <w:szCs w:val="20"/>
-        </w:rPr>
-        <w:t>Conceptual Divergence Analysis for Reflective Auditing</w:t>
+        <w:t>Jina Lee</w:t>
+      </w:r>
+      <w:r>
+        <w:rPr>
+          <w:rFonts w:ascii="Times New Roman" w:eastAsiaTheme="minorHAnsi" w:hAnsi="Times New Roman" w:cs="Times New Roman"/>
+          <w:sz w:val="24"/>
+          <w:szCs w:val="20"/>
+        </w:rPr>
+        <w:t>, Russell Funk</w:t>
+      </w:r>
+      <w:r>
+        <w:rPr>
+          <w:rFonts w:ascii="Times New Roman" w:eastAsiaTheme="minorHAnsi" w:hAnsi="Times New Roman" w:cs="Times New Roman"/>
+          <w:sz w:val="24"/>
+          <w:szCs w:val="20"/>
+        </w:rPr>
+        <w:t xml:space="preserve">, </w:t>
+      </w:r>
+      <w:r>
+        <w:rPr>
+          <w:rFonts w:ascii="Times New Roman" w:eastAsiaTheme="minorHAnsi" w:hAnsi="Times New Roman" w:cs="Times New Roman"/>
+          <w:sz w:val="24"/>
+          <w:szCs w:val="20"/>
+        </w:rPr>
+        <w:t>Erin Leahey</w:t>
+      </w:r>
+      <w:r>
+        <w:rPr>
+          <w:rFonts w:ascii="Times New Roman" w:eastAsiaTheme="minorHAnsi" w:hAnsi="Times New Roman" w:cs="Times New Roman"/>
+          <w:sz w:val="24"/>
+          <w:szCs w:val="20"/>
+        </w:rPr>
+        <w:t>. “</w:t>
+      </w:r>
+      <w:r>
+        <w:rPr>
+          <w:rFonts w:ascii="Times New Roman" w:eastAsiaTheme="minorHAnsi" w:hAnsi="Times New Roman" w:cs="Times New Roman"/>
+          <w:sz w:val="24"/>
+          <w:szCs w:val="20"/>
+        </w:rPr>
+        <w:t xml:space="preserve">Divide and </w:t>
+      </w:r>
+      <w:proofErr w:type="gramStart"/>
+      <w:r>
+        <w:rPr>
+          <w:rFonts w:ascii="Times New Roman" w:eastAsiaTheme="minorHAnsi" w:hAnsi="Times New Roman" w:cs="Times New Roman"/>
+          <w:sz w:val="24"/>
+          <w:szCs w:val="20"/>
+        </w:rPr>
+        <w:t>C</w:t>
+      </w:r>
+      <w:r>
+        <w:rPr>
+          <w:rFonts w:ascii="Times New Roman" w:eastAsiaTheme="minorHAnsi" w:hAnsi="Times New Roman" w:cs="Times New Roman"/>
+          <w:sz w:val="24"/>
+          <w:szCs w:val="20"/>
+        </w:rPr>
+        <w:t>onquer</w:t>
+      </w:r>
+      <w:proofErr w:type="gramEnd"/>
+      <w:r>
+        <w:rPr>
+          <w:rFonts w:ascii="Times New Roman" w:eastAsiaTheme="minorHAnsi" w:hAnsi="Times New Roman" w:cs="Times New Roman"/>
+          <w:sz w:val="24"/>
+          <w:szCs w:val="20"/>
+        </w:rPr>
+        <w:t xml:space="preserve">? How </w:t>
+      </w:r>
+      <w:r>
+        <w:rPr>
+          <w:rFonts w:ascii="Times New Roman" w:eastAsiaTheme="minorHAnsi" w:hAnsi="Times New Roman" w:cs="Times New Roman"/>
+          <w:sz w:val="24"/>
+          <w:szCs w:val="20"/>
+        </w:rPr>
+        <w:t>P</w:t>
+      </w:r>
+      <w:r>
+        <w:rPr>
+          <w:rFonts w:ascii="Times New Roman" w:eastAsiaTheme="minorHAnsi" w:hAnsi="Times New Roman" w:cs="Times New Roman"/>
+          <w:sz w:val="24"/>
+          <w:szCs w:val="20"/>
+        </w:rPr>
+        <w:t xml:space="preserve">artitioned </w:t>
+      </w:r>
+      <w:r>
+        <w:rPr>
+          <w:rFonts w:ascii="Times New Roman" w:eastAsiaTheme="minorHAnsi" w:hAnsi="Times New Roman" w:cs="Times New Roman"/>
+          <w:sz w:val="24"/>
+          <w:szCs w:val="20"/>
+        </w:rPr>
+        <w:t>A</w:t>
+      </w:r>
+      <w:r>
+        <w:rPr>
+          <w:rFonts w:ascii="Times New Roman" w:eastAsiaTheme="minorHAnsi" w:hAnsi="Times New Roman" w:cs="Times New Roman"/>
+          <w:sz w:val="24"/>
+          <w:szCs w:val="20"/>
+        </w:rPr>
+        <w:t xml:space="preserve">udiences </w:t>
+      </w:r>
+      <w:r>
+        <w:rPr>
+          <w:rFonts w:ascii="Times New Roman" w:eastAsiaTheme="minorHAnsi" w:hAnsi="Times New Roman" w:cs="Times New Roman"/>
+          <w:sz w:val="24"/>
+          <w:szCs w:val="20"/>
+        </w:rPr>
+        <w:t>S</w:t>
+      </w:r>
+      <w:r>
+        <w:rPr>
+          <w:rFonts w:ascii="Times New Roman" w:eastAsiaTheme="minorHAnsi" w:hAnsi="Times New Roman" w:cs="Times New Roman"/>
+          <w:sz w:val="24"/>
+          <w:szCs w:val="20"/>
+        </w:rPr>
+        <w:t xml:space="preserve">hape the </w:t>
+      </w:r>
+      <w:r>
+        <w:rPr>
+          <w:rFonts w:ascii="Times New Roman" w:eastAsiaTheme="minorHAnsi" w:hAnsi="Times New Roman" w:cs="Times New Roman"/>
+          <w:sz w:val="24"/>
+          <w:szCs w:val="20"/>
+        </w:rPr>
+        <w:t>I</w:t>
+      </w:r>
+      <w:r>
+        <w:rPr>
+          <w:rFonts w:ascii="Times New Roman" w:eastAsiaTheme="minorHAnsi" w:hAnsi="Times New Roman" w:cs="Times New Roman"/>
+          <w:sz w:val="24"/>
+          <w:szCs w:val="20"/>
+        </w:rPr>
+        <w:t xml:space="preserve">mpact of </w:t>
+      </w:r>
+      <w:r>
+        <w:rPr>
+          <w:rFonts w:ascii="Times New Roman" w:eastAsiaTheme="minorHAnsi" w:hAnsi="Times New Roman" w:cs="Times New Roman"/>
+          <w:sz w:val="24"/>
+          <w:szCs w:val="20"/>
+        </w:rPr>
+        <w:t>D</w:t>
+      </w:r>
+      <w:r>
+        <w:rPr>
+          <w:rFonts w:ascii="Times New Roman" w:eastAsiaTheme="minorHAnsi" w:hAnsi="Times New Roman" w:cs="Times New Roman"/>
+          <w:sz w:val="24"/>
+          <w:szCs w:val="20"/>
+        </w:rPr>
+        <w:t>omain-</w:t>
+      </w:r>
+      <w:r>
+        <w:rPr>
+          <w:rFonts w:ascii="Times New Roman" w:eastAsiaTheme="minorHAnsi" w:hAnsi="Times New Roman" w:cs="Times New Roman"/>
+          <w:sz w:val="24"/>
+          <w:szCs w:val="20"/>
+        </w:rPr>
+        <w:t>S</w:t>
+      </w:r>
+      <w:r>
+        <w:rPr>
+          <w:rFonts w:ascii="Times New Roman" w:eastAsiaTheme="minorHAnsi" w:hAnsi="Times New Roman" w:cs="Times New Roman"/>
+          <w:sz w:val="24"/>
+          <w:szCs w:val="20"/>
+        </w:rPr>
+        <w:t xml:space="preserve">panning </w:t>
+      </w:r>
+      <w:r>
+        <w:rPr>
+          <w:rFonts w:ascii="Times New Roman" w:eastAsiaTheme="minorHAnsi" w:hAnsi="Times New Roman" w:cs="Times New Roman"/>
+          <w:sz w:val="24"/>
+          <w:szCs w:val="20"/>
+        </w:rPr>
+        <w:t>I</w:t>
+      </w:r>
+      <w:r>
+        <w:rPr>
+          <w:rFonts w:ascii="Times New Roman" w:eastAsiaTheme="minorHAnsi" w:hAnsi="Times New Roman" w:cs="Times New Roman"/>
+          <w:sz w:val="24"/>
+          <w:szCs w:val="20"/>
+        </w:rPr>
+        <w:t>nnovation</w:t>
       </w:r>
       <w:r>
         <w:rPr>
@@ -8424,7 +8438,7 @@
         <w:sz w:val="24"/>
         <w:szCs w:val="24"/>
       </w:rPr>
-      <w:t>4</w:t>
+      <w:t>5</w:t>
     </w:r>
     <w:r>
       <w:rPr>
@@ -8440,15 +8454,7 @@
         <w:sz w:val="24"/>
         <w:szCs w:val="24"/>
       </w:rPr>
-      <w:t>2</w:t>
-    </w:r>
-    <w:r>
-      <w:rPr>
-        <w:rFonts w:ascii="Times New Roman" w:eastAsiaTheme="minorHAnsi" w:hAnsi="Times New Roman" w:cs="Times New Roman"/>
-        <w:sz w:val="24"/>
-        <w:szCs w:val="24"/>
-      </w:rPr>
-      <w:t>7</w:t>
+      <w:t>1</w:t>
     </w:r>
     <w:r>
       <w:rPr>

</xml_diff>

<commit_message>
Manual CV update: 2026-05-03 23:20:10 CDT
</commit_message>
<xml_diff>
--- a/public/cv.docx
+++ b/public/cv.docx
@@ -2459,23 +2459,7 @@
           <w:sz w:val="24"/>
           <w:szCs w:val="20"/>
         </w:rPr>
-        <w:t>.” [</w:t>
-      </w:r>
-      <w:r>
-        <w:rPr>
-          <w:rFonts w:ascii="Times New Roman" w:eastAsiaTheme="minorHAnsi" w:hAnsi="Times New Roman" w:cs="Times New Roman"/>
-          <w:sz w:val="24"/>
-          <w:szCs w:val="20"/>
-        </w:rPr>
-        <w:t>Under review</w:t>
-      </w:r>
-      <w:r>
-        <w:rPr>
-          <w:rFonts w:ascii="Times New Roman" w:eastAsiaTheme="minorHAnsi" w:hAnsi="Times New Roman" w:cs="Times New Roman"/>
-          <w:sz w:val="24"/>
-          <w:szCs w:val="20"/>
-        </w:rPr>
-        <w:t>]</w:t>
+        <w:t>.” [Under review]</w:t>
       </w:r>
     </w:p>
     <w:p>
@@ -2751,39 +2735,7 @@
           <w:sz w:val="24"/>
           <w:szCs w:val="20"/>
         </w:rPr>
-        <w:t xml:space="preserve">Who Faces More Doubt in Crisis? Gendered Patterns of Uncertainty in Reception of </w:t>
-      </w:r>
-      <w:r>
-        <w:rPr>
-          <w:rFonts w:ascii="Times New Roman" w:eastAsiaTheme="minorHAnsi" w:hAnsi="Times New Roman" w:cs="Times New Roman" w:hint="eastAsia"/>
-          <w:sz w:val="24"/>
-          <w:szCs w:val="20"/>
-        </w:rPr>
-        <w:t>High-Stake</w:t>
-      </w:r>
-      <w:r>
-        <w:rPr>
-          <w:rFonts w:ascii="Times New Roman" w:eastAsiaTheme="minorHAnsi" w:hAnsi="Times New Roman" w:cs="Times New Roman" w:hint="eastAsia"/>
-          <w:sz w:val="24"/>
-          <w:szCs w:val="20"/>
-        </w:rPr>
-        <w:t>s</w:t>
-      </w:r>
-      <w:r>
-        <w:rPr>
-          <w:rFonts w:ascii="Times New Roman" w:eastAsiaTheme="minorHAnsi" w:hAnsi="Times New Roman" w:cs="Times New Roman"/>
-          <w:sz w:val="24"/>
-          <w:szCs w:val="20"/>
-        </w:rPr>
-        <w:t xml:space="preserve"> </w:t>
-      </w:r>
-      <w:r>
-        <w:rPr>
-          <w:rFonts w:ascii="Times New Roman" w:eastAsiaTheme="minorHAnsi" w:hAnsi="Times New Roman" w:cs="Times New Roman" w:hint="eastAsia"/>
-          <w:sz w:val="24"/>
-          <w:szCs w:val="20"/>
-        </w:rPr>
-        <w:t>Science</w:t>
+        <w:t>Cited but Doubted: Gendered Credibility and the Reception of Scientific Knowledge During COVID-19</w:t>
       </w:r>
       <w:r>
         <w:rPr>
@@ -8450,11 +8402,11 @@
     </w:r>
     <w:r>
       <w:rPr>
-        <w:rFonts w:ascii="Times New Roman" w:eastAsiaTheme="minorHAnsi" w:hAnsi="Times New Roman" w:cs="Times New Roman"/>
+        <w:rFonts w:ascii="Times New Roman" w:eastAsiaTheme="minorHAnsi" w:hAnsi="Times New Roman" w:cs="Times New Roman" w:hint="eastAsia"/>
         <w:sz w:val="24"/>
         <w:szCs w:val="24"/>
       </w:rPr>
-      <w:t>1</w:t>
+      <w:t>3</w:t>
     </w:r>
     <w:r>
       <w:rPr>

</xml_diff>

<commit_message>
Manual CV update: 2026-05-03 23:23:18 CDT
</commit_message>
<xml_diff>
--- a/public/cv.docx
+++ b/public/cv.docx
@@ -2128,25 +2128,7 @@
           <w:sz w:val="24"/>
           <w:szCs w:val="20"/>
         </w:rPr>
-        <w:t xml:space="preserve">, and </w:t>
-      </w:r>
-      <w:proofErr w:type="spellStart"/>
-      <w:r>
-        <w:rPr>
-          <w:rFonts w:ascii="Times New Roman" w:eastAsiaTheme="minorHAnsi" w:hAnsi="Times New Roman" w:cs="Times New Roman"/>
-          <w:sz w:val="24"/>
-          <w:szCs w:val="20"/>
-        </w:rPr>
-        <w:t>Yeaeun</w:t>
-      </w:r>
-      <w:proofErr w:type="spellEnd"/>
-      <w:r>
-        <w:rPr>
-          <w:rFonts w:ascii="Times New Roman" w:eastAsiaTheme="minorHAnsi" w:hAnsi="Times New Roman" w:cs="Times New Roman"/>
-          <w:sz w:val="24"/>
-          <w:szCs w:val="20"/>
-        </w:rPr>
-        <w:t xml:space="preserve"> Kwon. </w:t>
+        <w:t xml:space="preserve">, and Yeaeun Kwon. </w:t>
       </w:r>
       <w:r>
         <w:rPr>
@@ -2409,25 +2391,7 @@
           <w:sz w:val="24"/>
           <w:szCs w:val="20"/>
         </w:rPr>
-        <w:t xml:space="preserve"> </w:t>
-      </w:r>
-      <w:proofErr w:type="spellStart"/>
-      <w:r>
-        <w:rPr>
-          <w:rFonts w:ascii="Times New Roman" w:eastAsiaTheme="minorHAnsi" w:hAnsi="Times New Roman" w:cs="Times New Roman"/>
-          <w:sz w:val="24"/>
-          <w:szCs w:val="20"/>
-        </w:rPr>
-        <w:t>Zhuofan</w:t>
-      </w:r>
-      <w:proofErr w:type="spellEnd"/>
-      <w:r>
-        <w:rPr>
-          <w:rFonts w:ascii="Times New Roman" w:eastAsiaTheme="minorHAnsi" w:hAnsi="Times New Roman" w:cs="Times New Roman"/>
-          <w:sz w:val="24"/>
-          <w:szCs w:val="20"/>
-        </w:rPr>
-        <w:t xml:space="preserve"> Li. “</w:t>
+        <w:t xml:space="preserve"> Zhuofan Li. “</w:t>
       </w:r>
       <w:r>
         <w:rPr>
@@ -2538,7 +2502,6 @@
         </w:rPr>
         <w:t xml:space="preserve">Divide and </w:t>
       </w:r>
-      <w:proofErr w:type="gramStart"/>
       <w:r>
         <w:rPr>
           <w:rFonts w:ascii="Times New Roman" w:eastAsiaTheme="minorHAnsi" w:hAnsi="Times New Roman" w:cs="Times New Roman"/>
@@ -2553,16 +2516,7 @@
           <w:sz w:val="24"/>
           <w:szCs w:val="20"/>
         </w:rPr>
-        <w:t>onquer</w:t>
-      </w:r>
-      <w:proofErr w:type="gramEnd"/>
-      <w:r>
-        <w:rPr>
-          <w:rFonts w:ascii="Times New Roman" w:eastAsiaTheme="minorHAnsi" w:hAnsi="Times New Roman" w:cs="Times New Roman"/>
-          <w:sz w:val="24"/>
-          <w:szCs w:val="20"/>
-        </w:rPr>
-        <w:t xml:space="preserve">? How </w:t>
+        <w:t xml:space="preserve">onquer? How </w:t>
       </w:r>
       <w:r>
         <w:rPr>
@@ -2735,7 +2689,7 @@
           <w:sz w:val="24"/>
           <w:szCs w:val="20"/>
         </w:rPr>
-        <w:t>Cited but Doubted: Gendered Credibility and the Reception of Scientific Knowledge During COVID-19</w:t>
+        <w:t>Cited but Doubted: Gendered Reception of Scientific Knowledge During COVID-19</w:t>
       </w:r>
       <w:r>
         <w:rPr>
@@ -4049,7 +4003,6 @@
         </w:rPr>
         <w:t xml:space="preserve">Divide and </w:t>
       </w:r>
-      <w:proofErr w:type="gramStart"/>
       <w:r>
         <w:rPr>
           <w:rFonts w:ascii="Times New Roman" w:eastAsiaTheme="minorHAnsi" w:hAnsi="Times New Roman" w:cs="Times New Roman"/>
@@ -4064,16 +4017,7 @@
           <w:sz w:val="24"/>
           <w:szCs w:val="20"/>
         </w:rPr>
-        <w:t>onquer</w:t>
-      </w:r>
-      <w:proofErr w:type="gramEnd"/>
-      <w:r>
-        <w:rPr>
-          <w:rFonts w:ascii="Times New Roman" w:eastAsiaTheme="minorHAnsi" w:hAnsi="Times New Roman" w:cs="Times New Roman"/>
-          <w:sz w:val="24"/>
-          <w:szCs w:val="20"/>
-        </w:rPr>
-        <w:t xml:space="preserve">? How </w:t>
+        <w:t xml:space="preserve">onquer? How </w:t>
       </w:r>
       <w:r>
         <w:rPr>
@@ -4307,25 +4251,7 @@
           <w:sz w:val="24"/>
           <w:szCs w:val="20"/>
         </w:rPr>
-        <w:t>” American Sociological Association Methodology Section Mid-</w:t>
-      </w:r>
-      <w:proofErr w:type="gramStart"/>
-      <w:r>
-        <w:rPr>
-          <w:rFonts w:ascii="Times New Roman" w:eastAsiaTheme="minorHAnsi" w:hAnsi="Times New Roman" w:cs="Times New Roman"/>
-          <w:sz w:val="24"/>
-          <w:szCs w:val="20"/>
-        </w:rPr>
-        <w:t>year</w:t>
-      </w:r>
-      <w:proofErr w:type="gramEnd"/>
-      <w:r>
-        <w:rPr>
-          <w:rFonts w:ascii="Times New Roman" w:eastAsiaTheme="minorHAnsi" w:hAnsi="Times New Roman" w:cs="Times New Roman"/>
-          <w:sz w:val="24"/>
-          <w:szCs w:val="20"/>
-        </w:rPr>
-        <w:t xml:space="preserve"> Meeting, Philadelphia, PA.</w:t>
+        <w:t>” American Sociological Association Methodology Section Mid-year Meeting, Philadelphia, PA.</w:t>
       </w:r>
     </w:p>
     <w:p>
@@ -4692,18 +4618,8 @@
           <w:sz w:val="24"/>
           <w:szCs w:val="20"/>
         </w:rPr>
-        <w:t xml:space="preserve">International Society for </w:t>
-      </w:r>
-      <w:proofErr w:type="spellStart"/>
-      <w:r>
-        <w:rPr>
-          <w:rFonts w:ascii="Times New Roman" w:eastAsiaTheme="minorHAnsi" w:hAnsi="Times New Roman" w:cs="Times New Roman"/>
-          <w:sz w:val="24"/>
-          <w:szCs w:val="20"/>
-        </w:rPr>
-        <w:t>Scientometrics</w:t>
-      </w:r>
-      <w:proofErr w:type="spellEnd"/>
+        <w:t>International Society for Scientometrics</w:t>
+      </w:r>
       <w:r>
         <w:rPr>
           <w:rFonts w:ascii="Times New Roman" w:eastAsiaTheme="minorHAnsi" w:hAnsi="Times New Roman" w:cs="Times New Roman"/>
@@ -4718,18 +4634,8 @@
           <w:sz w:val="24"/>
           <w:szCs w:val="20"/>
         </w:rPr>
-        <w:t xml:space="preserve">and </w:t>
-      </w:r>
-      <w:proofErr w:type="spellStart"/>
-      <w:r>
-        <w:rPr>
-          <w:rFonts w:ascii="Times New Roman" w:eastAsiaTheme="minorHAnsi" w:hAnsi="Times New Roman" w:cs="Times New Roman"/>
-          <w:sz w:val="24"/>
-          <w:szCs w:val="20"/>
-        </w:rPr>
-        <w:t>Informetrics</w:t>
-      </w:r>
-      <w:proofErr w:type="spellEnd"/>
+        <w:t>and Informetrics</w:t>
+      </w:r>
       <w:r>
         <w:rPr>
           <w:rFonts w:ascii="Times New Roman" w:eastAsiaTheme="minorHAnsi" w:hAnsi="Times New Roman" w:cs="Times New Roman"/>
@@ -6170,25 +6076,7 @@
           <w:sz w:val="24"/>
           <w:szCs w:val="20"/>
         </w:rPr>
-        <w:t xml:space="preserve">Introduction to Social Statistics (In-Person, </w:t>
-      </w:r>
-      <w:proofErr w:type="gramStart"/>
-      <w:r>
-        <w:rPr>
-          <w:rFonts w:ascii="Times New Roman" w:eastAsia="함초롬바탕" w:hAnsi="Times New Roman" w:cs="Times New Roman"/>
-          <w:sz w:val="24"/>
-          <w:szCs w:val="20"/>
-        </w:rPr>
-        <w:t>Fall</w:t>
-      </w:r>
-      <w:proofErr w:type="gramEnd"/>
-      <w:r>
-        <w:rPr>
-          <w:rFonts w:ascii="Times New Roman" w:eastAsia="함초롬바탕" w:hAnsi="Times New Roman" w:cs="Times New Roman"/>
-          <w:sz w:val="24"/>
-          <w:szCs w:val="20"/>
-        </w:rPr>
-        <w:t xml:space="preserve"> 2024</w:t>
+        <w:t>Introduction to Social Statistics (In-Person, Fall 2024</w:t>
       </w:r>
       <w:r>
         <w:rPr>
@@ -6422,7 +6310,6 @@
         </w:rPr>
         <w:t xml:space="preserve">2026 </w:t>
       </w:r>
-      <w:proofErr w:type="gramStart"/>
       <w:r>
         <w:rPr>
           <w:rFonts w:ascii="Times New Roman" w:eastAsia="함초롬바탕" w:hAnsi="Times New Roman" w:cs="Times New Roman" w:hint="eastAsia"/>
@@ -6447,7 +6334,6 @@
         </w:rPr>
         <w:t>“</w:t>
       </w:r>
-      <w:proofErr w:type="gramEnd"/>
       <w:r>
         <w:rPr>
           <w:rFonts w:ascii="Times New Roman" w:eastAsia="함초롬바탕" w:hAnsi="Times New Roman" w:cs="Times New Roman"/>

</xml_diff>

<commit_message>
Manual CV update: 2026-05-05 02:06:39 CDT
</commit_message>
<xml_diff>
--- a/public/cv.docx
+++ b/public/cv.docx
@@ -2128,7 +2128,25 @@
           <w:sz w:val="24"/>
           <w:szCs w:val="20"/>
         </w:rPr>
-        <w:t xml:space="preserve">, and Yeaeun Kwon. </w:t>
+        <w:t xml:space="preserve">, and </w:t>
+      </w:r>
+      <w:proofErr w:type="spellStart"/>
+      <w:r>
+        <w:rPr>
+          <w:rFonts w:ascii="Times New Roman" w:eastAsiaTheme="minorHAnsi" w:hAnsi="Times New Roman" w:cs="Times New Roman"/>
+          <w:sz w:val="24"/>
+          <w:szCs w:val="20"/>
+        </w:rPr>
+        <w:t>Yeaeun</w:t>
+      </w:r>
+      <w:proofErr w:type="spellEnd"/>
+      <w:r>
+        <w:rPr>
+          <w:rFonts w:ascii="Times New Roman" w:eastAsiaTheme="minorHAnsi" w:hAnsi="Times New Roman" w:cs="Times New Roman"/>
+          <w:sz w:val="24"/>
+          <w:szCs w:val="20"/>
+        </w:rPr>
+        <w:t xml:space="preserve"> Kwon. </w:t>
       </w:r>
       <w:r>
         <w:rPr>
@@ -2391,7 +2409,25 @@
           <w:sz w:val="24"/>
           <w:szCs w:val="20"/>
         </w:rPr>
-        <w:t xml:space="preserve"> Zhuofan Li. “</w:t>
+        <w:t xml:space="preserve"> </w:t>
+      </w:r>
+      <w:proofErr w:type="spellStart"/>
+      <w:r>
+        <w:rPr>
+          <w:rFonts w:ascii="Times New Roman" w:eastAsiaTheme="minorHAnsi" w:hAnsi="Times New Roman" w:cs="Times New Roman"/>
+          <w:sz w:val="24"/>
+          <w:szCs w:val="20"/>
+        </w:rPr>
+        <w:t>Zhuofan</w:t>
+      </w:r>
+      <w:proofErr w:type="spellEnd"/>
+      <w:r>
+        <w:rPr>
+          <w:rFonts w:ascii="Times New Roman" w:eastAsiaTheme="minorHAnsi" w:hAnsi="Times New Roman" w:cs="Times New Roman"/>
+          <w:sz w:val="24"/>
+          <w:szCs w:val="20"/>
+        </w:rPr>
+        <w:t xml:space="preserve"> Li. “</w:t>
       </w:r>
       <w:r>
         <w:rPr>
@@ -2502,6 +2538,7 @@
         </w:rPr>
         <w:t xml:space="preserve">Divide and </w:t>
       </w:r>
+      <w:proofErr w:type="gramStart"/>
       <w:r>
         <w:rPr>
           <w:rFonts w:ascii="Times New Roman" w:eastAsiaTheme="minorHAnsi" w:hAnsi="Times New Roman" w:cs="Times New Roman"/>
@@ -2516,7 +2553,16 @@
           <w:sz w:val="24"/>
           <w:szCs w:val="20"/>
         </w:rPr>
-        <w:t xml:space="preserve">onquer? How </w:t>
+        <w:t>onquer</w:t>
+      </w:r>
+      <w:proofErr w:type="gramEnd"/>
+      <w:r>
+        <w:rPr>
+          <w:rFonts w:ascii="Times New Roman" w:eastAsiaTheme="minorHAnsi" w:hAnsi="Times New Roman" w:cs="Times New Roman"/>
+          <w:sz w:val="24"/>
+          <w:szCs w:val="20"/>
+        </w:rPr>
+        <w:t xml:space="preserve">? How </w:t>
       </w:r>
       <w:r>
         <w:rPr>
@@ -2689,7 +2735,7 @@
           <w:sz w:val="24"/>
           <w:szCs w:val="20"/>
         </w:rPr>
-        <w:t>Cited but Doubted: Gendered Reception of Scientific Knowledge During COVID-19</w:t>
+        <w:t>Cited with Uncertainty: Gendered Credibility in COVID-19 Science</w:t>
       </w:r>
       <w:r>
         <w:rPr>
@@ -2706,91 +2752,6 @@
           <w:szCs w:val="20"/>
         </w:rPr>
         <w:t>” [In progress]</w:t>
-      </w:r>
-    </w:p>
-    <w:p>
-      <w:pPr>
-        <w:spacing w:after="240" w:line="276" w:lineRule="auto"/>
-        <w:jc w:val="left"/>
-        <w:rPr>
-          <w:rFonts w:ascii="Times New Roman" w:eastAsiaTheme="minorHAnsi" w:hAnsi="Times New Roman" w:cs="Times New Roman"/>
-          <w:sz w:val="24"/>
-          <w:szCs w:val="20"/>
-        </w:rPr>
-      </w:pPr>
-      <w:r>
-        <w:rPr>
-          <w:rFonts w:ascii="Times New Roman" w:eastAsiaTheme="minorHAnsi" w:hAnsi="Times New Roman" w:cs="Times New Roman"/>
-          <w:sz w:val="24"/>
-          <w:szCs w:val="20"/>
-        </w:rPr>
-        <w:t xml:space="preserve">Hyejin Jeon, </w:t>
-      </w:r>
-      <w:r>
-        <w:rPr>
-          <w:rFonts w:ascii="Times New Roman" w:eastAsiaTheme="minorHAnsi" w:hAnsi="Times New Roman" w:cs="Times New Roman"/>
-          <w:b/>
-          <w:bCs/>
-          <w:sz w:val="24"/>
-          <w:szCs w:val="20"/>
-        </w:rPr>
-        <w:t>Jina Lee</w:t>
-      </w:r>
-      <w:r>
-        <w:rPr>
-          <w:rFonts w:ascii="Times New Roman" w:eastAsiaTheme="minorHAnsi" w:hAnsi="Times New Roman" w:cs="Times New Roman"/>
-          <w:sz w:val="24"/>
-          <w:szCs w:val="20"/>
-        </w:rPr>
-        <w:t>.</w:t>
-      </w:r>
-      <w:r>
-        <w:rPr>
-          <w:rFonts w:ascii="Times New Roman" w:eastAsiaTheme="minorHAnsi" w:hAnsi="Times New Roman" w:cs="Times New Roman"/>
-          <w:sz w:val="24"/>
-          <w:szCs w:val="20"/>
-        </w:rPr>
-        <w:t xml:space="preserve"> “</w:t>
-      </w:r>
-      <w:r>
-        <w:rPr>
-          <w:rFonts w:ascii="Times New Roman" w:eastAsiaTheme="minorHAnsi" w:hAnsi="Times New Roman" w:cs="Times New Roman"/>
-          <w:sz w:val="24"/>
-          <w:szCs w:val="20"/>
-        </w:rPr>
-        <w:t>Convergent Volume, Divergent Framing Across Political Ideology:</w:t>
-      </w:r>
-      <w:r>
-        <w:rPr>
-          <w:rFonts w:ascii="Times New Roman" w:eastAsiaTheme="minorHAnsi" w:hAnsi="Times New Roman" w:cs="Times New Roman"/>
-          <w:sz w:val="24"/>
-          <w:szCs w:val="20"/>
-        </w:rPr>
-        <w:t xml:space="preserve"> </w:t>
-      </w:r>
-      <w:r>
-        <w:rPr>
-          <w:rFonts w:ascii="Times New Roman" w:eastAsiaTheme="minorHAnsi" w:hAnsi="Times New Roman" w:cs="Times New Roman"/>
-          <w:sz w:val="24"/>
-          <w:szCs w:val="20"/>
-        </w:rPr>
-        <w:t>Digital Feminist Mobilization and Sexual Violence Reporting in Korean News, 2000-2025</w:t>
-      </w:r>
-      <w:r>
-        <w:rPr>
-          <w:rFonts w:ascii="Times New Roman" w:eastAsiaTheme="minorHAnsi" w:hAnsi="Times New Roman" w:cs="Times New Roman"/>
-          <w:sz w:val="24"/>
-          <w:szCs w:val="20"/>
-        </w:rPr>
-        <w:t>.”</w:t>
-      </w:r>
-      <w:r>
-        <w:rPr>
-          <w:rFonts w:ascii="Times New Roman" w:eastAsiaTheme="minorHAnsi" w:hAnsi="Times New Roman" w:cs="Times New Roman"/>
-          <w:sz w:val="24"/>
-          <w:szCs w:val="20"/>
-        </w:rPr>
-        <w:t xml:space="preserve"> [In progress]</w:t>
       </w:r>
     </w:p>
     <w:p>
@@ -3054,16 +3015,7 @@
           <w:sz w:val="24"/>
           <w:szCs w:val="20"/>
         </w:rPr>
-        <w:t xml:space="preserve">Selective Recognition: Gendered Recognition of Different Types of </w:t>
-      </w:r>
-      <w:r>
-        <w:rPr>
-          <w:rFonts w:ascii="Times New Roman" w:eastAsiaTheme="minorHAnsi" w:hAnsi="Times New Roman" w:cs="Times New Roman"/>
-          <w:sz w:val="24"/>
-          <w:szCs w:val="20"/>
-        </w:rPr>
-        <w:lastRenderedPageBreak/>
-        <w:t>Scientific Novelty</w:t>
+        <w:t>Selective Recognition: Gendered Recognition of Different Types of Scientific Novelty</w:t>
       </w:r>
       <w:r>
         <w:rPr>
@@ -3202,7 +3154,16 @@
           <w:sz w:val="24"/>
           <w:szCs w:val="20"/>
         </w:rPr>
-        <w:t>, Northwestern University, Evanston, IL.</w:t>
+        <w:t xml:space="preserve">, Northwestern </w:t>
+      </w:r>
+      <w:r>
+        <w:rPr>
+          <w:rFonts w:ascii="Times New Roman" w:eastAsiaTheme="minorHAnsi" w:hAnsi="Times New Roman" w:cs="Times New Roman"/>
+          <w:sz w:val="24"/>
+          <w:szCs w:val="20"/>
+        </w:rPr>
+        <w:lastRenderedPageBreak/>
+        <w:t>University, Evanston, IL.</w:t>
       </w:r>
     </w:p>
     <w:p>
@@ -4003,6 +3964,7 @@
         </w:rPr>
         <w:t xml:space="preserve">Divide and </w:t>
       </w:r>
+      <w:proofErr w:type="gramStart"/>
       <w:r>
         <w:rPr>
           <w:rFonts w:ascii="Times New Roman" w:eastAsiaTheme="minorHAnsi" w:hAnsi="Times New Roman" w:cs="Times New Roman"/>
@@ -4017,7 +3979,16 @@
           <w:sz w:val="24"/>
           <w:szCs w:val="20"/>
         </w:rPr>
-        <w:t xml:space="preserve">onquer? How </w:t>
+        <w:t>onquer</w:t>
+      </w:r>
+      <w:proofErr w:type="gramEnd"/>
+      <w:r>
+        <w:rPr>
+          <w:rFonts w:ascii="Times New Roman" w:eastAsiaTheme="minorHAnsi" w:hAnsi="Times New Roman" w:cs="Times New Roman"/>
+          <w:sz w:val="24"/>
+          <w:szCs w:val="20"/>
+        </w:rPr>
+        <w:t xml:space="preserve">? How </w:t>
       </w:r>
       <w:r>
         <w:rPr>
@@ -4251,7 +4222,25 @@
           <w:sz w:val="24"/>
           <w:szCs w:val="20"/>
         </w:rPr>
-        <w:t>” American Sociological Association Methodology Section Mid-year Meeting, Philadelphia, PA.</w:t>
+        <w:t>” American Sociological Association Methodology Section Mid-</w:t>
+      </w:r>
+      <w:proofErr w:type="gramStart"/>
+      <w:r>
+        <w:rPr>
+          <w:rFonts w:ascii="Times New Roman" w:eastAsiaTheme="minorHAnsi" w:hAnsi="Times New Roman" w:cs="Times New Roman"/>
+          <w:sz w:val="24"/>
+          <w:szCs w:val="20"/>
+        </w:rPr>
+        <w:t>year</w:t>
+      </w:r>
+      <w:proofErr w:type="gramEnd"/>
+      <w:r>
+        <w:rPr>
+          <w:rFonts w:ascii="Times New Roman" w:eastAsiaTheme="minorHAnsi" w:hAnsi="Times New Roman" w:cs="Times New Roman"/>
+          <w:sz w:val="24"/>
+          <w:szCs w:val="20"/>
+        </w:rPr>
+        <w:t xml:space="preserve"> Meeting, Philadelphia, PA.</w:t>
       </w:r>
     </w:p>
     <w:p>
@@ -4551,7 +4540,6 @@
           <w:sz w:val="24"/>
           <w:szCs w:val="20"/>
         </w:rPr>
-        <w:lastRenderedPageBreak/>
         <w:t>2023</w:t>
       </w:r>
       <w:r>
@@ -4618,8 +4606,18 @@
           <w:sz w:val="24"/>
           <w:szCs w:val="20"/>
         </w:rPr>
-        <w:t>International Society for Scientometrics</w:t>
-      </w:r>
+        <w:t xml:space="preserve">International Society for </w:t>
+      </w:r>
+      <w:proofErr w:type="spellStart"/>
+      <w:r>
+        <w:rPr>
+          <w:rFonts w:ascii="Times New Roman" w:eastAsiaTheme="minorHAnsi" w:hAnsi="Times New Roman" w:cs="Times New Roman"/>
+          <w:sz w:val="24"/>
+          <w:szCs w:val="20"/>
+        </w:rPr>
+        <w:t>Scientometrics</w:t>
+      </w:r>
+      <w:proofErr w:type="spellEnd"/>
       <w:r>
         <w:rPr>
           <w:rFonts w:ascii="Times New Roman" w:eastAsiaTheme="minorHAnsi" w:hAnsi="Times New Roman" w:cs="Times New Roman"/>
@@ -4634,8 +4632,18 @@
           <w:sz w:val="24"/>
           <w:szCs w:val="20"/>
         </w:rPr>
-        <w:t>and Informetrics</w:t>
-      </w:r>
+        <w:t xml:space="preserve">and </w:t>
+      </w:r>
+      <w:proofErr w:type="spellStart"/>
+      <w:r>
+        <w:rPr>
+          <w:rFonts w:ascii="Times New Roman" w:eastAsiaTheme="minorHAnsi" w:hAnsi="Times New Roman" w:cs="Times New Roman"/>
+          <w:sz w:val="24"/>
+          <w:szCs w:val="20"/>
+        </w:rPr>
+        <w:t>Informetrics</w:t>
+      </w:r>
+      <w:proofErr w:type="spellEnd"/>
       <w:r>
         <w:rPr>
           <w:rFonts w:ascii="Times New Roman" w:eastAsiaTheme="minorHAnsi" w:hAnsi="Times New Roman" w:cs="Times New Roman"/>
@@ -4821,6 +4829,14 @@
           <w:szCs w:val="20"/>
         </w:rPr>
         <w:br/>
+      </w:r>
+      <w:r>
+        <w:rPr>
+          <w:rFonts w:ascii="Times New Roman" w:eastAsiaTheme="minorHAnsi" w:hAnsi="Times New Roman" w:cs="Times New Roman"/>
+          <w:sz w:val="24"/>
+          <w:szCs w:val="20"/>
+        </w:rPr>
+        <w:lastRenderedPageBreak/>
         <w:t xml:space="preserve"> </w:t>
       </w:r>
       <w:r>
@@ -6076,7 +6092,25 @@
           <w:sz w:val="24"/>
           <w:szCs w:val="20"/>
         </w:rPr>
-        <w:t>Introduction to Social Statistics (In-Person, Fall 2024</w:t>
+        <w:t xml:space="preserve">Introduction to Social Statistics (In-Person, </w:t>
+      </w:r>
+      <w:proofErr w:type="gramStart"/>
+      <w:r>
+        <w:rPr>
+          <w:rFonts w:ascii="Times New Roman" w:eastAsia="함초롬바탕" w:hAnsi="Times New Roman" w:cs="Times New Roman"/>
+          <w:sz w:val="24"/>
+          <w:szCs w:val="20"/>
+        </w:rPr>
+        <w:t>Fall</w:t>
+      </w:r>
+      <w:proofErr w:type="gramEnd"/>
+      <w:r>
+        <w:rPr>
+          <w:rFonts w:ascii="Times New Roman" w:eastAsia="함초롬바탕" w:hAnsi="Times New Roman" w:cs="Times New Roman"/>
+          <w:sz w:val="24"/>
+          <w:szCs w:val="20"/>
+        </w:rPr>
+        <w:t xml:space="preserve"> 2024</w:t>
       </w:r>
       <w:r>
         <w:rPr>
@@ -6138,9 +6172,7 @@
     </w:p>
     <w:p>
       <w:pPr>
-        <w:pStyle w:val="ListParagraph"/>
         <w:spacing w:line="276" w:lineRule="auto"/>
-        <w:ind w:leftChars="0" w:left="720"/>
         <w:jc w:val="left"/>
         <w:rPr>
           <w:rFonts w:ascii="Times New Roman" w:eastAsia="함초롬바탕" w:hAnsi="Times New Roman" w:cs="Times New Roman"/>
@@ -6169,7 +6201,6 @@
           <w:sz w:val="24"/>
           <w:szCs w:val="20"/>
         </w:rPr>
-        <w:lastRenderedPageBreak/>
         <w:t xml:space="preserve">At </w:t>
       </w:r>
       <w:r>
@@ -6264,15 +6295,13 @@
         <w:jc w:val="left"/>
         <w:rPr>
           <w:rFonts w:ascii="Times New Roman" w:eastAsia="함초롬바탕" w:hAnsi="Times New Roman" w:cs="Times New Roman"/>
-          <w:sz w:val="24"/>
-          <w:szCs w:val="20"/>
-        </w:rPr>
-      </w:pPr>
-    </w:p>
-    <w:p>
-      <w:pPr>
-        <w:spacing w:line="276" w:lineRule="auto"/>
-        <w:jc w:val="left"/>
+          <w:b/>
+          <w:bCs/>
+          <w:sz w:val="24"/>
+          <w:szCs w:val="20"/>
+        </w:rPr>
+      </w:pPr>
+      <w:r>
         <w:rPr>
           <w:rFonts w:ascii="Times New Roman" w:eastAsia="함초롬바탕" w:hAnsi="Times New Roman" w:cs="Times New Roman"/>
           <w:b/>
@@ -6280,59 +6309,61 @@
           <w:sz w:val="24"/>
           <w:szCs w:val="20"/>
         </w:rPr>
-      </w:pPr>
-      <w:r>
+        <w:lastRenderedPageBreak/>
+        <w:t>Workshops &amp; Guest Lectures</w:t>
+      </w:r>
+    </w:p>
+    <w:p>
+      <w:pPr>
+        <w:spacing w:line="276" w:lineRule="auto"/>
+        <w:jc w:val="left"/>
         <w:rPr>
           <w:rFonts w:ascii="Times New Roman" w:eastAsia="함초롬바탕" w:hAnsi="Times New Roman" w:cs="Times New Roman"/>
-          <w:b/>
-          <w:bCs/>
-          <w:sz w:val="24"/>
-          <w:szCs w:val="20"/>
-        </w:rPr>
-        <w:t>Workshops &amp; Guest Lectures</w:t>
-      </w:r>
-    </w:p>
-    <w:p>
-      <w:pPr>
-        <w:spacing w:line="276" w:lineRule="auto"/>
-        <w:jc w:val="left"/>
+          <w:sz w:val="24"/>
+          <w:szCs w:val="20"/>
+        </w:rPr>
+      </w:pPr>
+      <w:r>
+        <w:rPr>
+          <w:rFonts w:ascii="Times New Roman" w:eastAsia="함초롬바탕" w:hAnsi="Times New Roman" w:cs="Times New Roman" w:hint="eastAsia"/>
+          <w:sz w:val="24"/>
+          <w:szCs w:val="20"/>
+        </w:rPr>
+        <w:t xml:space="preserve">2026 </w:t>
+      </w:r>
+      <w:proofErr w:type="gramStart"/>
+      <w:r>
+        <w:rPr>
+          <w:rFonts w:ascii="Times New Roman" w:eastAsia="함초롬바탕" w:hAnsi="Times New Roman" w:cs="Times New Roman" w:hint="eastAsia"/>
+          <w:sz w:val="24"/>
+          <w:szCs w:val="20"/>
+        </w:rPr>
+        <w:t xml:space="preserve">  </w:t>
+      </w:r>
+      <w:r>
+        <w:rPr>
+          <w:rFonts w:ascii="Times New Roman" w:eastAsia="함초롬바탕" w:hAnsi="Times New Roman" w:cs="Times New Roman" w:hint="eastAsia"/>
+          <w:sz w:val="24"/>
+          <w:szCs w:val="20"/>
+        </w:rPr>
+        <w:t xml:space="preserve"> </w:t>
+      </w:r>
+      <w:r>
         <w:rPr>
           <w:rFonts w:ascii="Times New Roman" w:eastAsia="함초롬바탕" w:hAnsi="Times New Roman" w:cs="Times New Roman"/>
           <w:sz w:val="24"/>
           <w:szCs w:val="20"/>
         </w:rPr>
-      </w:pPr>
-      <w:r>
-        <w:rPr>
-          <w:rFonts w:ascii="Times New Roman" w:eastAsia="함초롬바탕" w:hAnsi="Times New Roman" w:cs="Times New Roman" w:hint="eastAsia"/>
-          <w:sz w:val="24"/>
-          <w:szCs w:val="20"/>
-        </w:rPr>
-        <w:t xml:space="preserve">2026 </w:t>
-      </w:r>
-      <w:r>
-        <w:rPr>
-          <w:rFonts w:ascii="Times New Roman" w:eastAsia="함초롬바탕" w:hAnsi="Times New Roman" w:cs="Times New Roman" w:hint="eastAsia"/>
-          <w:sz w:val="24"/>
-          <w:szCs w:val="20"/>
-        </w:rPr>
-        <w:t xml:space="preserve">  </w:t>
-      </w:r>
-      <w:r>
-        <w:rPr>
-          <w:rFonts w:ascii="Times New Roman" w:eastAsia="함초롬바탕" w:hAnsi="Times New Roman" w:cs="Times New Roman" w:hint="eastAsia"/>
-          <w:sz w:val="24"/>
-          <w:szCs w:val="20"/>
-        </w:rPr>
-        <w:t xml:space="preserve"> </w:t>
-      </w:r>
+        <w:t>“</w:t>
+      </w:r>
+      <w:proofErr w:type="gramEnd"/>
       <w:r>
         <w:rPr>
           <w:rFonts w:ascii="Times New Roman" w:eastAsia="함초롬바탕" w:hAnsi="Times New Roman" w:cs="Times New Roman"/>
           <w:sz w:val="24"/>
           <w:szCs w:val="20"/>
         </w:rPr>
-        <w:t>“</w:t>
+        <w:t xml:space="preserve">Setting up </w:t>
       </w:r>
       <w:r>
         <w:rPr>
@@ -6340,7 +6371,15 @@
           <w:sz w:val="24"/>
           <w:szCs w:val="20"/>
         </w:rPr>
-        <w:t>Setting up an Agentic AI as a Research Assistant.</w:t>
+        <w:t>an AI Agent for Automated Research Flow</w:t>
+      </w:r>
+      <w:r>
+        <w:rPr>
+          <w:rFonts w:ascii="Times New Roman" w:eastAsia="함초롬바탕" w:hAnsi="Times New Roman" w:cs="Times New Roman"/>
+          <w:sz w:val="24"/>
+          <w:szCs w:val="20"/>
+        </w:rPr>
+        <w:t>.</w:t>
       </w:r>
       <w:r>
         <w:rPr>
@@ -7475,7 +7514,7 @@
           <w:sz w:val="24"/>
           <w:szCs w:val="24"/>
         </w:rPr>
-        <w:t xml:space="preserve"> of Sociology at the University of Illinois at Urbana-Champaign</w:t>
+        <w:t xml:space="preserve"> of Sociology</w:t>
       </w:r>
       <w:r>
         <w:rPr>
@@ -7579,7 +7618,7 @@
           <w:sz w:val="24"/>
           <w:szCs w:val="24"/>
         </w:rPr>
-        <w:t xml:space="preserve"> of Sociology at the University of Illinois at Urbana-Champaign</w:t>
+        <w:t xml:space="preserve"> of Sociology</w:t>
       </w:r>
       <w:r>
         <w:rPr>
@@ -7691,7 +7730,7 @@
           <w:sz w:val="24"/>
           <w:szCs w:val="24"/>
         </w:rPr>
-        <w:t xml:space="preserve"> of Sociology at the University of Illinois at Urbana-Champaign</w:t>
+        <w:t xml:space="preserve"> of Sociology</w:t>
       </w:r>
       <w:r>
         <w:rPr>
@@ -7716,6 +7755,21 @@
           <w:shd w:val="clear" w:color="auto" w:fill="FFFFFF"/>
         </w:rPr>
       </w:pPr>
+    </w:p>
+    <w:p>
+      <w:pPr>
+        <w:spacing w:line="276" w:lineRule="auto"/>
+        <w:jc w:val="left"/>
+        <w:rPr>
+          <w:rFonts w:ascii="Times New Roman" w:hAnsi="Times New Roman" w:cs="Times New Roman"/>
+          <w:b/>
+          <w:bCs/>
+          <w:color w:val="000000"/>
+          <w:sz w:val="24"/>
+          <w:szCs w:val="24"/>
+          <w:shd w:val="clear" w:color="auto" w:fill="FFFFFF"/>
+        </w:rPr>
+      </w:pPr>
       <w:r>
         <w:rPr>
           <w:rFonts w:ascii="Times New Roman" w:hAnsi="Times New Roman" w:cs="Times New Roman" w:hint="eastAsia"/>
@@ -7726,7 +7780,6 @@
           <w:szCs w:val="24"/>
           <w:shd w:val="clear" w:color="auto" w:fill="FFFFFF"/>
         </w:rPr>
-        <w:lastRenderedPageBreak/>
         <w:t>Service to the University of Arizona</w:t>
       </w:r>
     </w:p>
@@ -7840,23 +7893,7 @@
       </w:r>
       <w:r>
         <w:rPr>
-          <w:rFonts w:ascii="Times New Roman" w:eastAsiaTheme="minorHAnsi" w:hAnsi="Times New Roman" w:cs="Times New Roman" w:hint="eastAsia"/>
-          <w:sz w:val="24"/>
-          <w:szCs w:val="24"/>
-        </w:rPr>
-        <w:t xml:space="preserve"> at the </w:t>
-      </w:r>
-      <w:r>
-        <w:rPr>
-          <w:rFonts w:ascii="Times New Roman" w:eastAsiaTheme="minorHAnsi" w:hAnsi="Times New Roman" w:cs="Times New Roman"/>
-          <w:sz w:val="24"/>
-          <w:szCs w:val="24"/>
-        </w:rPr>
-        <w:t>University of Arizona</w:t>
-      </w:r>
-      <w:r>
-        <w:rPr>
-          <w:rFonts w:ascii="Times New Roman" w:eastAsiaTheme="minorHAnsi" w:hAnsi="Times New Roman" w:cs="Times New Roman" w:hint="eastAsia"/>
+          <w:rFonts w:ascii="Times New Roman" w:eastAsiaTheme="minorHAnsi" w:hAnsi="Times New Roman" w:cs="Times New Roman"/>
           <w:sz w:val="24"/>
           <w:szCs w:val="24"/>
         </w:rPr>
@@ -7938,23 +7975,13 @@
       </w:r>
       <w:r>
         <w:rPr>
-          <w:rFonts w:ascii="Times New Roman" w:hAnsi="Times New Roman" w:cs="Times New Roman" w:hint="eastAsia"/>
-          <w:color w:val="000000"/>
-          <w:sz w:val="24"/>
-          <w:szCs w:val="24"/>
-          <w:shd w:val="clear" w:color="auto" w:fill="FFFFFF"/>
-        </w:rPr>
-        <w:t xml:space="preserve"> at the</w:t>
-      </w:r>
-      <w:r>
-        <w:rPr>
           <w:rFonts w:ascii="Times New Roman" w:hAnsi="Times New Roman" w:cs="Times New Roman"/>
           <w:color w:val="000000"/>
           <w:sz w:val="24"/>
           <w:szCs w:val="24"/>
           <w:shd w:val="clear" w:color="auto" w:fill="FFFFFF"/>
         </w:rPr>
-        <w:t xml:space="preserve"> University of Arizona</w:t>
+        <w:t>.</w:t>
       </w:r>
     </w:p>
     <w:p>
@@ -8059,23 +8086,7 @@
       </w:r>
       <w:r>
         <w:rPr>
-          <w:rFonts w:ascii="Times New Roman" w:eastAsiaTheme="minorHAnsi" w:hAnsi="Times New Roman" w:cs="Times New Roman" w:hint="eastAsia"/>
-          <w:sz w:val="24"/>
-          <w:szCs w:val="24"/>
-        </w:rPr>
-        <w:t xml:space="preserve"> at the </w:t>
-      </w:r>
-      <w:r>
-        <w:rPr>
-          <w:rFonts w:ascii="Times New Roman" w:eastAsiaTheme="minorHAnsi" w:hAnsi="Times New Roman" w:cs="Times New Roman"/>
-          <w:sz w:val="24"/>
-          <w:szCs w:val="24"/>
-        </w:rPr>
-        <w:t>University of Arizona</w:t>
-      </w:r>
-      <w:r>
-        <w:rPr>
-          <w:rFonts w:ascii="Times New Roman" w:eastAsiaTheme="minorHAnsi" w:hAnsi="Times New Roman" w:cs="Times New Roman" w:hint="eastAsia"/>
+          <w:rFonts w:ascii="Times New Roman" w:eastAsiaTheme="minorHAnsi" w:hAnsi="Times New Roman" w:cs="Times New Roman"/>
           <w:sz w:val="24"/>
           <w:szCs w:val="24"/>
         </w:rPr>
@@ -8288,11 +8299,11 @@
     </w:r>
     <w:r>
       <w:rPr>
-        <w:rFonts w:ascii="Times New Roman" w:eastAsiaTheme="minorHAnsi" w:hAnsi="Times New Roman" w:cs="Times New Roman" w:hint="eastAsia"/>
+        <w:rFonts w:ascii="Times New Roman" w:eastAsiaTheme="minorHAnsi" w:hAnsi="Times New Roman" w:cs="Times New Roman"/>
         <w:sz w:val="24"/>
         <w:szCs w:val="24"/>
       </w:rPr>
-      <w:t>3</w:t>
+      <w:t>5</w:t>
     </w:r>
     <w:r>
       <w:rPr>

</xml_diff>

<commit_message>
Manual CV update: 2026-05-05 11:33:27 CDT
</commit_message>
<xml_diff>
--- a/public/cv.docx
+++ b/public/cv.docx
@@ -2128,25 +2128,7 @@
           <w:sz w:val="24"/>
           <w:szCs w:val="20"/>
         </w:rPr>
-        <w:t xml:space="preserve">, and </w:t>
-      </w:r>
-      <w:proofErr w:type="spellStart"/>
-      <w:r>
-        <w:rPr>
-          <w:rFonts w:ascii="Times New Roman" w:eastAsiaTheme="minorHAnsi" w:hAnsi="Times New Roman" w:cs="Times New Roman"/>
-          <w:sz w:val="24"/>
-          <w:szCs w:val="20"/>
-        </w:rPr>
-        <w:t>Yeaeun</w:t>
-      </w:r>
-      <w:proofErr w:type="spellEnd"/>
-      <w:r>
-        <w:rPr>
-          <w:rFonts w:ascii="Times New Roman" w:eastAsiaTheme="minorHAnsi" w:hAnsi="Times New Roman" w:cs="Times New Roman"/>
-          <w:sz w:val="24"/>
-          <w:szCs w:val="20"/>
-        </w:rPr>
-        <w:t xml:space="preserve"> Kwon. </w:t>
+        <w:t xml:space="preserve">, and Yeaeun Kwon. </w:t>
       </w:r>
       <w:r>
         <w:rPr>
@@ -2409,25 +2391,7 @@
           <w:sz w:val="24"/>
           <w:szCs w:val="20"/>
         </w:rPr>
-        <w:t xml:space="preserve"> </w:t>
-      </w:r>
-      <w:proofErr w:type="spellStart"/>
-      <w:r>
-        <w:rPr>
-          <w:rFonts w:ascii="Times New Roman" w:eastAsiaTheme="minorHAnsi" w:hAnsi="Times New Roman" w:cs="Times New Roman"/>
-          <w:sz w:val="24"/>
-          <w:szCs w:val="20"/>
-        </w:rPr>
-        <w:t>Zhuofan</w:t>
-      </w:r>
-      <w:proofErr w:type="spellEnd"/>
-      <w:r>
-        <w:rPr>
-          <w:rFonts w:ascii="Times New Roman" w:eastAsiaTheme="minorHAnsi" w:hAnsi="Times New Roman" w:cs="Times New Roman"/>
-          <w:sz w:val="24"/>
-          <w:szCs w:val="20"/>
-        </w:rPr>
-        <w:t xml:space="preserve"> Li. “</w:t>
+        <w:t xml:space="preserve"> Zhuofan Li. “</w:t>
       </w:r>
       <w:r>
         <w:rPr>
@@ -2538,7 +2502,6 @@
         </w:rPr>
         <w:t xml:space="preserve">Divide and </w:t>
       </w:r>
-      <w:proofErr w:type="gramStart"/>
       <w:r>
         <w:rPr>
           <w:rFonts w:ascii="Times New Roman" w:eastAsiaTheme="minorHAnsi" w:hAnsi="Times New Roman" w:cs="Times New Roman"/>
@@ -2553,16 +2516,7 @@
           <w:sz w:val="24"/>
           <w:szCs w:val="20"/>
         </w:rPr>
-        <w:t>onquer</w:t>
-      </w:r>
-      <w:proofErr w:type="gramEnd"/>
-      <w:r>
-        <w:rPr>
-          <w:rFonts w:ascii="Times New Roman" w:eastAsiaTheme="minorHAnsi" w:hAnsi="Times New Roman" w:cs="Times New Roman"/>
-          <w:sz w:val="24"/>
-          <w:szCs w:val="20"/>
-        </w:rPr>
-        <w:t xml:space="preserve">? How </w:t>
+        <w:t xml:space="preserve">onquer? How </w:t>
       </w:r>
       <w:r>
         <w:rPr>
@@ -3964,7 +3918,6 @@
         </w:rPr>
         <w:t xml:space="preserve">Divide and </w:t>
       </w:r>
-      <w:proofErr w:type="gramStart"/>
       <w:r>
         <w:rPr>
           <w:rFonts w:ascii="Times New Roman" w:eastAsiaTheme="minorHAnsi" w:hAnsi="Times New Roman" w:cs="Times New Roman"/>
@@ -3979,16 +3932,7 @@
           <w:sz w:val="24"/>
           <w:szCs w:val="20"/>
         </w:rPr>
-        <w:t>onquer</w:t>
-      </w:r>
-      <w:proofErr w:type="gramEnd"/>
-      <w:r>
-        <w:rPr>
-          <w:rFonts w:ascii="Times New Roman" w:eastAsiaTheme="minorHAnsi" w:hAnsi="Times New Roman" w:cs="Times New Roman"/>
-          <w:sz w:val="24"/>
-          <w:szCs w:val="20"/>
-        </w:rPr>
-        <w:t xml:space="preserve">? How </w:t>
+        <w:t xml:space="preserve">onquer? How </w:t>
       </w:r>
       <w:r>
         <w:rPr>
@@ -4222,25 +4166,7 @@
           <w:sz w:val="24"/>
           <w:szCs w:val="20"/>
         </w:rPr>
-        <w:t>” American Sociological Association Methodology Section Mid-</w:t>
-      </w:r>
-      <w:proofErr w:type="gramStart"/>
-      <w:r>
-        <w:rPr>
-          <w:rFonts w:ascii="Times New Roman" w:eastAsiaTheme="minorHAnsi" w:hAnsi="Times New Roman" w:cs="Times New Roman"/>
-          <w:sz w:val="24"/>
-          <w:szCs w:val="20"/>
-        </w:rPr>
-        <w:t>year</w:t>
-      </w:r>
-      <w:proofErr w:type="gramEnd"/>
-      <w:r>
-        <w:rPr>
-          <w:rFonts w:ascii="Times New Roman" w:eastAsiaTheme="minorHAnsi" w:hAnsi="Times New Roman" w:cs="Times New Roman"/>
-          <w:sz w:val="24"/>
-          <w:szCs w:val="20"/>
-        </w:rPr>
-        <w:t xml:space="preserve"> Meeting, Philadelphia, PA.</w:t>
+        <w:t>” American Sociological Association Methodology Section Mid-year Meeting, Philadelphia, PA.</w:t>
       </w:r>
     </w:p>
     <w:p>
@@ -4606,18 +4532,8 @@
           <w:sz w:val="24"/>
           <w:szCs w:val="20"/>
         </w:rPr>
-        <w:t xml:space="preserve">International Society for </w:t>
-      </w:r>
-      <w:proofErr w:type="spellStart"/>
-      <w:r>
-        <w:rPr>
-          <w:rFonts w:ascii="Times New Roman" w:eastAsiaTheme="minorHAnsi" w:hAnsi="Times New Roman" w:cs="Times New Roman"/>
-          <w:sz w:val="24"/>
-          <w:szCs w:val="20"/>
-        </w:rPr>
-        <w:t>Scientometrics</w:t>
-      </w:r>
-      <w:proofErr w:type="spellEnd"/>
+        <w:t>International Society for Scientometrics</w:t>
+      </w:r>
       <w:r>
         <w:rPr>
           <w:rFonts w:ascii="Times New Roman" w:eastAsiaTheme="minorHAnsi" w:hAnsi="Times New Roman" w:cs="Times New Roman"/>
@@ -4632,18 +4548,8 @@
           <w:sz w:val="24"/>
           <w:szCs w:val="20"/>
         </w:rPr>
-        <w:t xml:space="preserve">and </w:t>
-      </w:r>
-      <w:proofErr w:type="spellStart"/>
-      <w:r>
-        <w:rPr>
-          <w:rFonts w:ascii="Times New Roman" w:eastAsiaTheme="minorHAnsi" w:hAnsi="Times New Roman" w:cs="Times New Roman"/>
-          <w:sz w:val="24"/>
-          <w:szCs w:val="20"/>
-        </w:rPr>
-        <w:t>Informetrics</w:t>
-      </w:r>
-      <w:proofErr w:type="spellEnd"/>
+        <w:t>and Informetrics</w:t>
+      </w:r>
       <w:r>
         <w:rPr>
           <w:rFonts w:ascii="Times New Roman" w:eastAsiaTheme="minorHAnsi" w:hAnsi="Times New Roman" w:cs="Times New Roman"/>
@@ -6092,25 +5998,7 @@
           <w:sz w:val="24"/>
           <w:szCs w:val="20"/>
         </w:rPr>
-        <w:t xml:space="preserve">Introduction to Social Statistics (In-Person, </w:t>
-      </w:r>
-      <w:proofErr w:type="gramStart"/>
-      <w:r>
-        <w:rPr>
-          <w:rFonts w:ascii="Times New Roman" w:eastAsia="함초롬바탕" w:hAnsi="Times New Roman" w:cs="Times New Roman"/>
-          <w:sz w:val="24"/>
-          <w:szCs w:val="20"/>
-        </w:rPr>
-        <w:t>Fall</w:t>
-      </w:r>
-      <w:proofErr w:type="gramEnd"/>
-      <w:r>
-        <w:rPr>
-          <w:rFonts w:ascii="Times New Roman" w:eastAsia="함초롬바탕" w:hAnsi="Times New Roman" w:cs="Times New Roman"/>
-          <w:sz w:val="24"/>
-          <w:szCs w:val="20"/>
-        </w:rPr>
-        <w:t xml:space="preserve"> 2024</w:t>
+        <w:t>Introduction to Social Statistics (In-Person, Fall 2024</w:t>
       </w:r>
       <w:r>
         <w:rPr>
@@ -6331,7 +6219,6 @@
         </w:rPr>
         <w:t xml:space="preserve">2026 </w:t>
       </w:r>
-      <w:proofErr w:type="gramStart"/>
       <w:r>
         <w:rPr>
           <w:rFonts w:ascii="Times New Roman" w:eastAsia="함초롬바탕" w:hAnsi="Times New Roman" w:cs="Times New Roman" w:hint="eastAsia"/>
@@ -6356,7 +6243,6 @@
         </w:rPr>
         <w:t>“</w:t>
       </w:r>
-      <w:proofErr w:type="gramEnd"/>
       <w:r>
         <w:rPr>
           <w:rFonts w:ascii="Times New Roman" w:eastAsia="함초롬바탕" w:hAnsi="Times New Roman" w:cs="Times New Roman"/>
@@ -6371,7 +6257,15 @@
           <w:sz w:val="24"/>
           <w:szCs w:val="20"/>
         </w:rPr>
-        <w:t>an AI Agent for Automated Research Flow</w:t>
+        <w:t xml:space="preserve">an AI Agent for Automated </w:t>
+      </w:r>
+      <w:r>
+        <w:rPr>
+          <w:rFonts w:ascii="Times New Roman" w:eastAsia="함초롬바탕" w:hAnsi="Times New Roman" w:cs="Times New Roman"/>
+          <w:sz w:val="24"/>
+          <w:szCs w:val="20"/>
+        </w:rPr>
+        <w:t>Literature Search</w:t>
       </w:r>
       <w:r>
         <w:rPr>

</xml_diff>

<commit_message>
Manual CV update: 2026-05-06 11:23:51 CDT
</commit_message>
<xml_diff>
--- a/public/cv.docx
+++ b/public/cv.docx
@@ -2128,7 +2128,25 @@
           <w:sz w:val="24"/>
           <w:szCs w:val="20"/>
         </w:rPr>
-        <w:t xml:space="preserve">, and Yeaeun Kwon. </w:t>
+        <w:t xml:space="preserve">, and </w:t>
+      </w:r>
+      <w:proofErr w:type="spellStart"/>
+      <w:r>
+        <w:rPr>
+          <w:rFonts w:ascii="Times New Roman" w:eastAsiaTheme="minorHAnsi" w:hAnsi="Times New Roman" w:cs="Times New Roman"/>
+          <w:sz w:val="24"/>
+          <w:szCs w:val="20"/>
+        </w:rPr>
+        <w:t>Yeaeun</w:t>
+      </w:r>
+      <w:proofErr w:type="spellEnd"/>
+      <w:r>
+        <w:rPr>
+          <w:rFonts w:ascii="Times New Roman" w:eastAsiaTheme="minorHAnsi" w:hAnsi="Times New Roman" w:cs="Times New Roman"/>
+          <w:sz w:val="24"/>
+          <w:szCs w:val="20"/>
+        </w:rPr>
+        <w:t xml:space="preserve"> Kwon. </w:t>
       </w:r>
       <w:r>
         <w:rPr>
@@ -2391,7 +2409,25 @@
           <w:sz w:val="24"/>
           <w:szCs w:val="20"/>
         </w:rPr>
-        <w:t xml:space="preserve"> Zhuofan Li. “</w:t>
+        <w:t xml:space="preserve"> </w:t>
+      </w:r>
+      <w:proofErr w:type="spellStart"/>
+      <w:r>
+        <w:rPr>
+          <w:rFonts w:ascii="Times New Roman" w:eastAsiaTheme="minorHAnsi" w:hAnsi="Times New Roman" w:cs="Times New Roman"/>
+          <w:sz w:val="24"/>
+          <w:szCs w:val="20"/>
+        </w:rPr>
+        <w:t>Zhuofan</w:t>
+      </w:r>
+      <w:proofErr w:type="spellEnd"/>
+      <w:r>
+        <w:rPr>
+          <w:rFonts w:ascii="Times New Roman" w:eastAsiaTheme="minorHAnsi" w:hAnsi="Times New Roman" w:cs="Times New Roman"/>
+          <w:sz w:val="24"/>
+          <w:szCs w:val="20"/>
+        </w:rPr>
+        <w:t xml:space="preserve"> Li. “</w:t>
       </w:r>
       <w:r>
         <w:rPr>
@@ -2502,6 +2538,7 @@
         </w:rPr>
         <w:t xml:space="preserve">Divide and </w:t>
       </w:r>
+      <w:proofErr w:type="gramStart"/>
       <w:r>
         <w:rPr>
           <w:rFonts w:ascii="Times New Roman" w:eastAsiaTheme="minorHAnsi" w:hAnsi="Times New Roman" w:cs="Times New Roman"/>
@@ -2516,7 +2553,16 @@
           <w:sz w:val="24"/>
           <w:szCs w:val="20"/>
         </w:rPr>
-        <w:t xml:space="preserve">onquer? How </w:t>
+        <w:t>onquer</w:t>
+      </w:r>
+      <w:proofErr w:type="gramEnd"/>
+      <w:r>
+        <w:rPr>
+          <w:rFonts w:ascii="Times New Roman" w:eastAsiaTheme="minorHAnsi" w:hAnsi="Times New Roman" w:cs="Times New Roman"/>
+          <w:sz w:val="24"/>
+          <w:szCs w:val="20"/>
+        </w:rPr>
+        <w:t xml:space="preserve">? How </w:t>
       </w:r>
       <w:r>
         <w:rPr>
@@ -2689,7 +2735,7 @@
           <w:sz w:val="24"/>
           <w:szCs w:val="20"/>
         </w:rPr>
-        <w:t>Cited with Uncertainty: Gendered Credibility in COVID-19 Science</w:t>
+        <w:t>Cited with Uncertainty: Gendered Credibility in High-Stakes Science</w:t>
       </w:r>
       <w:r>
         <w:rPr>
@@ -3918,6 +3964,7 @@
         </w:rPr>
         <w:t xml:space="preserve">Divide and </w:t>
       </w:r>
+      <w:proofErr w:type="gramStart"/>
       <w:r>
         <w:rPr>
           <w:rFonts w:ascii="Times New Roman" w:eastAsiaTheme="minorHAnsi" w:hAnsi="Times New Roman" w:cs="Times New Roman"/>
@@ -3932,7 +3979,16 @@
           <w:sz w:val="24"/>
           <w:szCs w:val="20"/>
         </w:rPr>
-        <w:t xml:space="preserve">onquer? How </w:t>
+        <w:t>onquer</w:t>
+      </w:r>
+      <w:proofErr w:type="gramEnd"/>
+      <w:r>
+        <w:rPr>
+          <w:rFonts w:ascii="Times New Roman" w:eastAsiaTheme="minorHAnsi" w:hAnsi="Times New Roman" w:cs="Times New Roman"/>
+          <w:sz w:val="24"/>
+          <w:szCs w:val="20"/>
+        </w:rPr>
+        <w:t xml:space="preserve">? How </w:t>
       </w:r>
       <w:r>
         <w:rPr>
@@ -4166,7 +4222,25 @@
           <w:sz w:val="24"/>
           <w:szCs w:val="20"/>
         </w:rPr>
-        <w:t>” American Sociological Association Methodology Section Mid-year Meeting, Philadelphia, PA.</w:t>
+        <w:t>” American Sociological Association Methodology Section Mid-</w:t>
+      </w:r>
+      <w:proofErr w:type="gramStart"/>
+      <w:r>
+        <w:rPr>
+          <w:rFonts w:ascii="Times New Roman" w:eastAsiaTheme="minorHAnsi" w:hAnsi="Times New Roman" w:cs="Times New Roman"/>
+          <w:sz w:val="24"/>
+          <w:szCs w:val="20"/>
+        </w:rPr>
+        <w:t>year</w:t>
+      </w:r>
+      <w:proofErr w:type="gramEnd"/>
+      <w:r>
+        <w:rPr>
+          <w:rFonts w:ascii="Times New Roman" w:eastAsiaTheme="minorHAnsi" w:hAnsi="Times New Roman" w:cs="Times New Roman"/>
+          <w:sz w:val="24"/>
+          <w:szCs w:val="20"/>
+        </w:rPr>
+        <w:t xml:space="preserve"> Meeting, Philadelphia, PA.</w:t>
       </w:r>
     </w:p>
     <w:p>
@@ -4532,8 +4606,18 @@
           <w:sz w:val="24"/>
           <w:szCs w:val="20"/>
         </w:rPr>
-        <w:t>International Society for Scientometrics</w:t>
-      </w:r>
+        <w:t xml:space="preserve">International Society for </w:t>
+      </w:r>
+      <w:proofErr w:type="spellStart"/>
+      <w:r>
+        <w:rPr>
+          <w:rFonts w:ascii="Times New Roman" w:eastAsiaTheme="minorHAnsi" w:hAnsi="Times New Roman" w:cs="Times New Roman"/>
+          <w:sz w:val="24"/>
+          <w:szCs w:val="20"/>
+        </w:rPr>
+        <w:t>Scientometrics</w:t>
+      </w:r>
+      <w:proofErr w:type="spellEnd"/>
       <w:r>
         <w:rPr>
           <w:rFonts w:ascii="Times New Roman" w:eastAsiaTheme="minorHAnsi" w:hAnsi="Times New Roman" w:cs="Times New Roman"/>
@@ -4548,8 +4632,18 @@
           <w:sz w:val="24"/>
           <w:szCs w:val="20"/>
         </w:rPr>
-        <w:t>and Informetrics</w:t>
-      </w:r>
+        <w:t xml:space="preserve">and </w:t>
+      </w:r>
+      <w:proofErr w:type="spellStart"/>
+      <w:r>
+        <w:rPr>
+          <w:rFonts w:ascii="Times New Roman" w:eastAsiaTheme="minorHAnsi" w:hAnsi="Times New Roman" w:cs="Times New Roman"/>
+          <w:sz w:val="24"/>
+          <w:szCs w:val="20"/>
+        </w:rPr>
+        <w:t>Informetrics</w:t>
+      </w:r>
+      <w:proofErr w:type="spellEnd"/>
       <w:r>
         <w:rPr>
           <w:rFonts w:ascii="Times New Roman" w:eastAsiaTheme="minorHAnsi" w:hAnsi="Times New Roman" w:cs="Times New Roman"/>
@@ -5998,7 +6092,25 @@
           <w:sz w:val="24"/>
           <w:szCs w:val="20"/>
         </w:rPr>
-        <w:t>Introduction to Social Statistics (In-Person, Fall 2024</w:t>
+        <w:t xml:space="preserve">Introduction to Social Statistics (In-Person, </w:t>
+      </w:r>
+      <w:proofErr w:type="gramStart"/>
+      <w:r>
+        <w:rPr>
+          <w:rFonts w:ascii="Times New Roman" w:eastAsia="함초롬바탕" w:hAnsi="Times New Roman" w:cs="Times New Roman"/>
+          <w:sz w:val="24"/>
+          <w:szCs w:val="20"/>
+        </w:rPr>
+        <w:t>Fall</w:t>
+      </w:r>
+      <w:proofErr w:type="gramEnd"/>
+      <w:r>
+        <w:rPr>
+          <w:rFonts w:ascii="Times New Roman" w:eastAsia="함초롬바탕" w:hAnsi="Times New Roman" w:cs="Times New Roman"/>
+          <w:sz w:val="24"/>
+          <w:szCs w:val="20"/>
+        </w:rPr>
+        <w:t xml:space="preserve"> 2024</w:t>
       </w:r>
       <w:r>
         <w:rPr>
@@ -6219,6 +6331,7 @@
         </w:rPr>
         <w:t xml:space="preserve">2026 </w:t>
       </w:r>
+      <w:proofErr w:type="gramStart"/>
       <w:r>
         <w:rPr>
           <w:rFonts w:ascii="Times New Roman" w:eastAsia="함초롬바탕" w:hAnsi="Times New Roman" w:cs="Times New Roman" w:hint="eastAsia"/>
@@ -6243,6 +6356,7 @@
         </w:rPr>
         <w:t>“</w:t>
       </w:r>
+      <w:proofErr w:type="gramEnd"/>
       <w:r>
         <w:rPr>
           <w:rFonts w:ascii="Times New Roman" w:eastAsia="함초롬바탕" w:hAnsi="Times New Roman" w:cs="Times New Roman"/>

</xml_diff>